<commit_message>
Contract: additional-works clause, legal-safe wording, same text in calculator; remove presets section from home
</commit_message>
<xml_diff>
--- a/static/docs/dogovor-mebel.docx
+++ b/static/docs/dogovor-mebel.docx
@@ -211,7 +211,7 @@
           <w:b w:val="0"/>
           <w:i w:val="0"/>
         </w:rPr>
-        <w:t>2.4. Предоплата используется для закупки материалов и фурнитуры и запуска Изделия в производство. Стоимость, указанная в Спецификации, не изменяется в течение срока действия договора, кроме случаев изменения Спецификации по инициативе Заказчика (раздел 6) и случаев, предусмотренных пунктом 3.3.</w:t>
+        <w:t>2.4. Предоплата используется для закупки материалов и фурнитуры и запуска Изделия в производство. Стоимость, указанная в Спецификации, не изменяется в течение срока действия договора, кроме случаев изменения Спецификации по инициативе Заказчика (раздел 6, включая дополнительные работы по пунктам 6.4–6.7) и случаев, предусмотренных пунктом 3.3.</w:t>
       </w:r>
     </w:p>
     <w:p>
@@ -285,7 +285,7 @@
           <w:b w:val="0"/>
           <w:i w:val="0"/>
         </w:rPr>
-        <w:t>3.4. При нарушении срока изготовления по вине Исполнителя Заказчик вправе требовать неустойку в размере [0,1] % от стоимости Изделия за каждый день просрочки, но не более [10] % от стоимости Изделия.</w:t>
+        <w:t>3.4. При нарушении срока изготовления по вине Исполнителя Заказчик вправе требовать неустойку в размере [0,1] % от стоимости Изделия за каждый день просрочки, но не более [10] % от стоимости Изделия. Если Заказчик является потребителем и законодательством о защите прав потребителей установлен более высокий размер ответственности Исполнителя, применяется размер, установленный законодательством.</w:t>
       </w:r>
     </w:p>
     <w:p>
@@ -488,6 +488,54 @@
     </w:p>
     <w:p>
       <w:pPr>
+        <w:jc w:val="both"/>
+      </w:pPr>
+      <w:r>
+        <w:rPr>
+          <w:b w:val="0"/>
+          <w:i w:val="0"/>
+        </w:rPr>
+        <w:t>6.4. Дополнительные работы. Если после подписания Спецификации Заказчик пожелает получить что-либо сверх согласованного (дополнительные или изменённые изделия, элементы, материалы, фурнитуру, подсветку, работы по монтажу и т. п.), такие работы выполняются только после их согласования и оплачиваются Заказчиком дополнительно, сверх цены, указанной в пункте 2.1.</w:t>
+      </w:r>
+    </w:p>
+    <w:p>
+      <w:pPr>
+        <w:jc w:val="both"/>
+      </w:pPr>
+      <w:r>
+        <w:rPr>
+          <w:b w:val="0"/>
+          <w:i w:val="0"/>
+        </w:rPr>
+        <w:t>6.5. Стоимость дополнительных работ определяется Исполнителем расчётом по фактической стоимости материалов, фурнитуры, работ и доставки и сообщается Заказчику до начала их выполнения. Расчёт Исполнителя является окончательным и не подлежит торгу или пересмотру: Заказчик либо принимает расчёт, либо отказывается от дополнительных работ.</w:t>
+      </w:r>
+    </w:p>
+    <w:p>
+      <w:pPr>
+        <w:jc w:val="both"/>
+      </w:pPr>
+      <w:r>
+        <w:rPr>
+          <w:b w:val="0"/>
+          <w:i w:val="0"/>
+        </w:rPr>
+        <w:t>6.6. Если Заказчик отказывается от дополнительных работ, договор исполняется в объёме действующей Спецификации на прежних условиях. Если Заказчик принимает расчёт, это подтверждается письменно (в том числе сообщением в Telegram по пункту 6.1) либо подписанием дополнения к Спецификации, после чего стоимость и срок дополнительных работ становятся обязательными для Сторон.</w:t>
+      </w:r>
+    </w:p>
+    <w:p>
+      <w:pPr>
+        <w:jc w:val="both"/>
+      </w:pPr>
+      <w:r>
+        <w:rPr>
+          <w:b w:val="0"/>
+          <w:i w:val="0"/>
+        </w:rPr>
+        <w:t>6.7. Дополнительные работы оплачиваются в порядке, указанном в дополнении к Спецификации (по умолчанию — в размере [100] % до начала их выполнения). Срок изготовления и монтажа продлевается на время, необходимое для выполнения дополнительных работ. Работы, выполненные по просьбе Заказчика без согласования их стоимости, оплачиваются по расчёту Исполнителя на основании пункта 6.5.</w:t>
+      </w:r>
+    </w:p>
+    <w:p>
+      <w:pPr>
         <w:keepNext/>
         <w:spacing w:before="200" w:after="80"/>
         <w:jc w:val="center"/>
@@ -595,7 +643,7 @@
           <w:b w:val="0"/>
           <w:i w:val="0"/>
         </w:rPr>
-        <w:t>8.2. Заказчик вправе отказаться от договора в любое время, оплатив Исполнителю фактически выполненную часть работ и понесённые расходы. Предоплата возвращается за вычетом расходов на замер и проект, закупленные материалы и фурнитуру, изготовленные детали и узлы, поскольку Изделие изготавливается по индивидуальным размерам и не может быть продано другому лицу.</w:t>
+        <w:t>8.2. Заказчик вправе отказаться от договора в любое время, оплатив Исполнителю фактически выполненную часть работ и понесённые расходы (в пределах, допускаемых законодательством). Предоплата возвращается за вычетом расходов на замер и проект, закупленные материалы и фурнитуру, изготовленные детали и узлы, поскольку Изделие изготавливается по индивидуальным размерам и не может быть продано другому лицу.</w:t>
       </w:r>
     </w:p>
     <w:p>
@@ -783,7 +831,7 @@
           <w:b w:val="0"/>
           <w:i w:val="0"/>
         </w:rPr>
-        <w:t>12.1. Заказчик даёт согласие на обработку своих персональных данных (ФИО, паспортные данные, адрес, телефон) в целях исполнения настоящего договора.</w:t>
+        <w:t>12.1. Заказчик даёт согласие на обработку своих персональных данных (ФИО, паспортные данные, адрес, телефон) в целях исполнения настоящего договора в соответствии с законодательством Республики Узбекистан о персональных данных. Согласие может быть отозвано Заказчиком в порядке, установленном законодательством.</w:t>
       </w:r>
     </w:p>
     <w:p>
@@ -845,7 +893,19 @@
           <w:b w:val="0"/>
           <w:i w:val="0"/>
         </w:rPr>
-        <w:t>13.3. Приложения: № 1 — Спецификация; № 2 — Акт приёмки выполненных работ; № 3 — Рекомендации по эксплуатации.</w:t>
+        <w:t>13.3. Если какое-либо условие договора противоречит обязательным нормам законодательства Республики Узбекистан (в том числе о защите прав потребителей), применяются эти нормы; остальные условия договора сохраняют силу.</w:t>
+      </w:r>
+    </w:p>
+    <w:p>
+      <w:pPr>
+        <w:jc w:val="both"/>
+      </w:pPr>
+      <w:r>
+        <w:rPr>
+          <w:b w:val="0"/>
+          <w:i w:val="0"/>
+        </w:rPr>
+        <w:t>13.4. Приложения: № 1 — Спецификация; № 2 — Акт приёмки выполненных работ; № 3 — Рекомендации по эксплуатации.</w:t>
       </w:r>
     </w:p>
     <w:p>

</xml_diff>

<commit_message>
Contract: blank lines with small captions for fill-in fields
</commit_message>
<xml_diff>
--- a/static/docs/dogovor-mebel.docx
+++ b/static/docs/dogovor-mebel.docx
@@ -13,7 +13,31 @@
           <w:i w:val="0"/>
           <w:sz w:val="28"/>
         </w:rPr>
-        <w:t>ДОГОВОР № [____]</w:t>
+        <w:t xml:space="preserve">ДОГОВОР № </w:t>
+      </w:r>
+      <w:r>
+        <w:rPr>
+          <w:b/>
+          <w:i w:val="0"/>
+          <w:sz w:val="28"/>
+        </w:rPr>
+        <w:t>____________</w:t>
+      </w:r>
+      <w:r>
+        <w:rPr>
+          <w:b/>
+          <w:i w:val="0"/>
+          <w:sz w:val="28"/>
+        </w:rPr>
+        <w:t xml:space="preserve"> </w:t>
+      </w:r>
+      <w:r>
+        <w:rPr>
+          <w:b w:val="0"/>
+          <w:i/>
+          <w:sz w:val="14"/>
+        </w:rPr>
+        <w:t xml:space="preserve"> (номер договора)</w:t>
       </w:r>
     </w:p>
     <w:p>
@@ -36,9 +60,63 @@
         </w:tabs>
       </w:pPr>
       <w:r>
+        <w:rPr>
+          <w:b w:val="0"/>
+          <w:i w:val="0"/>
+        </w:rPr>
         <w:t>г. Ташкент</w:t>
         <w:tab/>
-        <w:t>«[__]» [__________] 20[__] г.</w:t>
+        <w:t>«</w:t>
+      </w:r>
+      <w:r>
+        <w:rPr>
+          <w:b w:val="0"/>
+          <w:i w:val="0"/>
+        </w:rPr>
+        <w:t>____</w:t>
+      </w:r>
+      <w:r>
+        <w:rPr>
+          <w:b w:val="0"/>
+          <w:i w:val="0"/>
+        </w:rPr>
+        <w:t xml:space="preserve">» </w:t>
+      </w:r>
+      <w:r>
+        <w:rPr>
+          <w:b w:val="0"/>
+          <w:i w:val="0"/>
+        </w:rPr>
+        <w:t>____________</w:t>
+      </w:r>
+      <w:r>
+        <w:rPr>
+          <w:b w:val="0"/>
+          <w:i w:val="0"/>
+        </w:rPr>
+        <w:t xml:space="preserve"> 20</w:t>
+      </w:r>
+      <w:r>
+        <w:rPr>
+          <w:b w:val="0"/>
+          <w:i w:val="0"/>
+        </w:rPr>
+        <w:t>____</w:t>
+      </w:r>
+      <w:r>
+        <w:rPr>
+          <w:b w:val="0"/>
+          <w:i w:val="0"/>
+        </w:rPr>
+        <w:t xml:space="preserve"> г. </w:t>
+      </w:r>
+      <w:r>
+        <w:rPr>
+          <w:b w:val="0"/>
+          <w:i/>
+          <w:sz w:val="14"/>
+        </w:rPr>
+        <w:t xml:space="preserve"> (дата)</w:t>
       </w:r>
     </w:p>
     <w:p>
@@ -51,7 +129,7 @@
           <w:i/>
           <w:sz w:val="19"/>
         </w:rPr>
-        <w:t>Шаблон договора. Поля в квадратных скобках заполняются при заключении договора. Спецификация (Приложение № 1) оформляется отдельно для каждого заказа.</w:t>
+        <w:t>Шаблон договора. Пустые линии заполняются при заключении договора; мелким шрифтом в скобках указано, что вписать. Спецификация (Приложение № 1) оформляется отдельно для каждого заказа.</w:t>
       </w:r>
     </w:p>
     <w:p>
@@ -63,7 +141,154 @@
           <w:b w:val="0"/>
           <w:i w:val="0"/>
         </w:rPr>
-        <w:t>[Наименование / ФИО Исполнителя], именуемый(ая) в дальнейшем «Исполнитель», в лице [должность, ФИО], действующего(ей) на основании [свидетельства о регистрации ЯТТ / Устава / паспорта], с одной стороны, и [ФИО Заказчика], паспорт [серия и номер], выдан [кем и когда], проживающий(ая) по адресу: [адрес], именуемый(ая) в дальнейшем «Заказчик», с другой стороны, совместно именуемые «Стороны», заключили настоящий договор о нижеследующем:</w:t>
+        <w:t>________________</w:t>
+      </w:r>
+      <w:r>
+        <w:rPr>
+          <w:b w:val="0"/>
+          <w:i/>
+          <w:sz w:val="14"/>
+        </w:rPr>
+        <w:t xml:space="preserve"> (Наименование / ФИО Исполнителя)</w:t>
+      </w:r>
+      <w:r>
+        <w:rPr>
+          <w:b w:val="0"/>
+          <w:i w:val="0"/>
+        </w:rPr>
+        <w:t xml:space="preserve">, именуемый(ая) в дальнейшем «Исполнитель», в лице </w:t>
+      </w:r>
+      <w:r>
+        <w:rPr>
+          <w:b w:val="0"/>
+          <w:i w:val="0"/>
+        </w:rPr>
+        <w:t>________________</w:t>
+      </w:r>
+      <w:r>
+        <w:rPr>
+          <w:b w:val="0"/>
+          <w:i/>
+          <w:sz w:val="14"/>
+        </w:rPr>
+        <w:t xml:space="preserve"> (должность, ФИО)</w:t>
+      </w:r>
+      <w:r>
+        <w:rPr>
+          <w:b w:val="0"/>
+          <w:i w:val="0"/>
+        </w:rPr>
+        <w:t xml:space="preserve">, действующего(ей) на основании </w:t>
+      </w:r>
+      <w:r>
+        <w:rPr>
+          <w:b w:val="0"/>
+          <w:i w:val="0"/>
+        </w:rPr>
+        <w:t>________________</w:t>
+      </w:r>
+      <w:r>
+        <w:rPr>
+          <w:b w:val="0"/>
+          <w:i/>
+          <w:sz w:val="14"/>
+        </w:rPr>
+        <w:t xml:space="preserve"> (свидетельства о регистрации ЯТТ / Устава / паспорта)</w:t>
+      </w:r>
+      <w:r>
+        <w:rPr>
+          <w:b w:val="0"/>
+          <w:i w:val="0"/>
+        </w:rPr>
+        <w:t xml:space="preserve">, с одной стороны, и </w:t>
+      </w:r>
+      <w:r>
+        <w:rPr>
+          <w:b w:val="0"/>
+          <w:i w:val="0"/>
+        </w:rPr>
+        <w:t>________________</w:t>
+      </w:r>
+      <w:r>
+        <w:rPr>
+          <w:b w:val="0"/>
+          <w:i/>
+          <w:sz w:val="14"/>
+        </w:rPr>
+        <w:t xml:space="preserve"> (ФИО Заказчика)</w:t>
+      </w:r>
+      <w:r>
+        <w:rPr>
+          <w:b w:val="0"/>
+          <w:i w:val="0"/>
+        </w:rPr>
+        <w:t xml:space="preserve">, паспорт </w:t>
+      </w:r>
+      <w:r>
+        <w:rPr>
+          <w:b w:val="0"/>
+          <w:i w:val="0"/>
+        </w:rPr>
+        <w:t>________________</w:t>
+      </w:r>
+      <w:r>
+        <w:rPr>
+          <w:b w:val="0"/>
+          <w:i/>
+          <w:sz w:val="14"/>
+        </w:rPr>
+        <w:t xml:space="preserve"> (серия и номер)</w:t>
+      </w:r>
+      <w:r>
+        <w:rPr>
+          <w:b w:val="0"/>
+          <w:i w:val="0"/>
+        </w:rPr>
+        <w:t xml:space="preserve">, выдан </w:t>
+      </w:r>
+      <w:r>
+        <w:rPr>
+          <w:b w:val="0"/>
+          <w:i w:val="0"/>
+        </w:rPr>
+        <w:t>________________</w:t>
+      </w:r>
+      <w:r>
+        <w:rPr>
+          <w:b w:val="0"/>
+          <w:i/>
+          <w:sz w:val="14"/>
+        </w:rPr>
+        <w:t xml:space="preserve"> (кем и когда)</w:t>
+      </w:r>
+      <w:r>
+        <w:rPr>
+          <w:b w:val="0"/>
+          <w:i w:val="0"/>
+        </w:rPr>
+        <w:t xml:space="preserve">, проживающий(ая) по адресу: </w:t>
+      </w:r>
+      <w:r>
+        <w:rPr>
+          <w:b w:val="0"/>
+          <w:i w:val="0"/>
+        </w:rPr>
+        <w:t>________________</w:t>
+      </w:r>
+      <w:r>
+        <w:rPr>
+          <w:b w:val="0"/>
+          <w:i/>
+          <w:sz w:val="14"/>
+        </w:rPr>
+        <w:t xml:space="preserve"> (адрес)</w:t>
+      </w:r>
+      <w:r>
+        <w:rPr>
+          <w:b w:val="0"/>
+          <w:i w:val="0"/>
+        </w:rPr>
+        <w:t>, именуемый(ая) в дальнейшем «Заказчик», с другой стороны, совместно именуемые «Стороны», заключили настоящий договор о нижеследующем:</w:t>
       </w:r>
     </w:p>
     <w:p>
@@ -113,7 +338,29 @@
           <w:b w:val="0"/>
           <w:i w:val="0"/>
         </w:rPr>
-        <w:t>1.3. Адрес объекта, на котором выполняются замер, доставка и монтаж: [адрес, этаж, наличие лифта].</w:t>
+        <w:t xml:space="preserve">1.3. Адрес объекта, на котором выполняются замер, доставка и монтаж: </w:t>
+      </w:r>
+      <w:r>
+        <w:rPr>
+          <w:b w:val="0"/>
+          <w:i w:val="0"/>
+        </w:rPr>
+        <w:t>________________</w:t>
+      </w:r>
+      <w:r>
+        <w:rPr>
+          <w:b w:val="0"/>
+          <w:i/>
+          <w:sz w:val="14"/>
+        </w:rPr>
+        <w:t xml:space="preserve"> (адрес, этаж, наличие лифта)</w:t>
+      </w:r>
+      <w:r>
+        <w:rPr>
+          <w:b w:val="0"/>
+          <w:i w:val="0"/>
+        </w:rPr>
+        <w:t>.</w:t>
       </w:r>
     </w:p>
     <w:p>
@@ -175,7 +422,36 @@
           <w:b w:val="0"/>
           <w:i w:val="0"/>
         </w:rPr>
-        <w:t>2.1. Общая стоимость работ определяется Спецификацией и составляет [__________] ([сумма прописью]) сум.</w:t>
+        <w:t xml:space="preserve">2.1. Общая стоимость работ определяется Спецификацией и составляет </w:t>
+      </w:r>
+      <w:r>
+        <w:rPr>
+          <w:b w:val="0"/>
+          <w:i w:val="0"/>
+        </w:rPr>
+        <w:t>____________</w:t>
+      </w:r>
+      <w:r>
+        <w:rPr>
+          <w:b w:val="0"/>
+          <w:i w:val="0"/>
+        </w:rPr>
+        <w:t xml:space="preserve"> </w:t>
+      </w:r>
+      <w:r>
+        <w:rPr>
+          <w:b w:val="0"/>
+          <w:i/>
+          <w:sz w:val="14"/>
+        </w:rPr>
+        <w:t xml:space="preserve"> (сумма прописью)</w:t>
+      </w:r>
+      <w:r>
+        <w:rPr>
+          <w:b w:val="0"/>
+          <w:i w:val="0"/>
+        </w:rPr>
+        <w:t xml:space="preserve"> сум.</w:t>
       </w:r>
     </w:p>
     <w:p>
@@ -187,7 +463,77 @@
           <w:b w:val="0"/>
           <w:i w:val="0"/>
         </w:rPr>
-        <w:t>2.2. Оплата производится в следующем порядке: предоплата — [75] % ([__________] сум) в течение [__] дней с даты подписания Спецификации; оставшаяся часть — [25] % ([__________] сум) — не позднее дня доставки Изделия, до начала разгрузки и монтажа.</w:t>
+        <w:t xml:space="preserve">2.2. Оплата производится в следующем порядке: предоплата — </w:t>
+      </w:r>
+      <w:r>
+        <w:rPr>
+          <w:b w:val="0"/>
+          <w:i w:val="0"/>
+        </w:rPr>
+        <w:t>[75]</w:t>
+      </w:r>
+      <w:r>
+        <w:rPr>
+          <w:b w:val="0"/>
+          <w:i w:val="0"/>
+        </w:rPr>
+        <w:t xml:space="preserve"> % (</w:t>
+      </w:r>
+      <w:r>
+        <w:rPr>
+          <w:b w:val="0"/>
+          <w:i w:val="0"/>
+        </w:rPr>
+        <w:t>____________</w:t>
+      </w:r>
+      <w:r>
+        <w:rPr>
+          <w:b w:val="0"/>
+          <w:i w:val="0"/>
+        </w:rPr>
+        <w:t xml:space="preserve"> сум) в течение </w:t>
+      </w:r>
+      <w:r>
+        <w:rPr>
+          <w:b w:val="0"/>
+          <w:i w:val="0"/>
+        </w:rPr>
+        <w:t>____</w:t>
+      </w:r>
+      <w:r>
+        <w:rPr>
+          <w:b w:val="0"/>
+          <w:i w:val="0"/>
+        </w:rPr>
+        <w:t xml:space="preserve"> дней с даты подписания Спецификации; оставшаяся часть — </w:t>
+      </w:r>
+      <w:r>
+        <w:rPr>
+          <w:b w:val="0"/>
+          <w:i w:val="0"/>
+        </w:rPr>
+        <w:t>[25]</w:t>
+      </w:r>
+      <w:r>
+        <w:rPr>
+          <w:b w:val="0"/>
+          <w:i w:val="0"/>
+        </w:rPr>
+        <w:t xml:space="preserve"> % (</w:t>
+      </w:r>
+      <w:r>
+        <w:rPr>
+          <w:b w:val="0"/>
+          <w:i w:val="0"/>
+        </w:rPr>
+        <w:t>____________</w:t>
+      </w:r>
+      <w:r>
+        <w:rPr>
+          <w:b w:val="0"/>
+          <w:i w:val="0"/>
+        </w:rPr>
+        <w:t xml:space="preserve"> сум) — не позднее дня доставки Изделия, до начала разгрузки и монтажа.</w:t>
       </w:r>
     </w:p>
     <w:p>
@@ -223,7 +569,21 @@
           <w:b w:val="0"/>
           <w:i w:val="0"/>
         </w:rPr>
-        <w:t>2.5. При просрочке оплаты более чем на [__] дней Исполнитель вправе приостановить работы, а сроки, указанные в разделе 3, продлеваются на период просрочки.</w:t>
+        <w:t xml:space="preserve">2.5. При просрочке оплаты более чем на </w:t>
+      </w:r>
+      <w:r>
+        <w:rPr>
+          <w:b w:val="0"/>
+          <w:i w:val="0"/>
+        </w:rPr>
+        <w:t>____</w:t>
+      </w:r>
+      <w:r>
+        <w:rPr>
+          <w:b w:val="0"/>
+          <w:i w:val="0"/>
+        </w:rPr>
+        <w:t xml:space="preserve"> дней Исполнитель вправе приостановить работы, а сроки, указанные в разделе 3, продлеваются на период просрочки.</w:t>
       </w:r>
     </w:p>
     <w:p>
@@ -249,7 +609,21 @@
           <w:b w:val="0"/>
           <w:i w:val="0"/>
         </w:rPr>
-        <w:t>3.1. Срок изготовления Изделия — [__] рабочих дней. Отсчёт срока начинается со дня, когда выполнены все условия: подписана Спецификация, подтверждены размеры по результатам замера и внесена предоплата.</w:t>
+        <w:t xml:space="preserve">3.1. Срок изготовления Изделия — </w:t>
+      </w:r>
+      <w:r>
+        <w:rPr>
+          <w:b w:val="0"/>
+          <w:i w:val="0"/>
+        </w:rPr>
+        <w:t>____</w:t>
+      </w:r>
+      <w:r>
+        <w:rPr>
+          <w:b w:val="0"/>
+          <w:i w:val="0"/>
+        </w:rPr>
+        <w:t xml:space="preserve"> рабочих дней. Отсчёт срока начинается со дня, когда выполнены все условия: подписана Спецификация, подтверждены размеры по результатам замера и внесена предоплата.</w:t>
       </w:r>
     </w:p>
     <w:p>
@@ -261,7 +635,35 @@
           <w:b w:val="0"/>
           <w:i w:val="0"/>
         </w:rPr>
-        <w:t>3.2. Дата доставки и монтажа согласовывается Сторонами заранее, не позднее чем за [1–2] дня. Монтаж занимает [__] рабочих дней.</w:t>
+        <w:t xml:space="preserve">3.2. Дата доставки и монтажа согласовывается Сторонами заранее, не позднее чем за </w:t>
+      </w:r>
+      <w:r>
+        <w:rPr>
+          <w:b w:val="0"/>
+          <w:i w:val="0"/>
+        </w:rPr>
+        <w:t>[1–2]</w:t>
+      </w:r>
+      <w:r>
+        <w:rPr>
+          <w:b w:val="0"/>
+          <w:i w:val="0"/>
+        </w:rPr>
+        <w:t xml:space="preserve"> дня. Монтаж занимает </w:t>
+      </w:r>
+      <w:r>
+        <w:rPr>
+          <w:b w:val="0"/>
+          <w:i w:val="0"/>
+        </w:rPr>
+        <w:t>____</w:t>
+      </w:r>
+      <w:r>
+        <w:rPr>
+          <w:b w:val="0"/>
+          <w:i w:val="0"/>
+        </w:rPr>
+        <w:t xml:space="preserve"> рабочих дней.</w:t>
       </w:r>
     </w:p>
     <w:p>
@@ -285,7 +687,35 @@
           <w:b w:val="0"/>
           <w:i w:val="0"/>
         </w:rPr>
-        <w:t>3.4. При нарушении срока изготовления по вине Исполнителя Заказчик вправе требовать неустойку в размере [0,1] % от стоимости Изделия за каждый день просрочки, но не более [10] % от стоимости Изделия. Если Заказчик является потребителем и законодательством о защите прав потребителей установлен более высокий размер ответственности Исполнителя, применяется размер, установленный законодательством.</w:t>
+        <w:t xml:space="preserve">3.4. При нарушении срока изготовления по вине Исполнителя Заказчик вправе требовать неустойку в размере </w:t>
+      </w:r>
+      <w:r>
+        <w:rPr>
+          <w:b w:val="0"/>
+          <w:i w:val="0"/>
+        </w:rPr>
+        <w:t>[0,1]</w:t>
+      </w:r>
+      <w:r>
+        <w:rPr>
+          <w:b w:val="0"/>
+          <w:i w:val="0"/>
+        </w:rPr>
+        <w:t xml:space="preserve"> % от стоимости Изделия за каждый день просрочки, но не более </w:t>
+      </w:r>
+      <w:r>
+        <w:rPr>
+          <w:b w:val="0"/>
+          <w:i w:val="0"/>
+        </w:rPr>
+        <w:t>[10]</w:t>
+      </w:r>
+      <w:r>
+        <w:rPr>
+          <w:b w:val="0"/>
+          <w:i w:val="0"/>
+        </w:rPr>
+        <w:t xml:space="preserve"> % от стоимости Изделия. Если Заказчик является потребителем и законодательством о защите прав потребителей установлен более высокий размер ответственности Исполнителя, применяется размер, установленный законодательством.</w:t>
       </w:r>
     </w:p>
     <w:p>
@@ -397,7 +827,21 @@
           <w:b w:val="0"/>
           <w:i w:val="0"/>
         </w:rPr>
-        <w:t>5.2. Если доставка или монтаж не могут быть выполнены по вине Заказчика (объект не готов, нет доступа, техника не подходит по размерам и т. п.), повторный выезд оплачивается Заказчиком отдельно: [__________] сум.</w:t>
+        <w:t xml:space="preserve">5.2. Если доставка или монтаж не могут быть выполнены по вине Заказчика (объект не готов, нет доступа, техника не подходит по размерам и т. п.), повторный выезд оплачивается Заказчиком отдельно: </w:t>
+      </w:r>
+      <w:r>
+        <w:rPr>
+          <w:b w:val="0"/>
+          <w:i w:val="0"/>
+        </w:rPr>
+        <w:t>____________</w:t>
+      </w:r>
+      <w:r>
+        <w:rPr>
+          <w:b w:val="0"/>
+          <w:i w:val="0"/>
+        </w:rPr>
+        <w:t xml:space="preserve"> сум.</w:t>
       </w:r>
     </w:p>
     <w:p>
@@ -421,7 +865,21 @@
           <w:b w:val="0"/>
           <w:i w:val="0"/>
         </w:rPr>
-        <w:t>5.4. Заказчик осматривает результат работ в день завершения монтажа. Если Заказчик без уважительных причин уклоняется от подписания акта, Исполнитель направляет ему письменное уведомление; при отсутствии мотивированных возражений в течение [3] рабочих дней со дня уведомления работы считаются принятыми.</w:t>
+        <w:t xml:space="preserve">5.4. Заказчик осматривает результат работ в день завершения монтажа. Если Заказчик без уважительных причин уклоняется от подписания акта, Исполнитель направляет ему письменное уведомление; при отсутствии мотивированных возражений в течение </w:t>
+      </w:r>
+      <w:r>
+        <w:rPr>
+          <w:b w:val="0"/>
+          <w:i w:val="0"/>
+        </w:rPr>
+        <w:t>[3]</w:t>
+      </w:r>
+      <w:r>
+        <w:rPr>
+          <w:b w:val="0"/>
+          <w:i w:val="0"/>
+        </w:rPr>
+        <w:t xml:space="preserve"> рабочих дней со дня уведомления работы считаются принятыми.</w:t>
       </w:r>
     </w:p>
     <w:p>
@@ -531,7 +989,21 @@
           <w:b w:val="0"/>
           <w:i w:val="0"/>
         </w:rPr>
-        <w:t>6.7. Дополнительные работы оплачиваются в порядке, указанном в дополнении к Спецификации (по умолчанию — в размере [100] % до начала их выполнения). Срок изготовления и монтажа продлевается на время, необходимое для выполнения дополнительных работ. Работы, выполненные по просьбе Заказчика без согласования их стоимости, оплачиваются по расчёту Исполнителя на основании пункта 6.5.</w:t>
+        <w:t xml:space="preserve">6.7. Дополнительные работы оплачиваются в порядке, указанном в дополнении к Спецификации (по умолчанию — в размере </w:t>
+      </w:r>
+      <w:r>
+        <w:rPr>
+          <w:b w:val="0"/>
+          <w:i w:val="0"/>
+        </w:rPr>
+        <w:t>[100]</w:t>
+      </w:r>
+      <w:r>
+        <w:rPr>
+          <w:b w:val="0"/>
+          <w:i w:val="0"/>
+        </w:rPr>
+        <w:t xml:space="preserve"> % до начала их выполнения). Срок изготовления и монтажа продлевается на время, необходимое для выполнения дополнительных работ. Работы, выполненные по просьбе Заказчика без согласования их стоимости, оплачиваются по расчёту Исполнителя на основании пункта 6.5.</w:t>
       </w:r>
     </w:p>
     <w:p>
@@ -593,7 +1065,35 @@
           <w:b w:val="0"/>
           <w:i w:val="0"/>
         </w:rPr>
-        <w:t>7.4. Заявку на устранение недостатка Заказчик направляет Исполнителю по телефону или в мессенджер с описанием и фотографиями. Исполнитель осматривает Изделие в течение [5] рабочих дней и устраняет признанные гарантийными недостатки в течение [14] рабочих дней, если для этого не требуется заказ материалов, который требует больше времени.</w:t>
+        <w:t xml:space="preserve">7.4. Заявку на устранение недостатка Заказчик направляет Исполнителю по телефону или в мессенджер с описанием и фотографиями. Исполнитель осматривает Изделие в течение </w:t>
+      </w:r>
+      <w:r>
+        <w:rPr>
+          <w:b w:val="0"/>
+          <w:i w:val="0"/>
+        </w:rPr>
+        <w:t>[5]</w:t>
+      </w:r>
+      <w:r>
+        <w:rPr>
+          <w:b w:val="0"/>
+          <w:i w:val="0"/>
+        </w:rPr>
+        <w:t xml:space="preserve"> рабочих дней и устраняет признанные гарантийными недостатки в течение </w:t>
+      </w:r>
+      <w:r>
+        <w:rPr>
+          <w:b w:val="0"/>
+          <w:i w:val="0"/>
+        </w:rPr>
+        <w:t>[14]</w:t>
+      </w:r>
+      <w:r>
+        <w:rPr>
+          <w:b w:val="0"/>
+          <w:i w:val="0"/>
+        </w:rPr>
+        <w:t xml:space="preserve"> рабочих дней, если для этого не требуется заказ материалов, который требует больше времени.</w:t>
       </w:r>
     </w:p>
     <w:p>
@@ -655,7 +1155,21 @@
           <w:b w:val="0"/>
           <w:i w:val="0"/>
         </w:rPr>
-        <w:t>8.3. Исполнитель вправе отказаться от договора при существенном нарушении его условий Заказчиком (неоплата, отсутствие доступа на объект более [__] дней), письменно уведомив Заказчика. Неизрасходованная часть предоплаты возвращается за вычетом расходов, указанных в пункте 8.2.</w:t>
+        <w:t xml:space="preserve">8.3. Исполнитель вправе отказаться от договора при существенном нарушении его условий Заказчиком (неоплата, отсутствие доступа на объект более </w:t>
+      </w:r>
+      <w:r>
+        <w:rPr>
+          <w:b w:val="0"/>
+          <w:i w:val="0"/>
+        </w:rPr>
+        <w:t>____</w:t>
+      </w:r>
+      <w:r>
+        <w:rPr>
+          <w:b w:val="0"/>
+          <w:i w:val="0"/>
+        </w:rPr>
+        <w:t xml:space="preserve"> дней), письменно уведомив Заказчика. Неизрасходованная часть предоплаты возвращается за вычетом расходов, указанных в пункте 8.2.</w:t>
       </w:r>
     </w:p>
     <w:p>
@@ -667,7 +1181,21 @@
           <w:b w:val="0"/>
           <w:i w:val="0"/>
         </w:rPr>
-        <w:t>8.4. Возврат денежных средств производится в течение [10] рабочих дней со дня расторжения договора.</w:t>
+        <w:t xml:space="preserve">8.4. Возврат денежных средств производится в течение </w:t>
+      </w:r>
+      <w:r>
+        <w:rPr>
+          <w:b w:val="0"/>
+          <w:i w:val="0"/>
+        </w:rPr>
+        <w:t>[10]</w:t>
+      </w:r>
+      <w:r>
+        <w:rPr>
+          <w:b w:val="0"/>
+          <w:i w:val="0"/>
+        </w:rPr>
+        <w:t xml:space="preserve"> рабочих дней со дня расторжения договора.</w:t>
       </w:r>
     </w:p>
     <w:p>
@@ -705,7 +1233,35 @@
           <w:b w:val="0"/>
           <w:i w:val="0"/>
         </w:rPr>
-        <w:t>9.2. При просрочке оплаты Заказчик уплачивает неустойку в размере [0,1] % от неоплаченной суммы за каждый день просрочки, но не более [10] % от неё.</w:t>
+        <w:t xml:space="preserve">9.2. При просрочке оплаты Заказчик уплачивает неустойку в размере </w:t>
+      </w:r>
+      <w:r>
+        <w:rPr>
+          <w:b w:val="0"/>
+          <w:i w:val="0"/>
+        </w:rPr>
+        <w:t>[0,1]</w:t>
+      </w:r>
+      <w:r>
+        <w:rPr>
+          <w:b w:val="0"/>
+          <w:i w:val="0"/>
+        </w:rPr>
+        <w:t xml:space="preserve"> % от неоплаченной суммы за каждый день просрочки, но не более </w:t>
+      </w:r>
+      <w:r>
+        <w:rPr>
+          <w:b w:val="0"/>
+          <w:i w:val="0"/>
+        </w:rPr>
+        <w:t>[10]</w:t>
+      </w:r>
+      <w:r>
+        <w:rPr>
+          <w:b w:val="0"/>
+          <w:i w:val="0"/>
+        </w:rPr>
+        <w:t xml:space="preserve"> % от неё.</w:t>
       </w:r>
     </w:p>
     <w:p>
@@ -767,7 +1323,21 @@
           <w:b w:val="0"/>
           <w:i w:val="0"/>
         </w:rPr>
-        <w:t>10.2. Если такие обстоятельства продолжаются более [30] дней, любая из Сторон вправе расторгнуть договор с взаиморасчётами по пункту 8.2.</w:t>
+        <w:t xml:space="preserve">10.2. Если такие обстоятельства продолжаются более </w:t>
+      </w:r>
+      <w:r>
+        <w:rPr>
+          <w:b w:val="0"/>
+          <w:i w:val="0"/>
+        </w:rPr>
+        <w:t>[30]</w:t>
+      </w:r>
+      <w:r>
+        <w:rPr>
+          <w:b w:val="0"/>
+          <w:i w:val="0"/>
+        </w:rPr>
+        <w:t xml:space="preserve"> дней, любая из Сторон вправе расторгнуть договор с взаиморасчётами по пункту 8.2.</w:t>
       </w:r>
     </w:p>
     <w:p>
@@ -793,7 +1363,21 @@
           <w:b w:val="0"/>
           <w:i w:val="0"/>
         </w:rPr>
-        <w:t>11.1. Споры решаются путём переговоров. Претензия направляется в письменной форме (в том числе в мессенджер с контактов, указанных в реквизитах); ответ даётся в течение [10] календарных дней.</w:t>
+        <w:t xml:space="preserve">11.1. Споры решаются путём переговоров. Претензия направляется в письменной форме (в том числе в мессенджер с контактов, указанных в реквизитах); ответ даётся в течение </w:t>
+      </w:r>
+      <w:r>
+        <w:rPr>
+          <w:b w:val="0"/>
+          <w:i w:val="0"/>
+        </w:rPr>
+        <w:t>[10]</w:t>
+      </w:r>
+      <w:r>
+        <w:rPr>
+          <w:b w:val="0"/>
+          <w:i w:val="0"/>
+        </w:rPr>
+        <w:t xml:space="preserve"> календарных дней.</w:t>
       </w:r>
     </w:p>
     <w:p>
@@ -843,7 +1427,35 @@
           <w:b w:val="0"/>
           <w:i w:val="0"/>
         </w:rPr>
-        <w:t>12.2. Использование фотографий готового Изделия в портфолио и рекламе Исполнителя: Заказчик  [  ] согласен  [  ] не согласен.</w:t>
+        <w:t xml:space="preserve">12.2. Использование фотографий готового Изделия в портфолио и рекламе Исполнителя: Заказчик  </w:t>
+      </w:r>
+      <w:r>
+        <w:rPr>
+          <w:b w:val="0"/>
+          <w:i w:val="0"/>
+        </w:rPr>
+        <w:t>____</w:t>
+      </w:r>
+      <w:r>
+        <w:rPr>
+          <w:b w:val="0"/>
+          <w:i w:val="0"/>
+        </w:rPr>
+        <w:t xml:space="preserve"> согласен  </w:t>
+      </w:r>
+      <w:r>
+        <w:rPr>
+          <w:b w:val="0"/>
+          <w:i w:val="0"/>
+        </w:rPr>
+        <w:t>____</w:t>
+      </w:r>
+      <w:r>
+        <w:rPr>
+          <w:b w:val="0"/>
+          <w:i w:val="0"/>
+        </w:rPr>
+        <w:t xml:space="preserve"> не согласен.</w:t>
       </w:r>
     </w:p>
     <w:p>
@@ -947,6 +1559,7 @@
             <w:r>
               <w:rPr>
                 <w:b/>
+                <w:i w:val="0"/>
                 <w:sz w:val="20"/>
               </w:rPr>
               <w:t>Исполнитель</w:t>
@@ -965,6 +1578,7 @@
             <w:r>
               <w:rPr>
                 <w:b/>
+                <w:i w:val="0"/>
                 <w:sz w:val="20"/>
               </w:rPr>
               <w:t>Заказчик</w:t>
@@ -984,9 +1598,19 @@
             <w:r/>
             <w:r>
               <w:rPr>
+                <w:b w:val="0"/>
+                <w:i w:val="0"/>
                 <w:sz w:val="20"/>
               </w:rPr>
-              <w:t>[Наименование / ФИО]</w:t>
+              <w:t>________________</w:t>
+            </w:r>
+            <w:r>
+              <w:rPr>
+                <w:b w:val="0"/>
+                <w:i/>
+                <w:sz w:val="14"/>
+              </w:rPr>
+              <w:t xml:space="preserve"> (Наименование / ФИО Исполнителя)</w:t>
             </w:r>
           </w:p>
         </w:tc>
@@ -1001,9 +1625,19 @@
             <w:r/>
             <w:r>
               <w:rPr>
+                <w:b w:val="0"/>
+                <w:i w:val="0"/>
                 <w:sz w:val="20"/>
               </w:rPr>
-              <w:t>[ФИО]</w:t>
+              <w:t>________________</w:t>
+            </w:r>
+            <w:r>
+              <w:rPr>
+                <w:b w:val="0"/>
+                <w:i/>
+                <w:sz w:val="14"/>
+              </w:rPr>
+              <w:t xml:space="preserve"> (ФИО Заказчика)</w:t>
             </w:r>
           </w:p>
         </w:tc>
@@ -1020,9 +1654,19 @@
             <w:r/>
             <w:r>
               <w:rPr>
+                <w:b w:val="0"/>
+                <w:i w:val="0"/>
                 <w:sz w:val="20"/>
               </w:rPr>
-              <w:t>ИНН / ПИНФЛ: [__________]</w:t>
+              <w:t xml:space="preserve">ИНН / ПИНФЛ: </w:t>
+            </w:r>
+            <w:r>
+              <w:rPr>
+                <w:b w:val="0"/>
+                <w:i w:val="0"/>
+                <w:sz w:val="20"/>
+              </w:rPr>
+              <w:t>____________</w:t>
             </w:r>
           </w:p>
         </w:tc>
@@ -1037,9 +1681,27 @@
             <w:r/>
             <w:r>
               <w:rPr>
+                <w:b w:val="0"/>
+                <w:i w:val="0"/>
                 <w:sz w:val="20"/>
               </w:rPr>
-              <w:t>Паспорт: [серия, номер]</w:t>
+              <w:t xml:space="preserve">Паспорт: </w:t>
+            </w:r>
+            <w:r>
+              <w:rPr>
+                <w:b w:val="0"/>
+                <w:i w:val="0"/>
+                <w:sz w:val="20"/>
+              </w:rPr>
+              <w:t>________________</w:t>
+            </w:r>
+            <w:r>
+              <w:rPr>
+                <w:b w:val="0"/>
+                <w:i/>
+                <w:sz w:val="14"/>
+              </w:rPr>
+              <w:t xml:space="preserve"> (серия, номер)</w:t>
             </w:r>
           </w:p>
         </w:tc>
@@ -1056,9 +1718,19 @@
             <w:r/>
             <w:r>
               <w:rPr>
+                <w:b w:val="0"/>
+                <w:i w:val="0"/>
                 <w:sz w:val="20"/>
               </w:rPr>
-              <w:t>Адрес: [__________]</w:t>
+              <w:t xml:space="preserve">Адрес: </w:t>
+            </w:r>
+            <w:r>
+              <w:rPr>
+                <w:b w:val="0"/>
+                <w:i w:val="0"/>
+                <w:sz w:val="20"/>
+              </w:rPr>
+              <w:t>____________</w:t>
             </w:r>
           </w:p>
         </w:tc>
@@ -1073,9 +1745,27 @@
             <w:r/>
             <w:r>
               <w:rPr>
+                <w:b w:val="0"/>
+                <w:i w:val="0"/>
                 <w:sz w:val="20"/>
               </w:rPr>
-              <w:t>Выдан: [кем и когда]</w:t>
+              <w:t xml:space="preserve">Выдан: </w:t>
+            </w:r>
+            <w:r>
+              <w:rPr>
+                <w:b w:val="0"/>
+                <w:i w:val="0"/>
+                <w:sz w:val="20"/>
+              </w:rPr>
+              <w:t>________________</w:t>
+            </w:r>
+            <w:r>
+              <w:rPr>
+                <w:b w:val="0"/>
+                <w:i/>
+                <w:sz w:val="14"/>
+              </w:rPr>
+              <w:t xml:space="preserve"> (кем и когда)</w:t>
             </w:r>
           </w:p>
         </w:tc>
@@ -1092,9 +1782,19 @@
             <w:r/>
             <w:r>
               <w:rPr>
+                <w:b w:val="0"/>
+                <w:i w:val="0"/>
                 <w:sz w:val="20"/>
               </w:rPr>
-              <w:t>Телефон: [__________]</w:t>
+              <w:t xml:space="preserve">Телефон: </w:t>
+            </w:r>
+            <w:r>
+              <w:rPr>
+                <w:b w:val="0"/>
+                <w:i w:val="0"/>
+                <w:sz w:val="20"/>
+              </w:rPr>
+              <w:t>____________</w:t>
             </w:r>
           </w:p>
         </w:tc>
@@ -1109,9 +1809,19 @@
             <w:r/>
             <w:r>
               <w:rPr>
+                <w:b w:val="0"/>
+                <w:i w:val="0"/>
                 <w:sz w:val="20"/>
               </w:rPr>
-              <w:t>Адрес: [__________]</w:t>
+              <w:t xml:space="preserve">Адрес: </w:t>
+            </w:r>
+            <w:r>
+              <w:rPr>
+                <w:b w:val="0"/>
+                <w:i w:val="0"/>
+                <w:sz w:val="20"/>
+              </w:rPr>
+              <w:t>____________</w:t>
             </w:r>
           </w:p>
         </w:tc>
@@ -1128,9 +1838,19 @@
             <w:r/>
             <w:r>
               <w:rPr>
+                <w:b w:val="0"/>
+                <w:i w:val="0"/>
                 <w:sz w:val="20"/>
               </w:rPr>
-              <w:t>Telegram: [__________]</w:t>
+              <w:t xml:space="preserve">Telegram: </w:t>
+            </w:r>
+            <w:r>
+              <w:rPr>
+                <w:b w:val="0"/>
+                <w:i w:val="0"/>
+                <w:sz w:val="20"/>
+              </w:rPr>
+              <w:t>____________</w:t>
             </w:r>
           </w:p>
         </w:tc>
@@ -1145,9 +1865,19 @@
             <w:r/>
             <w:r>
               <w:rPr>
+                <w:b w:val="0"/>
+                <w:i w:val="0"/>
                 <w:sz w:val="20"/>
               </w:rPr>
-              <w:t>Телефон: [__________]</w:t>
+              <w:t xml:space="preserve">Телефон: </w:t>
+            </w:r>
+            <w:r>
+              <w:rPr>
+                <w:b w:val="0"/>
+                <w:i w:val="0"/>
+                <w:sz w:val="20"/>
+              </w:rPr>
+              <w:t>____________</w:t>
             </w:r>
           </w:p>
         </w:tc>
@@ -1164,9 +1894,19 @@
             <w:r/>
             <w:r>
               <w:rPr>
+                <w:b w:val="0"/>
+                <w:i w:val="0"/>
                 <w:sz w:val="20"/>
               </w:rPr>
-              <w:t>Банковские реквизиты: [__________]</w:t>
+              <w:t xml:space="preserve">Банковские реквизиты: </w:t>
+            </w:r>
+            <w:r>
+              <w:rPr>
+                <w:b w:val="0"/>
+                <w:i w:val="0"/>
+                <w:sz w:val="20"/>
+              </w:rPr>
+              <w:t>____________</w:t>
             </w:r>
           </w:p>
         </w:tc>
@@ -1181,9 +1921,19 @@
             <w:r/>
             <w:r>
               <w:rPr>
+                <w:b w:val="0"/>
+                <w:i w:val="0"/>
                 <w:sz w:val="20"/>
               </w:rPr>
-              <w:t>Telegram: [__________]</w:t>
+              <w:t xml:space="preserve">Telegram: </w:t>
+            </w:r>
+            <w:r>
+              <w:rPr>
+                <w:b w:val="0"/>
+                <w:i w:val="0"/>
+                <w:sz w:val="20"/>
+              </w:rPr>
+              <w:t>____________</w:t>
             </w:r>
           </w:p>
         </w:tc>
@@ -1200,9 +1950,59 @@
             <w:r/>
             <w:r>
               <w:rPr>
+                <w:b w:val="0"/>
+                <w:i w:val="0"/>
                 <w:sz w:val="20"/>
               </w:rPr>
-              <w:t>Подпись: ______________ / [ФИО] /</w:t>
+              <w:t xml:space="preserve">Подпись: </w:t>
+            </w:r>
+            <w:r>
+              <w:rPr>
+                <w:b w:val="0"/>
+                <w:i w:val="0"/>
+                <w:sz w:val="20"/>
+              </w:rPr>
+              <w:t>___________</w:t>
+            </w:r>
+            <w:r>
+              <w:rPr>
+                <w:b w:val="0"/>
+                <w:i/>
+                <w:sz w:val="14"/>
+              </w:rPr>
+              <w:t xml:space="preserve"> (подпись)</w:t>
+            </w:r>
+            <w:r>
+              <w:rPr>
+                <w:b w:val="0"/>
+                <w:i w:val="0"/>
+                <w:sz w:val="20"/>
+              </w:rPr>
+              <w:t xml:space="preserve"> / </w:t>
+            </w:r>
+            <w:r>
+              <w:rPr>
+                <w:b w:val="0"/>
+                <w:i w:val="0"/>
+                <w:sz w:val="20"/>
+              </w:rPr>
+              <w:t>________________</w:t>
+            </w:r>
+            <w:r>
+              <w:rPr>
+                <w:b w:val="0"/>
+                <w:i/>
+                <w:sz w:val="14"/>
+              </w:rPr>
+              <w:t xml:space="preserve"> (ФИО Исполнителя)</w:t>
+            </w:r>
+            <w:r>
+              <w:rPr>
+                <w:b w:val="0"/>
+                <w:i w:val="0"/>
+                <w:sz w:val="20"/>
+              </w:rPr>
+              <w:t xml:space="preserve"> /</w:t>
             </w:r>
           </w:p>
         </w:tc>
@@ -1217,9 +2017,59 @@
             <w:r/>
             <w:r>
               <w:rPr>
+                <w:b w:val="0"/>
+                <w:i w:val="0"/>
                 <w:sz w:val="20"/>
               </w:rPr>
-              <w:t>Подпись: ______________ / [ФИО] /</w:t>
+              <w:t xml:space="preserve">Подпись: </w:t>
+            </w:r>
+            <w:r>
+              <w:rPr>
+                <w:b w:val="0"/>
+                <w:i w:val="0"/>
+                <w:sz w:val="20"/>
+              </w:rPr>
+              <w:t>___________</w:t>
+            </w:r>
+            <w:r>
+              <w:rPr>
+                <w:b w:val="0"/>
+                <w:i/>
+                <w:sz w:val="14"/>
+              </w:rPr>
+              <w:t xml:space="preserve"> (подпись)</w:t>
+            </w:r>
+            <w:r>
+              <w:rPr>
+                <w:b w:val="0"/>
+                <w:i w:val="0"/>
+                <w:sz w:val="20"/>
+              </w:rPr>
+              <w:t xml:space="preserve"> / </w:t>
+            </w:r>
+            <w:r>
+              <w:rPr>
+                <w:b w:val="0"/>
+                <w:i w:val="0"/>
+                <w:sz w:val="20"/>
+              </w:rPr>
+              <w:t>________________</w:t>
+            </w:r>
+            <w:r>
+              <w:rPr>
+                <w:b w:val="0"/>
+                <w:i/>
+                <w:sz w:val="14"/>
+              </w:rPr>
+              <w:t xml:space="preserve"> (ФИО Заказчика)</w:t>
+            </w:r>
+            <w:r>
+              <w:rPr>
+                <w:b w:val="0"/>
+                <w:i w:val="0"/>
+                <w:sz w:val="20"/>
+              </w:rPr>
+              <w:t xml:space="preserve"> /</w:t>
             </w:r>
           </w:p>
         </w:tc>
@@ -1259,7 +2109,63 @@
           <w:b/>
           <w:i w:val="0"/>
         </w:rPr>
-        <w:t>СПЕЦИФИКАЦИЯ к договору № [____] от «[__]» [__________] 20[__] г.</w:t>
+        <w:t xml:space="preserve">СПЕЦИФИКАЦИЯ к договору № </w:t>
+      </w:r>
+      <w:r>
+        <w:rPr>
+          <w:b/>
+          <w:i w:val="0"/>
+        </w:rPr>
+        <w:t>____________</w:t>
+      </w:r>
+      <w:r>
+        <w:rPr>
+          <w:b/>
+          <w:i w:val="0"/>
+        </w:rPr>
+        <w:t xml:space="preserve"> от «</w:t>
+      </w:r>
+      <w:r>
+        <w:rPr>
+          <w:b/>
+          <w:i w:val="0"/>
+        </w:rPr>
+        <w:t>____</w:t>
+      </w:r>
+      <w:r>
+        <w:rPr>
+          <w:b/>
+          <w:i w:val="0"/>
+        </w:rPr>
+        <w:t xml:space="preserve">» </w:t>
+      </w:r>
+      <w:r>
+        <w:rPr>
+          <w:b/>
+          <w:i w:val="0"/>
+        </w:rPr>
+        <w:t>____________</w:t>
+      </w:r>
+      <w:r>
+        <w:rPr>
+          <w:b/>
+          <w:i w:val="0"/>
+        </w:rPr>
+        <w:t xml:space="preserve"> 20</w:t>
+      </w:r>
+      <w:r>
+        <w:rPr>
+          <w:b/>
+          <w:i w:val="0"/>
+        </w:rPr>
+        <w:t>____</w:t>
+      </w:r>
+      <w:r>
+        <w:rPr>
+          <w:b/>
+          <w:i w:val="0"/>
+        </w:rPr>
+        <w:t xml:space="preserve"> г.</w:t>
       </w:r>
     </w:p>
     <w:tbl>
@@ -1291,6 +2197,7 @@
             <w:r>
               <w:rPr>
                 <w:b/>
+                <w:i w:val="0"/>
                 <w:sz w:val="20"/>
               </w:rPr>
               <w:t>№</w:t>
@@ -1309,6 +2216,7 @@
             <w:r>
               <w:rPr>
                 <w:b/>
+                <w:i w:val="0"/>
                 <w:sz w:val="20"/>
               </w:rPr>
               <w:t>Наименование и размеры (Ш×В×Г, мм)</w:t>
@@ -1327,6 +2235,7 @@
             <w:r>
               <w:rPr>
                 <w:b/>
+                <w:i w:val="0"/>
                 <w:sz w:val="20"/>
               </w:rPr>
               <w:t>Материал корпуса / фасада, цвет</w:t>
@@ -1345,6 +2254,7 @@
             <w:r>
               <w:rPr>
                 <w:b/>
+                <w:i w:val="0"/>
                 <w:sz w:val="20"/>
               </w:rPr>
               <w:t>Фурнитура</w:t>
@@ -1363,6 +2273,7 @@
             <w:r>
               <w:rPr>
                 <w:b/>
+                <w:i w:val="0"/>
                 <w:sz w:val="20"/>
               </w:rPr>
               <w:t>Кол-во</w:t>
@@ -1381,6 +2292,7 @@
             <w:r>
               <w:rPr>
                 <w:b/>
+                <w:i w:val="0"/>
                 <w:sz w:val="20"/>
               </w:rPr>
               <w:t>Цена, сум</w:t>
@@ -1400,6 +2312,8 @@
             <w:r/>
             <w:r>
               <w:rPr>
+                <w:b w:val="0"/>
+                <w:i w:val="0"/>
                 <w:sz w:val="20"/>
               </w:rPr>
               <w:t>1</w:t>
@@ -1415,11 +2329,6 @@
               <w:spacing w:after="40" w:before="40"/>
             </w:pPr>
             <w:r/>
-            <w:r>
-              <w:rPr>
-                <w:sz w:val="20"/>
-              </w:rPr>
-            </w:r>
           </w:p>
         </w:tc>
         <w:tc>
@@ -1431,11 +2340,6 @@
               <w:spacing w:after="40" w:before="40"/>
             </w:pPr>
             <w:r/>
-            <w:r>
-              <w:rPr>
-                <w:sz w:val="20"/>
-              </w:rPr>
-            </w:r>
           </w:p>
         </w:tc>
         <w:tc>
@@ -1447,11 +2351,6 @@
               <w:spacing w:after="40" w:before="40"/>
             </w:pPr>
             <w:r/>
-            <w:r>
-              <w:rPr>
-                <w:sz w:val="20"/>
-              </w:rPr>
-            </w:r>
           </w:p>
         </w:tc>
         <w:tc>
@@ -1463,11 +2362,6 @@
               <w:spacing w:after="40" w:before="40"/>
             </w:pPr>
             <w:r/>
-            <w:r>
-              <w:rPr>
-                <w:sz w:val="20"/>
-              </w:rPr>
-            </w:r>
           </w:p>
         </w:tc>
         <w:tc>
@@ -1479,11 +2373,6 @@
               <w:spacing w:after="40" w:before="40"/>
             </w:pPr>
             <w:r/>
-            <w:r>
-              <w:rPr>
-                <w:sz w:val="20"/>
-              </w:rPr>
-            </w:r>
           </w:p>
         </w:tc>
       </w:tr>
@@ -1499,6 +2388,8 @@
             <w:r/>
             <w:r>
               <w:rPr>
+                <w:b w:val="0"/>
+                <w:i w:val="0"/>
                 <w:sz w:val="20"/>
               </w:rPr>
               <w:t>2</w:t>
@@ -1514,11 +2405,6 @@
               <w:spacing w:after="40" w:before="40"/>
             </w:pPr>
             <w:r/>
-            <w:r>
-              <w:rPr>
-                <w:sz w:val="20"/>
-              </w:rPr>
-            </w:r>
           </w:p>
         </w:tc>
         <w:tc>
@@ -1530,11 +2416,6 @@
               <w:spacing w:after="40" w:before="40"/>
             </w:pPr>
             <w:r/>
-            <w:r>
-              <w:rPr>
-                <w:sz w:val="20"/>
-              </w:rPr>
-            </w:r>
           </w:p>
         </w:tc>
         <w:tc>
@@ -1546,11 +2427,6 @@
               <w:spacing w:after="40" w:before="40"/>
             </w:pPr>
             <w:r/>
-            <w:r>
-              <w:rPr>
-                <w:sz w:val="20"/>
-              </w:rPr>
-            </w:r>
           </w:p>
         </w:tc>
         <w:tc>
@@ -1562,11 +2438,6 @@
               <w:spacing w:after="40" w:before="40"/>
             </w:pPr>
             <w:r/>
-            <w:r>
-              <w:rPr>
-                <w:sz w:val="20"/>
-              </w:rPr>
-            </w:r>
           </w:p>
         </w:tc>
         <w:tc>
@@ -1578,11 +2449,6 @@
               <w:spacing w:after="40" w:before="40"/>
             </w:pPr>
             <w:r/>
-            <w:r>
-              <w:rPr>
-                <w:sz w:val="20"/>
-              </w:rPr>
-            </w:r>
           </w:p>
         </w:tc>
       </w:tr>
@@ -1598,6 +2464,8 @@
             <w:r/>
             <w:r>
               <w:rPr>
+                <w:b w:val="0"/>
+                <w:i w:val="0"/>
                 <w:sz w:val="20"/>
               </w:rPr>
               <w:t>3</w:t>
@@ -1613,11 +2481,6 @@
               <w:spacing w:after="40" w:before="40"/>
             </w:pPr>
             <w:r/>
-            <w:r>
-              <w:rPr>
-                <w:sz w:val="20"/>
-              </w:rPr>
-            </w:r>
           </w:p>
         </w:tc>
         <w:tc>
@@ -1629,11 +2492,6 @@
               <w:spacing w:after="40" w:before="40"/>
             </w:pPr>
             <w:r/>
-            <w:r>
-              <w:rPr>
-                <w:sz w:val="20"/>
-              </w:rPr>
-            </w:r>
           </w:p>
         </w:tc>
         <w:tc>
@@ -1645,11 +2503,6 @@
               <w:spacing w:after="40" w:before="40"/>
             </w:pPr>
             <w:r/>
-            <w:r>
-              <w:rPr>
-                <w:sz w:val="20"/>
-              </w:rPr>
-            </w:r>
           </w:p>
         </w:tc>
         <w:tc>
@@ -1661,11 +2514,6 @@
               <w:spacing w:after="40" w:before="40"/>
             </w:pPr>
             <w:r/>
-            <w:r>
-              <w:rPr>
-                <w:sz w:val="20"/>
-              </w:rPr>
-            </w:r>
           </w:p>
         </w:tc>
         <w:tc>
@@ -1677,11 +2525,6 @@
               <w:spacing w:after="40" w:before="40"/>
             </w:pPr>
             <w:r/>
-            <w:r>
-              <w:rPr>
-                <w:sz w:val="20"/>
-              </w:rPr>
-            </w:r>
           </w:p>
         </w:tc>
       </w:tr>
@@ -1697,6 +2540,8 @@
             <w:r/>
             <w:r>
               <w:rPr>
+                <w:b w:val="0"/>
+                <w:i w:val="0"/>
                 <w:sz w:val="20"/>
               </w:rPr>
               <w:t>4</w:t>
@@ -1712,11 +2557,6 @@
               <w:spacing w:after="40" w:before="40"/>
             </w:pPr>
             <w:r/>
-            <w:r>
-              <w:rPr>
-                <w:sz w:val="20"/>
-              </w:rPr>
-            </w:r>
           </w:p>
         </w:tc>
         <w:tc>
@@ -1728,11 +2568,6 @@
               <w:spacing w:after="40" w:before="40"/>
             </w:pPr>
             <w:r/>
-            <w:r>
-              <w:rPr>
-                <w:sz w:val="20"/>
-              </w:rPr>
-            </w:r>
           </w:p>
         </w:tc>
         <w:tc>
@@ -1744,11 +2579,6 @@
               <w:spacing w:after="40" w:before="40"/>
             </w:pPr>
             <w:r/>
-            <w:r>
-              <w:rPr>
-                <w:sz w:val="20"/>
-              </w:rPr>
-            </w:r>
           </w:p>
         </w:tc>
         <w:tc>
@@ -1760,11 +2590,6 @@
               <w:spacing w:after="40" w:before="40"/>
             </w:pPr>
             <w:r/>
-            <w:r>
-              <w:rPr>
-                <w:sz w:val="20"/>
-              </w:rPr>
-            </w:r>
           </w:p>
         </w:tc>
         <w:tc>
@@ -1776,11 +2601,6 @@
               <w:spacing w:after="40" w:before="40"/>
             </w:pPr>
             <w:r/>
-            <w:r>
-              <w:rPr>
-                <w:sz w:val="20"/>
-              </w:rPr>
-            </w:r>
           </w:p>
         </w:tc>
       </w:tr>
@@ -1796,6 +2616,8 @@
             <w:r/>
             <w:r>
               <w:rPr>
+                <w:b w:val="0"/>
+                <w:i w:val="0"/>
                 <w:sz w:val="20"/>
               </w:rPr>
               <w:t>5</w:t>
@@ -1811,11 +2633,6 @@
               <w:spacing w:after="40" w:before="40"/>
             </w:pPr>
             <w:r/>
-            <w:r>
-              <w:rPr>
-                <w:sz w:val="20"/>
-              </w:rPr>
-            </w:r>
           </w:p>
         </w:tc>
         <w:tc>
@@ -1827,11 +2644,6 @@
               <w:spacing w:after="40" w:before="40"/>
             </w:pPr>
             <w:r/>
-            <w:r>
-              <w:rPr>
-                <w:sz w:val="20"/>
-              </w:rPr>
-            </w:r>
           </w:p>
         </w:tc>
         <w:tc>
@@ -1843,11 +2655,6 @@
               <w:spacing w:after="40" w:before="40"/>
             </w:pPr>
             <w:r/>
-            <w:r>
-              <w:rPr>
-                <w:sz w:val="20"/>
-              </w:rPr>
-            </w:r>
           </w:p>
         </w:tc>
         <w:tc>
@@ -1859,11 +2666,6 @@
               <w:spacing w:after="40" w:before="40"/>
             </w:pPr>
             <w:r/>
-            <w:r>
-              <w:rPr>
-                <w:sz w:val="20"/>
-              </w:rPr>
-            </w:r>
           </w:p>
         </w:tc>
         <w:tc>
@@ -1875,11 +2677,6 @@
               <w:spacing w:after="40" w:before="40"/>
             </w:pPr>
             <w:r/>
-            <w:r>
-              <w:rPr>
-                <w:sz w:val="20"/>
-              </w:rPr>
-            </w:r>
           </w:p>
         </w:tc>
       </w:tr>
@@ -1895,6 +2692,8 @@
             <w:r/>
             <w:r>
               <w:rPr>
+                <w:b w:val="0"/>
+                <w:i w:val="0"/>
                 <w:sz w:val="20"/>
               </w:rPr>
               <w:t>6</w:t>
@@ -1910,11 +2709,6 @@
               <w:spacing w:after="40" w:before="40"/>
             </w:pPr>
             <w:r/>
-            <w:r>
-              <w:rPr>
-                <w:sz w:val="20"/>
-              </w:rPr>
-            </w:r>
           </w:p>
         </w:tc>
         <w:tc>
@@ -1926,11 +2720,6 @@
               <w:spacing w:after="40" w:before="40"/>
             </w:pPr>
             <w:r/>
-            <w:r>
-              <w:rPr>
-                <w:sz w:val="20"/>
-              </w:rPr>
-            </w:r>
           </w:p>
         </w:tc>
         <w:tc>
@@ -1942,11 +2731,6 @@
               <w:spacing w:after="40" w:before="40"/>
             </w:pPr>
             <w:r/>
-            <w:r>
-              <w:rPr>
-                <w:sz w:val="20"/>
-              </w:rPr>
-            </w:r>
           </w:p>
         </w:tc>
         <w:tc>
@@ -1958,11 +2742,6 @@
               <w:spacing w:after="40" w:before="40"/>
             </w:pPr>
             <w:r/>
-            <w:r>
-              <w:rPr>
-                <w:sz w:val="20"/>
-              </w:rPr>
-            </w:r>
           </w:p>
         </w:tc>
         <w:tc>
@@ -1974,11 +2753,6 @@
               <w:spacing w:after="40" w:before="40"/>
             </w:pPr>
             <w:r/>
-            <w:r>
-              <w:rPr>
-                <w:sz w:val="20"/>
-              </w:rPr>
-            </w:r>
           </w:p>
         </w:tc>
       </w:tr>
@@ -1994,6 +2768,8 @@
             <w:r/>
             <w:r>
               <w:rPr>
+                <w:b w:val="0"/>
+                <w:i w:val="0"/>
                 <w:sz w:val="20"/>
               </w:rPr>
               <w:t>7</w:t>
@@ -2009,11 +2785,6 @@
               <w:spacing w:after="40" w:before="40"/>
             </w:pPr>
             <w:r/>
-            <w:r>
-              <w:rPr>
-                <w:sz w:val="20"/>
-              </w:rPr>
-            </w:r>
           </w:p>
         </w:tc>
         <w:tc>
@@ -2025,11 +2796,6 @@
               <w:spacing w:after="40" w:before="40"/>
             </w:pPr>
             <w:r/>
-            <w:r>
-              <w:rPr>
-                <w:sz w:val="20"/>
-              </w:rPr>
-            </w:r>
           </w:p>
         </w:tc>
         <w:tc>
@@ -2041,11 +2807,6 @@
               <w:spacing w:after="40" w:before="40"/>
             </w:pPr>
             <w:r/>
-            <w:r>
-              <w:rPr>
-                <w:sz w:val="20"/>
-              </w:rPr>
-            </w:r>
           </w:p>
         </w:tc>
         <w:tc>
@@ -2057,11 +2818,6 @@
               <w:spacing w:after="40" w:before="40"/>
             </w:pPr>
             <w:r/>
-            <w:r>
-              <w:rPr>
-                <w:sz w:val="20"/>
-              </w:rPr>
-            </w:r>
           </w:p>
         </w:tc>
         <w:tc>
@@ -2073,11 +2829,6 @@
               <w:spacing w:after="40" w:before="40"/>
             </w:pPr>
             <w:r/>
-            <w:r>
-              <w:rPr>
-                <w:sz w:val="20"/>
-              </w:rPr>
-            </w:r>
           </w:p>
         </w:tc>
       </w:tr>
@@ -2093,6 +2844,8 @@
             <w:r/>
             <w:r>
               <w:rPr>
+                <w:b w:val="0"/>
+                <w:i w:val="0"/>
                 <w:sz w:val="20"/>
               </w:rPr>
               <w:t>8</w:t>
@@ -2108,11 +2861,6 @@
               <w:spacing w:after="40" w:before="40"/>
             </w:pPr>
             <w:r/>
-            <w:r>
-              <w:rPr>
-                <w:sz w:val="20"/>
-              </w:rPr>
-            </w:r>
           </w:p>
         </w:tc>
         <w:tc>
@@ -2124,11 +2872,6 @@
               <w:spacing w:after="40" w:before="40"/>
             </w:pPr>
             <w:r/>
-            <w:r>
-              <w:rPr>
-                <w:sz w:val="20"/>
-              </w:rPr>
-            </w:r>
           </w:p>
         </w:tc>
         <w:tc>
@@ -2140,11 +2883,6 @@
               <w:spacing w:after="40" w:before="40"/>
             </w:pPr>
             <w:r/>
-            <w:r>
-              <w:rPr>
-                <w:sz w:val="20"/>
-              </w:rPr>
-            </w:r>
           </w:p>
         </w:tc>
         <w:tc>
@@ -2156,11 +2894,6 @@
               <w:spacing w:after="40" w:before="40"/>
             </w:pPr>
             <w:r/>
-            <w:r>
-              <w:rPr>
-                <w:sz w:val="20"/>
-              </w:rPr>
-            </w:r>
           </w:p>
         </w:tc>
         <w:tc>
@@ -2172,11 +2905,6 @@
               <w:spacing w:after="40" w:before="40"/>
             </w:pPr>
             <w:r/>
-            <w:r>
-              <w:rPr>
-                <w:sz w:val="20"/>
-              </w:rPr>
-            </w:r>
           </w:p>
         </w:tc>
       </w:tr>
@@ -2192,6 +2920,8 @@
             <w:r/>
             <w:r>
               <w:rPr>
+                <w:b w:val="0"/>
+                <w:i w:val="0"/>
                 <w:sz w:val="20"/>
               </w:rPr>
               <w:t>9</w:t>
@@ -2207,11 +2937,6 @@
               <w:spacing w:after="40" w:before="40"/>
             </w:pPr>
             <w:r/>
-            <w:r>
-              <w:rPr>
-                <w:sz w:val="20"/>
-              </w:rPr>
-            </w:r>
           </w:p>
         </w:tc>
         <w:tc>
@@ -2223,11 +2948,6 @@
               <w:spacing w:after="40" w:before="40"/>
             </w:pPr>
             <w:r/>
-            <w:r>
-              <w:rPr>
-                <w:sz w:val="20"/>
-              </w:rPr>
-            </w:r>
           </w:p>
         </w:tc>
         <w:tc>
@@ -2239,11 +2959,6 @@
               <w:spacing w:after="40" w:before="40"/>
             </w:pPr>
             <w:r/>
-            <w:r>
-              <w:rPr>
-                <w:sz w:val="20"/>
-              </w:rPr>
-            </w:r>
           </w:p>
         </w:tc>
         <w:tc>
@@ -2255,11 +2970,6 @@
               <w:spacing w:after="40" w:before="40"/>
             </w:pPr>
             <w:r/>
-            <w:r>
-              <w:rPr>
-                <w:sz w:val="20"/>
-              </w:rPr>
-            </w:r>
           </w:p>
         </w:tc>
         <w:tc>
@@ -2271,11 +2981,6 @@
               <w:spacing w:after="40" w:before="40"/>
             </w:pPr>
             <w:r/>
-            <w:r>
-              <w:rPr>
-                <w:sz w:val="20"/>
-              </w:rPr>
-            </w:r>
           </w:p>
         </w:tc>
       </w:tr>
@@ -2291,6 +2996,8 @@
             <w:r/>
             <w:r>
               <w:rPr>
+                <w:b w:val="0"/>
+                <w:i w:val="0"/>
                 <w:sz w:val="20"/>
               </w:rPr>
               <w:t>10</w:t>
@@ -2306,11 +3013,6 @@
               <w:spacing w:after="40" w:before="40"/>
             </w:pPr>
             <w:r/>
-            <w:r>
-              <w:rPr>
-                <w:sz w:val="20"/>
-              </w:rPr>
-            </w:r>
           </w:p>
         </w:tc>
         <w:tc>
@@ -2322,11 +3024,6 @@
               <w:spacing w:after="40" w:before="40"/>
             </w:pPr>
             <w:r/>
-            <w:r>
-              <w:rPr>
-                <w:sz w:val="20"/>
-              </w:rPr>
-            </w:r>
           </w:p>
         </w:tc>
         <w:tc>
@@ -2338,11 +3035,6 @@
               <w:spacing w:after="40" w:before="40"/>
             </w:pPr>
             <w:r/>
-            <w:r>
-              <w:rPr>
-                <w:sz w:val="20"/>
-              </w:rPr>
-            </w:r>
           </w:p>
         </w:tc>
         <w:tc>
@@ -2354,11 +3046,6 @@
               <w:spacing w:after="40" w:before="40"/>
             </w:pPr>
             <w:r/>
-            <w:r>
-              <w:rPr>
-                <w:sz w:val="20"/>
-              </w:rPr>
-            </w:r>
           </w:p>
         </w:tc>
         <w:tc>
@@ -2370,11 +3057,6 @@
               <w:spacing w:after="40" w:before="40"/>
             </w:pPr>
             <w:r/>
-            <w:r>
-              <w:rPr>
-                <w:sz w:val="20"/>
-              </w:rPr>
-            </w:r>
           </w:p>
         </w:tc>
       </w:tr>
@@ -2393,7 +3075,14 @@
           <w:b w:val="0"/>
           <w:i w:val="0"/>
         </w:rPr>
-        <w:t>Столешница (материал, толщина, размеры): [______________________________]</w:t>
+        <w:t xml:space="preserve">Столешница (материал, толщина, размеры): </w:t>
+      </w:r>
+      <w:r>
+        <w:rPr>
+          <w:b w:val="0"/>
+          <w:i w:val="0"/>
+        </w:rPr>
+        <w:t>________________________________</w:t>
       </w:r>
     </w:p>
     <w:p>
@@ -2405,7 +3094,119 @@
           <w:b w:val="0"/>
           <w:i w:val="0"/>
         </w:rPr>
-        <w:t>Встраиваемая техника — модель и габариты ниши: холодильник [__________]; духовой шкаф [__________]; микроволновая печь [__________]; варочная панель [__________]; вытяжка [__________]; посудомоечная машина [__________]; стиральная машина [__________]; прочее [__________].</w:t>
+        <w:t xml:space="preserve">Встраиваемая техника — модель и габариты ниши: холодильник </w:t>
+      </w:r>
+      <w:r>
+        <w:rPr>
+          <w:b w:val="0"/>
+          <w:i w:val="0"/>
+        </w:rPr>
+        <w:t>____________</w:t>
+      </w:r>
+      <w:r>
+        <w:rPr>
+          <w:b w:val="0"/>
+          <w:i w:val="0"/>
+        </w:rPr>
+        <w:t xml:space="preserve">; духовой шкаф </w:t>
+      </w:r>
+      <w:r>
+        <w:rPr>
+          <w:b w:val="0"/>
+          <w:i w:val="0"/>
+        </w:rPr>
+        <w:t>____________</w:t>
+      </w:r>
+      <w:r>
+        <w:rPr>
+          <w:b w:val="0"/>
+          <w:i w:val="0"/>
+        </w:rPr>
+        <w:t xml:space="preserve">; микроволновая печь </w:t>
+      </w:r>
+      <w:r>
+        <w:rPr>
+          <w:b w:val="0"/>
+          <w:i w:val="0"/>
+        </w:rPr>
+        <w:t>____________</w:t>
+      </w:r>
+      <w:r>
+        <w:rPr>
+          <w:b w:val="0"/>
+          <w:i w:val="0"/>
+        </w:rPr>
+        <w:t xml:space="preserve">; варочная панель </w:t>
+      </w:r>
+      <w:r>
+        <w:rPr>
+          <w:b w:val="0"/>
+          <w:i w:val="0"/>
+        </w:rPr>
+        <w:t>____________</w:t>
+      </w:r>
+      <w:r>
+        <w:rPr>
+          <w:b w:val="0"/>
+          <w:i w:val="0"/>
+        </w:rPr>
+        <w:t xml:space="preserve">; вытяжка </w:t>
+      </w:r>
+      <w:r>
+        <w:rPr>
+          <w:b w:val="0"/>
+          <w:i w:val="0"/>
+        </w:rPr>
+        <w:t>____________</w:t>
+      </w:r>
+      <w:r>
+        <w:rPr>
+          <w:b w:val="0"/>
+          <w:i w:val="0"/>
+        </w:rPr>
+        <w:t xml:space="preserve">; посудомоечная машина </w:t>
+      </w:r>
+      <w:r>
+        <w:rPr>
+          <w:b w:val="0"/>
+          <w:i w:val="0"/>
+        </w:rPr>
+        <w:t>____________</w:t>
+      </w:r>
+      <w:r>
+        <w:rPr>
+          <w:b w:val="0"/>
+          <w:i w:val="0"/>
+        </w:rPr>
+        <w:t xml:space="preserve">; стиральная машина </w:t>
+      </w:r>
+      <w:r>
+        <w:rPr>
+          <w:b w:val="0"/>
+          <w:i w:val="0"/>
+        </w:rPr>
+        <w:t>____________</w:t>
+      </w:r>
+      <w:r>
+        <w:rPr>
+          <w:b w:val="0"/>
+          <w:i w:val="0"/>
+        </w:rPr>
+        <w:t xml:space="preserve">; прочее </w:t>
+      </w:r>
+      <w:r>
+        <w:rPr>
+          <w:b w:val="0"/>
+          <w:i w:val="0"/>
+        </w:rPr>
+        <w:t>____________</w:t>
+      </w:r>
+      <w:r>
+        <w:rPr>
+          <w:b w:val="0"/>
+          <w:i w:val="0"/>
+        </w:rPr>
+        <w:t>.</w:t>
       </w:r>
     </w:p>
     <w:p>
@@ -2417,7 +3218,14 @@
           <w:b w:val="0"/>
           <w:i w:val="0"/>
         </w:rPr>
-        <w:t>Мойка и смеситель: [______________________________]</w:t>
+        <w:t xml:space="preserve">Мойка и смеситель: </w:t>
+      </w:r>
+      <w:r>
+        <w:rPr>
+          <w:b w:val="0"/>
+          <w:i w:val="0"/>
+        </w:rPr>
+        <w:t>________________________________</w:t>
       </w:r>
     </w:p>
     <w:p>
@@ -2429,7 +3237,14 @@
           <w:b w:val="0"/>
           <w:i w:val="0"/>
         </w:rPr>
-        <w:t>Подсветка, декоративные элементы, дополнительные работы: [______________________________]</w:t>
+        <w:t xml:space="preserve">Подсветка, декоративные элементы, дополнительные работы: </w:t>
+      </w:r>
+      <w:r>
+        <w:rPr>
+          <w:b w:val="0"/>
+          <w:i w:val="0"/>
+        </w:rPr>
+        <w:t>________________________________</w:t>
       </w:r>
     </w:p>
     <w:p>
@@ -2441,7 +3256,35 @@
           <w:b w:val="0"/>
           <w:i w:val="0"/>
         </w:rPr>
-        <w:t>Схема размещения и эскиз прилагаются на [__] л. Доставка и монтаж: [__________] сум.</w:t>
+        <w:t xml:space="preserve">Схема размещения и эскиз прилагаются на </w:t>
+      </w:r>
+      <w:r>
+        <w:rPr>
+          <w:b w:val="0"/>
+          <w:i w:val="0"/>
+        </w:rPr>
+        <w:t>____</w:t>
+      </w:r>
+      <w:r>
+        <w:rPr>
+          <w:b w:val="0"/>
+          <w:i w:val="0"/>
+        </w:rPr>
+        <w:t xml:space="preserve"> л. Доставка и монтаж: </w:t>
+      </w:r>
+      <w:r>
+        <w:rPr>
+          <w:b w:val="0"/>
+          <w:i w:val="0"/>
+        </w:rPr>
+        <w:t>____________</w:t>
+      </w:r>
+      <w:r>
+        <w:rPr>
+          <w:b w:val="0"/>
+          <w:i w:val="0"/>
+        </w:rPr>
+        <w:t xml:space="preserve"> сум.</w:t>
       </w:r>
     </w:p>
     <w:p>
@@ -2453,7 +3296,36 @@
           <w:b w:val="0"/>
           <w:i w:val="0"/>
         </w:rPr>
-        <w:t>ИТОГО по Спецификации: [__________] ([сумма прописью]) сум.</w:t>
+        <w:t xml:space="preserve">ИТОГО по Спецификации: </w:t>
+      </w:r>
+      <w:r>
+        <w:rPr>
+          <w:b w:val="0"/>
+          <w:i w:val="0"/>
+        </w:rPr>
+        <w:t>____________</w:t>
+      </w:r>
+      <w:r>
+        <w:rPr>
+          <w:b w:val="0"/>
+          <w:i w:val="0"/>
+        </w:rPr>
+        <w:t xml:space="preserve"> </w:t>
+      </w:r>
+      <w:r>
+        <w:rPr>
+          <w:b w:val="0"/>
+          <w:i/>
+          <w:sz w:val="14"/>
+        </w:rPr>
+        <w:t xml:space="preserve"> (сумма прописью)</w:t>
+      </w:r>
+      <w:r>
+        <w:rPr>
+          <w:b w:val="0"/>
+          <w:i w:val="0"/>
+        </w:rPr>
+        <w:t xml:space="preserve"> сум.</w:t>
       </w:r>
     </w:p>
     <w:tbl>
@@ -2481,6 +3353,7 @@
             <w:r>
               <w:rPr>
                 <w:b/>
+                <w:i w:val="0"/>
                 <w:sz w:val="20"/>
               </w:rPr>
               <w:t>Исполнитель</w:t>
@@ -2499,6 +3372,7 @@
             <w:r>
               <w:rPr>
                 <w:b/>
+                <w:i w:val="0"/>
                 <w:sz w:val="20"/>
               </w:rPr>
               <w:t>Заказчик</w:t>
@@ -2518,9 +3392,59 @@
             <w:r/>
             <w:r>
               <w:rPr>
+                <w:b w:val="0"/>
+                <w:i w:val="0"/>
                 <w:sz w:val="20"/>
               </w:rPr>
-              <w:t>Подпись: ______________ / [ФИО] /</w:t>
+              <w:t xml:space="preserve">Подпись: </w:t>
+            </w:r>
+            <w:r>
+              <w:rPr>
+                <w:b w:val="0"/>
+                <w:i w:val="0"/>
+                <w:sz w:val="20"/>
+              </w:rPr>
+              <w:t>___________</w:t>
+            </w:r>
+            <w:r>
+              <w:rPr>
+                <w:b w:val="0"/>
+                <w:i/>
+                <w:sz w:val="14"/>
+              </w:rPr>
+              <w:t xml:space="preserve"> (подпись)</w:t>
+            </w:r>
+            <w:r>
+              <w:rPr>
+                <w:b w:val="0"/>
+                <w:i w:val="0"/>
+                <w:sz w:val="20"/>
+              </w:rPr>
+              <w:t xml:space="preserve"> / </w:t>
+            </w:r>
+            <w:r>
+              <w:rPr>
+                <w:b w:val="0"/>
+                <w:i w:val="0"/>
+                <w:sz w:val="20"/>
+              </w:rPr>
+              <w:t>________________</w:t>
+            </w:r>
+            <w:r>
+              <w:rPr>
+                <w:b w:val="0"/>
+                <w:i/>
+                <w:sz w:val="14"/>
+              </w:rPr>
+              <w:t xml:space="preserve"> (ФИО Исполнителя)</w:t>
+            </w:r>
+            <w:r>
+              <w:rPr>
+                <w:b w:val="0"/>
+                <w:i w:val="0"/>
+                <w:sz w:val="20"/>
+              </w:rPr>
+              <w:t xml:space="preserve"> /</w:t>
             </w:r>
           </w:p>
         </w:tc>
@@ -2535,9 +3459,59 @@
             <w:r/>
             <w:r>
               <w:rPr>
+                <w:b w:val="0"/>
+                <w:i w:val="0"/>
                 <w:sz w:val="20"/>
               </w:rPr>
-              <w:t>Подпись: ______________ / [ФИО] /</w:t>
+              <w:t xml:space="preserve">Подпись: </w:t>
+            </w:r>
+            <w:r>
+              <w:rPr>
+                <w:b w:val="0"/>
+                <w:i w:val="0"/>
+                <w:sz w:val="20"/>
+              </w:rPr>
+              <w:t>___________</w:t>
+            </w:r>
+            <w:r>
+              <w:rPr>
+                <w:b w:val="0"/>
+                <w:i/>
+                <w:sz w:val="14"/>
+              </w:rPr>
+              <w:t xml:space="preserve"> (подпись)</w:t>
+            </w:r>
+            <w:r>
+              <w:rPr>
+                <w:b w:val="0"/>
+                <w:i w:val="0"/>
+                <w:sz w:val="20"/>
+              </w:rPr>
+              <w:t xml:space="preserve"> / </w:t>
+            </w:r>
+            <w:r>
+              <w:rPr>
+                <w:b w:val="0"/>
+                <w:i w:val="0"/>
+                <w:sz w:val="20"/>
+              </w:rPr>
+              <w:t>________________</w:t>
+            </w:r>
+            <w:r>
+              <w:rPr>
+                <w:b w:val="0"/>
+                <w:i/>
+                <w:sz w:val="14"/>
+              </w:rPr>
+              <w:t xml:space="preserve"> (ФИО Заказчика)</w:t>
+            </w:r>
+            <w:r>
+              <w:rPr>
+                <w:b w:val="0"/>
+                <w:i w:val="0"/>
+                <w:sz w:val="20"/>
+              </w:rPr>
+              <w:t xml:space="preserve"> /</w:t>
             </w:r>
           </w:p>
         </w:tc>
@@ -2577,7 +3551,14 @@
           <w:b/>
           <w:i w:val="0"/>
         </w:rPr>
-        <w:t>АКТ ПРИЁМКИ ВЫПОЛНЕННЫХ РАБОТ к договору № [____]</w:t>
+        <w:t xml:space="preserve">АКТ ПРИЁМКИ ВЫПОЛНЕННЫХ РАБОТ к договору № </w:t>
+      </w:r>
+      <w:r>
+        <w:rPr>
+          <w:b/>
+          <w:i w:val="0"/>
+        </w:rPr>
+        <w:t>____________</w:t>
       </w:r>
     </w:p>
     <w:p>
@@ -2587,9 +3568,63 @@
         </w:tabs>
       </w:pPr>
       <w:r>
+        <w:rPr>
+          <w:b w:val="0"/>
+          <w:i w:val="0"/>
+        </w:rPr>
         <w:t>г. Ташкент</w:t>
         <w:tab/>
-        <w:t>«[__]» [__________] 20[__] г.</w:t>
+        <w:t>«</w:t>
+      </w:r>
+      <w:r>
+        <w:rPr>
+          <w:b w:val="0"/>
+          <w:i w:val="0"/>
+        </w:rPr>
+        <w:t>____</w:t>
+      </w:r>
+      <w:r>
+        <w:rPr>
+          <w:b w:val="0"/>
+          <w:i w:val="0"/>
+        </w:rPr>
+        <w:t xml:space="preserve">» </w:t>
+      </w:r>
+      <w:r>
+        <w:rPr>
+          <w:b w:val="0"/>
+          <w:i w:val="0"/>
+        </w:rPr>
+        <w:t>____________</w:t>
+      </w:r>
+      <w:r>
+        <w:rPr>
+          <w:b w:val="0"/>
+          <w:i w:val="0"/>
+        </w:rPr>
+        <w:t xml:space="preserve"> 20</w:t>
+      </w:r>
+      <w:r>
+        <w:rPr>
+          <w:b w:val="0"/>
+          <w:i w:val="0"/>
+        </w:rPr>
+        <w:t>____</w:t>
+      </w:r>
+      <w:r>
+        <w:rPr>
+          <w:b w:val="0"/>
+          <w:i w:val="0"/>
+        </w:rPr>
+        <w:t xml:space="preserve"> г. </w:t>
+      </w:r>
+      <w:r>
+        <w:rPr>
+          <w:b w:val="0"/>
+          <w:i/>
+          <w:sz w:val="14"/>
+        </w:rPr>
+        <w:t xml:space="preserve"> (дата)</w:t>
       </w:r>
     </w:p>
     <w:p>
@@ -2601,7 +3636,43 @@
           <w:b w:val="0"/>
           <w:i w:val="0"/>
         </w:rPr>
-        <w:t>Исполнитель выполнил, а Заказчик принял изготовление, доставку и установку мебели по адресу: [адрес объекта] в соответствии со Спецификацией (Приложение № 1) к договору № [____].</w:t>
+        <w:t xml:space="preserve">Исполнитель выполнил, а Заказчик принял изготовление, доставку и установку мебели по адресу: </w:t>
+      </w:r>
+      <w:r>
+        <w:rPr>
+          <w:b w:val="0"/>
+          <w:i w:val="0"/>
+        </w:rPr>
+        <w:t>________________</w:t>
+      </w:r>
+      <w:r>
+        <w:rPr>
+          <w:b w:val="0"/>
+          <w:i/>
+          <w:sz w:val="14"/>
+        </w:rPr>
+        <w:t xml:space="preserve"> (адрес объекта)</w:t>
+      </w:r>
+      <w:r>
+        <w:rPr>
+          <w:b w:val="0"/>
+          <w:i w:val="0"/>
+        </w:rPr>
+        <w:t xml:space="preserve"> в соответствии со Спецификацией (Приложение № 1) к договору № </w:t>
+      </w:r>
+      <w:r>
+        <w:rPr>
+          <w:b w:val="0"/>
+          <w:i w:val="0"/>
+        </w:rPr>
+        <w:t>______</w:t>
+      </w:r>
+      <w:r>
+        <w:rPr>
+          <w:b w:val="0"/>
+          <w:i w:val="0"/>
+        </w:rPr>
+        <w:t>.</w:t>
       </w:r>
     </w:p>
     <w:p>
@@ -2625,7 +3696,35 @@
           <w:b w:val="0"/>
           <w:i w:val="0"/>
         </w:rPr>
-        <w:t>2. Замечания Заказчика к качеству и комплектности: [нет] / [перечень замечаний и срок их устранения: __________________].</w:t>
+        <w:t xml:space="preserve">2. Замечания Заказчика к качеству и комплектности: </w:t>
+      </w:r>
+      <w:r>
+        <w:rPr>
+          <w:b w:val="0"/>
+          <w:i w:val="0"/>
+        </w:rPr>
+        <w:t>[нет]</w:t>
+      </w:r>
+      <w:r>
+        <w:rPr>
+          <w:b w:val="0"/>
+          <w:i w:val="0"/>
+        </w:rPr>
+        <w:t xml:space="preserve"> / </w:t>
+      </w:r>
+      <w:r>
+        <w:rPr>
+          <w:b w:val="0"/>
+          <w:i w:val="0"/>
+        </w:rPr>
+        <w:t>[перечень замечаний и срок их устранения: __________________]</w:t>
+      </w:r>
+      <w:r>
+        <w:rPr>
+          <w:b w:val="0"/>
+          <w:i w:val="0"/>
+        </w:rPr>
+        <w:t>.</w:t>
       </w:r>
     </w:p>
     <w:p>
@@ -2637,7 +3736,35 @@
           <w:b w:val="0"/>
           <w:i w:val="0"/>
         </w:rPr>
-        <w:t>3. Заказчик претензий по объёму, срокам и качеству работ [не имеет] / [имеет, указанные в пункте 2].</w:t>
+        <w:t xml:space="preserve">3. Заказчик претензий по объёму, срокам и качеству работ </w:t>
+      </w:r>
+      <w:r>
+        <w:rPr>
+          <w:b w:val="0"/>
+          <w:i w:val="0"/>
+        </w:rPr>
+        <w:t>[не имеет]</w:t>
+      </w:r>
+      <w:r>
+        <w:rPr>
+          <w:b w:val="0"/>
+          <w:i w:val="0"/>
+        </w:rPr>
+        <w:t xml:space="preserve"> / </w:t>
+      </w:r>
+      <w:r>
+        <w:rPr>
+          <w:b w:val="0"/>
+          <w:i w:val="0"/>
+        </w:rPr>
+        <w:t>[имеет, указанные в пункте 2]</w:t>
+      </w:r>
+      <w:r>
+        <w:rPr>
+          <w:b w:val="0"/>
+          <w:i w:val="0"/>
+        </w:rPr>
+        <w:t>.</w:t>
       </w:r>
     </w:p>
     <w:p>
@@ -2661,7 +3788,35 @@
           <w:b w:val="0"/>
           <w:i w:val="0"/>
         </w:rPr>
-        <w:t>5. Оплата произведена в полном объёме: [да] / [нет, остаток __________ сум подлежит оплате до __________].</w:t>
+        <w:t xml:space="preserve">5. Оплата произведена в полном объёме: </w:t>
+      </w:r>
+      <w:r>
+        <w:rPr>
+          <w:b w:val="0"/>
+          <w:i w:val="0"/>
+        </w:rPr>
+        <w:t>[да]</w:t>
+      </w:r>
+      <w:r>
+        <w:rPr>
+          <w:b w:val="0"/>
+          <w:i w:val="0"/>
+        </w:rPr>
+        <w:t xml:space="preserve"> / </w:t>
+      </w:r>
+      <w:r>
+        <w:rPr>
+          <w:b w:val="0"/>
+          <w:i w:val="0"/>
+        </w:rPr>
+        <w:t>[нет, остаток __________ сум подлежит оплате до __________]</w:t>
+      </w:r>
+      <w:r>
+        <w:rPr>
+          <w:b w:val="0"/>
+          <w:i w:val="0"/>
+        </w:rPr>
+        <w:t>.</w:t>
       </w:r>
     </w:p>
     <w:tbl>
@@ -2689,6 +3844,7 @@
             <w:r>
               <w:rPr>
                 <w:b/>
+                <w:i w:val="0"/>
                 <w:sz w:val="20"/>
               </w:rPr>
               <w:t>Исполнитель</w:t>
@@ -2707,6 +3863,7 @@
             <w:r>
               <w:rPr>
                 <w:b/>
+                <w:i w:val="0"/>
                 <w:sz w:val="20"/>
               </w:rPr>
               <w:t>Заказчик</w:t>
@@ -2726,9 +3883,59 @@
             <w:r/>
             <w:r>
               <w:rPr>
+                <w:b w:val="0"/>
+                <w:i w:val="0"/>
                 <w:sz w:val="20"/>
               </w:rPr>
-              <w:t>Подпись: ______________ / [ФИО] /</w:t>
+              <w:t xml:space="preserve">Подпись: </w:t>
+            </w:r>
+            <w:r>
+              <w:rPr>
+                <w:b w:val="0"/>
+                <w:i w:val="0"/>
+                <w:sz w:val="20"/>
+              </w:rPr>
+              <w:t>___________</w:t>
+            </w:r>
+            <w:r>
+              <w:rPr>
+                <w:b w:val="0"/>
+                <w:i/>
+                <w:sz w:val="14"/>
+              </w:rPr>
+              <w:t xml:space="preserve"> (подпись)</w:t>
+            </w:r>
+            <w:r>
+              <w:rPr>
+                <w:b w:val="0"/>
+                <w:i w:val="0"/>
+                <w:sz w:val="20"/>
+              </w:rPr>
+              <w:t xml:space="preserve"> / </w:t>
+            </w:r>
+            <w:r>
+              <w:rPr>
+                <w:b w:val="0"/>
+                <w:i w:val="0"/>
+                <w:sz w:val="20"/>
+              </w:rPr>
+              <w:t>________________</w:t>
+            </w:r>
+            <w:r>
+              <w:rPr>
+                <w:b w:val="0"/>
+                <w:i/>
+                <w:sz w:val="14"/>
+              </w:rPr>
+              <w:t xml:space="preserve"> (ФИО Исполнителя)</w:t>
+            </w:r>
+            <w:r>
+              <w:rPr>
+                <w:b w:val="0"/>
+                <w:i w:val="0"/>
+                <w:sz w:val="20"/>
+              </w:rPr>
+              <w:t xml:space="preserve"> /</w:t>
             </w:r>
           </w:p>
         </w:tc>
@@ -2743,9 +3950,59 @@
             <w:r/>
             <w:r>
               <w:rPr>
+                <w:b w:val="0"/>
+                <w:i w:val="0"/>
                 <w:sz w:val="20"/>
               </w:rPr>
-              <w:t>Подпись: ______________ / [ФИО] /</w:t>
+              <w:t xml:space="preserve">Подпись: </w:t>
+            </w:r>
+            <w:r>
+              <w:rPr>
+                <w:b w:val="0"/>
+                <w:i w:val="0"/>
+                <w:sz w:val="20"/>
+              </w:rPr>
+              <w:t>___________</w:t>
+            </w:r>
+            <w:r>
+              <w:rPr>
+                <w:b w:val="0"/>
+                <w:i/>
+                <w:sz w:val="14"/>
+              </w:rPr>
+              <w:t xml:space="preserve"> (подпись)</w:t>
+            </w:r>
+            <w:r>
+              <w:rPr>
+                <w:b w:val="0"/>
+                <w:i w:val="0"/>
+                <w:sz w:val="20"/>
+              </w:rPr>
+              <w:t xml:space="preserve"> / </w:t>
+            </w:r>
+            <w:r>
+              <w:rPr>
+                <w:b w:val="0"/>
+                <w:i w:val="0"/>
+                <w:sz w:val="20"/>
+              </w:rPr>
+              <w:t>________________</w:t>
+            </w:r>
+            <w:r>
+              <w:rPr>
+                <w:b w:val="0"/>
+                <w:i/>
+                <w:sz w:val="14"/>
+              </w:rPr>
+              <w:t xml:space="preserve"> (ФИО Заказчика)</w:t>
+            </w:r>
+            <w:r>
+              <w:rPr>
+                <w:b w:val="0"/>
+                <w:i w:val="0"/>
+                <w:sz w:val="20"/>
+              </w:rPr>
+              <w:t xml:space="preserve"> /</w:t>
             </w:r>
           </w:p>
         </w:tc>

</xml_diff>

<commit_message>
Contract: 70% non-refundable prepayment, 5mm tolerance claims
</commit_message>
<xml_diff>
--- a/static/docs/dogovor-mebel.docx
+++ b/static/docs/dogovor-mebel.docx
@@ -470,7 +470,7 @@
           <w:b w:val="0"/>
           <w:i w:val="0"/>
         </w:rPr>
-        <w:t>[75]</w:t>
+        <w:t>[70]</w:t>
       </w:r>
       <w:r>
         <w:rPr>
@@ -512,7 +512,7 @@
           <w:b w:val="0"/>
           <w:i w:val="0"/>
         </w:rPr>
-        <w:t>[25]</w:t>
+        <w:t>[30]</w:t>
       </w:r>
       <w:r>
         <w:rPr>
@@ -557,7 +557,7 @@
           <w:b w:val="0"/>
           <w:i w:val="0"/>
         </w:rPr>
-        <w:t>2.4. Предоплата используется для закупки материалов и фурнитуры и запуска Изделия в производство. Стоимость, указанная в Спецификации, не изменяется в течение срока действия договора, кроме случаев изменения Спецификации по инициативе Заказчика (раздел 6, включая дополнительные работы по пунктам 6.4–6.7) и случаев, предусмотренных пунктом 3.3.</w:t>
+        <w:t>2.4. Предоплата невозвратна в случае отказа Заказчика от договора (пункт 8.2). Предоплата используется для закупки материалов и фурнитуры и запуска Изделия в производство. Стоимость, указанная в Спецификации, не изменяется в течение срока действия договора, кроме случаев изменения Спецификации по инициативе Заказчика (раздел 6, включая дополнительные работы по пунктам 6.4–6.7) и случаев, предусмотренных пунктом 3.3.</w:t>
       </w:r>
     </w:p>
     <w:p>
@@ -765,7 +765,7 @@
           <w:b w:val="0"/>
           <w:i w:val="0"/>
         </w:rPr>
-        <w:t>4.3. Заказчик подтверждает, что материалы, цвета и фактуры выбраны им по физическим образцам или каталогу. Цвет и текстура материалов могут незначительно отличаться от изображений на экране, фотографий и образцов; технологические допуски на размеры Изделия составляют не более ±2 мм и не являются недостатком.</w:t>
+        <w:t>4.3. Заказчик подтверждает, что материалы, цвета и фактуры выбраны им по физическим образцам или каталогу. Цвет и текстура материалов могут незначительно отличаться от изображений на экране, фотографий и образцов. Отклонение размеров и положения Изделия от согласованных в Спецификации и в проекте установки в пределах 5 мм, а также технологические допуски, установленные стандартом, не являются недостатком. Претензии по размерам и установке принимаются к рассмотрению, только если отклонение превышает 5 мм от согласованных размеров и положения либо Изделие не соответствует применимому стандарту.</w:t>
       </w:r>
     </w:p>
     <w:p>
@@ -1053,7 +1053,7 @@
           <w:b w:val="0"/>
           <w:i w:val="0"/>
         </w:rPr>
-        <w:t>7.3. Гарантия не распространяется на: естественный износ; механические повреждения (удары, царапины, сколы); повреждения от влаги — протечек, постоянной сырости, пара, неправильной уборки, попадания воды на кромку и в стыки; воздействие высокой температуры (горячая посуда, открытый огонь, пар) на фасады, кромку и столешницу; перегрузку полок и ящиков; выгорание и изменение цвета под прямыми солнечными лучами; самостоятельный ремонт, разборку или перемещение Изделия; повреждения при подключении техники и сантехники третьими лицами; незначительные отличия цвета и текстуры материалов; недостатки, оговорённые в акте приёмки; обстоятельства непреодолимой силы.</w:t>
+        <w:t>7.3. Гарантия не распространяется на: естественный износ; механические повреждения (удары, царапины, сколы); повреждения от влаги — протечек, постоянной сырости, пара, неправильной уборки, попадания воды на кромку и в стыки; воздействие высокой температуры (горячая посуда, открытый огонь, пар) на фасады, кромку и столешницу; перегрузку полок и ящиков; выгорание и изменение цвета под прямыми солнечными лучами; самостоятельный ремонт, разборку или перемещение Изделия; повреждения при подключении техники и сантехники третьими лицами; незначительные отличия цвета и текстуры материалов; отклонения в пределах 5 мм по пункту 4.3; недостатки, оговорённые в акте приёмки; обстоятельства непреодолимой силы.</w:t>
       </w:r>
     </w:p>
     <w:p>
@@ -1143,7 +1143,7 @@
           <w:b w:val="0"/>
           <w:i w:val="0"/>
         </w:rPr>
-        <w:t>8.2. Заказчик вправе отказаться от договора в любое время, оплатив Исполнителю фактически выполненную часть работ и понесённые расходы (в пределах, допускаемых законодательством). Предоплата возвращается за вычетом расходов на замер и проект, закупленные материалы и фурнитуру, изготовленные детали и узлы, поскольку Изделие изготавливается по индивидуальным размерам и не может быть продано другому лицу.</w:t>
+        <w:t>8.2. Заказчик вправе отказаться от договора в любое время. В случае отказа по инициативе Заказчика предоплата (70 % стоимости по пункту 2.2) возврату не подлежит и остаётся у Исполнителя в счёт компенсации расходов на замер, проект, закупленные материалы и фурнитуру, изготовленные детали, резервирование производственных мощностей и иных убытков, поскольку Изделие изготавливается по индивидуальным размерам и не может быть продано другому лицу. Если фактически понесённые Исполнителем расходы и выполненная часть работ превышают сумму предоплаты, Заказчик оплачивает разницу.</w:t>
       </w:r>
     </w:p>
     <w:p>
@@ -1169,7 +1169,7 @@
           <w:b w:val="0"/>
           <w:i w:val="0"/>
         </w:rPr>
-        <w:t xml:space="preserve"> дней), письменно уведомив Заказчика. Неизрасходованная часть предоплаты возвращается за вычетом расходов, указанных в пункте 8.2.</w:t>
+        <w:t xml:space="preserve"> дней), письменно уведомив Заказчика. В этом случае предоплата остаётся у Исполнителя на условиях пункта 8.2.</w:t>
       </w:r>
     </w:p>
     <w:p>
@@ -1181,7 +1181,21 @@
           <w:b w:val="0"/>
           <w:i w:val="0"/>
         </w:rPr>
-        <w:t xml:space="preserve">8.4. Возврат денежных средств производится в течение </w:t>
+        <w:t xml:space="preserve">8.4. Если договор расторгнут по вине Исполнителя (нарушение срока более чем на </w:t>
+      </w:r>
+      <w:r>
+        <w:rPr>
+          <w:b w:val="0"/>
+          <w:i w:val="0"/>
+        </w:rPr>
+        <w:t>[30]</w:t>
+      </w:r>
+      <w:r>
+        <w:rPr>
+          <w:b w:val="0"/>
+          <w:i w:val="0"/>
+        </w:rPr>
+        <w:t xml:space="preserve"> дней, отказ от исполнения), предоплата возвращается Заказчику полностью в течение </w:t>
       </w:r>
       <w:r>
         <w:rPr>
@@ -1337,7 +1351,7 @@
           <w:b w:val="0"/>
           <w:i w:val="0"/>
         </w:rPr>
-        <w:t xml:space="preserve"> дней, любая из Сторон вправе расторгнуть договор с взаиморасчётами по пункту 8.2.</w:t>
+        <w:t xml:space="preserve"> дней, любая из Сторон вправе расторгнуть договор с взаиморасчётами: предоплата возвращается за вычетом фактически понесённых Исполнителем расходов.</w:t>
       </w:r>
     </w:p>
     <w:p>

</xml_diff>

<commit_message>
Contract: installment agreement (Appendix 4) with auto payment schedule
- build_contract.py: clause 2.6, Appendix 4 (schedule, title retention until full
  payment, penalty, acceleration, guarantor, 3-party signatures); Liberation Serif
  fallback off Windows; export also writes static/js/contract-data.js
- static/js/installment.js: toggle in the contract window toolbar (/calc, /shkaf):
  prepayment %, months -> fills Appendix 4 and payment table; hidden when off
- Rebuilt dogovor-mebel.docx/.pdf

Co-Authored-By: Claude Opus 5.5 <noreply@anthropic.com>
Claude-Session: https://claude.ai/code/session_01WtuytnVMHWD8pV9nnEoMmS
</commit_message>
<xml_diff>
--- a/static/docs/dogovor-mebel.docx
+++ b/static/docs/dogovor-mebel.docx
@@ -588,20 +588,6 @@
     </w:p>
     <w:p>
       <w:pPr>
-        <w:keepNext/>
-        <w:spacing w:before="200" w:after="80"/>
-        <w:jc w:val="center"/>
-      </w:pPr>
-      <w:r>
-        <w:rPr>
-          <w:b/>
-          <w:i w:val="0"/>
-        </w:rPr>
-        <w:t>3. Сроки</w:t>
-      </w:r>
-    </w:p>
-    <w:p>
-      <w:pPr>
         <w:jc w:val="both"/>
       </w:pPr>
       <w:r>
@@ -609,113 +595,7 @@
           <w:b w:val="0"/>
           <w:i w:val="0"/>
         </w:rPr>
-        <w:t xml:space="preserve">3.1. Срок изготовления Изделия — </w:t>
-      </w:r>
-      <w:r>
-        <w:rPr>
-          <w:b w:val="0"/>
-          <w:i w:val="0"/>
-        </w:rPr>
-        <w:t>____</w:t>
-      </w:r>
-      <w:r>
-        <w:rPr>
-          <w:b w:val="0"/>
-          <w:i w:val="0"/>
-        </w:rPr>
-        <w:t xml:space="preserve"> рабочих дней. Отсчёт срока начинается со дня, когда выполнены все условия: подписана Спецификация, подтверждены размеры по результатам замера и внесена предоплата.</w:t>
-      </w:r>
-    </w:p>
-    <w:p>
-      <w:pPr>
-        <w:jc w:val="both"/>
-      </w:pPr>
-      <w:r>
-        <w:rPr>
-          <w:b w:val="0"/>
-          <w:i w:val="0"/>
-        </w:rPr>
-        <w:t xml:space="preserve">3.2. Дата доставки и монтажа согласовывается Сторонами заранее, не позднее чем за </w:t>
-      </w:r>
-      <w:r>
-        <w:rPr>
-          <w:b w:val="0"/>
-          <w:i w:val="0"/>
-        </w:rPr>
-        <w:t>[1–2]</w:t>
-      </w:r>
-      <w:r>
-        <w:rPr>
-          <w:b w:val="0"/>
-          <w:i w:val="0"/>
-        </w:rPr>
-        <w:t xml:space="preserve"> дня. Монтаж занимает </w:t>
-      </w:r>
-      <w:r>
-        <w:rPr>
-          <w:b w:val="0"/>
-          <w:i w:val="0"/>
-        </w:rPr>
-        <w:t>____</w:t>
-      </w:r>
-      <w:r>
-        <w:rPr>
-          <w:b w:val="0"/>
-          <w:i w:val="0"/>
-        </w:rPr>
-        <w:t xml:space="preserve"> рабочих дней.</w:t>
-      </w:r>
-    </w:p>
-    <w:p>
-      <w:pPr>
-        <w:jc w:val="both"/>
-      </w:pPr>
-      <w:r>
-        <w:rPr>
-          <w:b w:val="0"/>
-          <w:i w:val="0"/>
-        </w:rPr>
-        <w:t>3.3. Сроки переносятся на соответствующий период, если: Заказчик изменил Спецификацию; не внесена предоплата в срок; нет доступа на объект или объект не готов к монтажу; материалы или фурнитура задержаны поставщиками по причинам, не зависящим от Исполнителя; наступили обстоятельства непреодолимой силы (раздел 10). Исполнитель обязан заблаговременно уведомить Заказчика о переносе.</w:t>
-      </w:r>
-    </w:p>
-    <w:p>
-      <w:pPr>
-        <w:jc w:val="both"/>
-      </w:pPr>
-      <w:r>
-        <w:rPr>
-          <w:b w:val="0"/>
-          <w:i w:val="0"/>
-        </w:rPr>
-        <w:t xml:space="preserve">3.4. При нарушении срока изготовления по вине Исполнителя Заказчик вправе требовать неустойку в размере </w:t>
-      </w:r>
-      <w:r>
-        <w:rPr>
-          <w:b w:val="0"/>
-          <w:i w:val="0"/>
-        </w:rPr>
-        <w:t>[0,1]</w:t>
-      </w:r>
-      <w:r>
-        <w:rPr>
-          <w:b w:val="0"/>
-          <w:i w:val="0"/>
-        </w:rPr>
-        <w:t xml:space="preserve"> % от стоимости Изделия за каждый день просрочки, но не более </w:t>
-      </w:r>
-      <w:r>
-        <w:rPr>
-          <w:b w:val="0"/>
-          <w:i w:val="0"/>
-        </w:rPr>
-        <w:t>[10]</w:t>
-      </w:r>
-      <w:r>
-        <w:rPr>
-          <w:b w:val="0"/>
-          <w:i w:val="0"/>
-        </w:rPr>
-        <w:t xml:space="preserve"> % от стоимости Изделия. Если Заказчик является потребителем и законодательством о защите прав потребителей установлен более высокий размер ответственности Исполнителя, применяется размер, установленный законодательством.</w:t>
+        <w:t>2.6. По соглашению Сторон часть стоимости может быть оплачена в рассрочку. В этом случае размер предоплаты, график платежей и условия рассрочки определяются Соглашением о рассрочке (Приложение № 4), которое имеет приоритет над пунктом 2.2 в части порядка оплаты.</w:t>
       </w:r>
     </w:p>
     <w:p>
@@ -729,7 +609,7 @@
           <w:b/>
           <w:i w:val="0"/>
         </w:rPr>
-        <w:t>4. Права и обязанности Сторон</w:t>
+        <w:t>3. Сроки</w:t>
       </w:r>
     </w:p>
     <w:p>
@@ -741,7 +621,21 @@
           <w:b w:val="0"/>
           <w:i w:val="0"/>
         </w:rPr>
-        <w:t>4.1. Исполнитель обязан: выполнить работы качественно и в соответствии со Спецификацией; использовать материалы и фурнитуру, указанные в Спецификации (замена на равноценные допускается только с согласия Заказчика); соблюдать сроки; сообщать Заказчику об обстоятельствах, препятствующих выполнению работ; обеспечить доставку и монтаж; убрать упаковку и мусор, образовавшийся при монтаже; устранять недостатки в течение гарантийного срока.</w:t>
+        <w:t xml:space="preserve">3.1. Срок изготовления Изделия — </w:t>
+      </w:r>
+      <w:r>
+        <w:rPr>
+          <w:b w:val="0"/>
+          <w:i w:val="0"/>
+        </w:rPr>
+        <w:t>____</w:t>
+      </w:r>
+      <w:r>
+        <w:rPr>
+          <w:b w:val="0"/>
+          <w:i w:val="0"/>
+        </w:rPr>
+        <w:t xml:space="preserve"> рабочих дней. Отсчёт срока начинается со дня, когда выполнены все условия: подписана Спецификация, подтверждены размеры по результатам замера и внесена предоплата.</w:t>
       </w:r>
     </w:p>
     <w:p>
@@ -753,7 +647,35 @@
           <w:b w:val="0"/>
           <w:i w:val="0"/>
         </w:rPr>
-        <w:t>4.2. Исполнитель вправе: привлекать для выполнения отдельных работ третьих лиц, оставаясь ответственным перед Заказчиком; приостановить работы при неоплате или отсутствии доступа на объект; требовать оплаты выполненных работ.</w:t>
+        <w:t xml:space="preserve">3.2. Дата доставки и монтажа согласовывается Сторонами заранее, не позднее чем за </w:t>
+      </w:r>
+      <w:r>
+        <w:rPr>
+          <w:b w:val="0"/>
+          <w:i w:val="0"/>
+        </w:rPr>
+        <w:t>[1–2]</w:t>
+      </w:r>
+      <w:r>
+        <w:rPr>
+          <w:b w:val="0"/>
+          <w:i w:val="0"/>
+        </w:rPr>
+        <w:t xml:space="preserve"> дня. Монтаж занимает </w:t>
+      </w:r>
+      <w:r>
+        <w:rPr>
+          <w:b w:val="0"/>
+          <w:i w:val="0"/>
+        </w:rPr>
+        <w:t>____</w:t>
+      </w:r>
+      <w:r>
+        <w:rPr>
+          <w:b w:val="0"/>
+          <w:i w:val="0"/>
+        </w:rPr>
+        <w:t xml:space="preserve"> рабочих дней.</w:t>
       </w:r>
     </w:p>
     <w:p>
@@ -765,7 +687,7 @@
           <w:b w:val="0"/>
           <w:i w:val="0"/>
         </w:rPr>
-        <w:t>4.3. Заказчик подтверждает, что материалы, цвета и фактуры выбраны им по физическим образцам или каталогу. Цвет и текстура материалов могут незначительно отличаться от изображений на экране, фотографий и образцов. Отклонение размеров и положения Изделия от согласованных в Спецификации и в проекте установки в пределах 5 мм, а также технологические допуски, установленные стандартом, не являются недостатком. Претензии по размерам и установке принимаются к рассмотрению, только если отклонение превышает 5 мм от согласованных размеров и положения либо Изделие не соответствует применимому стандарту.</w:t>
+        <w:t>3.3. Сроки переносятся на соответствующий период, если: Заказчик изменил Спецификацию; не внесена предоплата в срок; нет доступа на объект или объект не готов к монтажу; материалы или фурнитура задержаны поставщиками по причинам, не зависящим от Исполнителя; наступили обстоятельства непреодолимой силы (раздел 10). Исполнитель обязан заблаговременно уведомить Заказчика о переносе.</w:t>
       </w:r>
     </w:p>
     <w:p>
@@ -777,19 +699,35 @@
           <w:b w:val="0"/>
           <w:i w:val="0"/>
         </w:rPr>
-        <w:t>4.4. Заказчик обязан: обеспечить доступ на объект в согласованное время; подготовить помещение к монтажу (чистовая отделка стен, пола и потолка, выведенные коммуникации, электропитание, возможность подъёма и разгрузки); передать Исполнителю модели и габариты встраиваемой техники (холодильника, духового шкафа, микроволновой печи, варочной панели, вытяжки, мойки, стиральной и посудомоечной машин) до запуска Изделия в производство; сообщить о скрытых коммуникациях (трубах, проводке) в местах крепления; оплатить работы; принять результат.</w:t>
-      </w:r>
-    </w:p>
-    <w:p>
-      <w:pPr>
-        <w:jc w:val="both"/>
-      </w:pPr>
+        <w:t xml:space="preserve">3.4. При нарушении срока изготовления по вине Исполнителя Заказчик вправе требовать неустойку в размере </w:t>
+      </w:r>
       <w:r>
         <w:rPr>
           <w:b w:val="0"/>
           <w:i w:val="0"/>
         </w:rPr>
-        <w:t>4.5. Заказчик вправе: получать информацию о ходе выполнения работ; вносить изменения в Спецификацию (раздел 6); отказаться от договора (раздел 8).</w:t>
+        <w:t>[0,1]</w:t>
+      </w:r>
+      <w:r>
+        <w:rPr>
+          <w:b w:val="0"/>
+          <w:i w:val="0"/>
+        </w:rPr>
+        <w:t xml:space="preserve"> % от стоимости Изделия за каждый день просрочки, но не более </w:t>
+      </w:r>
+      <w:r>
+        <w:rPr>
+          <w:b w:val="0"/>
+          <w:i w:val="0"/>
+        </w:rPr>
+        <w:t>[10]</w:t>
+      </w:r>
+      <w:r>
+        <w:rPr>
+          <w:b w:val="0"/>
+          <w:i w:val="0"/>
+        </w:rPr>
+        <w:t xml:space="preserve"> % от стоимости Изделия. Если Заказчик является потребителем и законодательством о защите прав потребителей установлен более высокий размер ответственности Исполнителя, применяется размер, установленный законодательством.</w:t>
       </w:r>
     </w:p>
     <w:p>
@@ -803,7 +741,7 @@
           <w:b/>
           <w:i w:val="0"/>
         </w:rPr>
-        <w:t>5. Доставка, монтаж и приёмка</w:t>
+        <w:t>4. Права и обязанности Сторон</w:t>
       </w:r>
     </w:p>
     <w:p>
@@ -815,7 +753,7 @@
           <w:b w:val="0"/>
           <w:i w:val="0"/>
         </w:rPr>
-        <w:t>5.1. Исполнитель доставляет Изделие по адресу объекта в согласованное время. Заказчик (или его представитель) осматривает Изделие при приёмке.</w:t>
+        <w:t>4.1. Исполнитель обязан: выполнить работы качественно и в соответствии со Спецификацией; использовать материалы и фурнитуру, указанные в Спецификации (замена на равноценные допускается только с согласия Заказчика); соблюдать сроки; сообщать Заказчику об обстоятельствах, препятствующих выполнению работ; обеспечить доставку и монтаж; убрать упаковку и мусор, образовавшийся при монтаже; устранять недостатки в течение гарантийного срока.</w:t>
       </w:r>
     </w:p>
     <w:p>
@@ -827,21 +765,7 @@
           <w:b w:val="0"/>
           <w:i w:val="0"/>
         </w:rPr>
-        <w:t xml:space="preserve">5.2. Если доставка или монтаж не могут быть выполнены по вине Заказчика (объект не готов, нет доступа, техника не подходит по размерам и т. п.), повторный выезд оплачивается Заказчиком отдельно: </w:t>
-      </w:r>
-      <w:r>
-        <w:rPr>
-          <w:b w:val="0"/>
-          <w:i w:val="0"/>
-        </w:rPr>
-        <w:t>____________</w:t>
-      </w:r>
-      <w:r>
-        <w:rPr>
-          <w:b w:val="0"/>
-          <w:i w:val="0"/>
-        </w:rPr>
-        <w:t xml:space="preserve"> сум.</w:t>
+        <w:t>4.2. Исполнитель вправе: привлекать для выполнения отдельных работ третьих лиц, оставаясь ответственным перед Заказчиком; приостановить работы при неоплате или отсутствии доступа на объект; требовать оплаты выполненных работ.</w:t>
       </w:r>
     </w:p>
     <w:p>
@@ -853,7 +777,7 @@
           <w:b w:val="0"/>
           <w:i w:val="0"/>
         </w:rPr>
-        <w:t>5.3. После завершения монтажа Стороны подписывают акт приёмки (Приложение № 2). Недостатки, выявленные при приёмке, фиксируются в акте и устраняются Исполнителем в согласованный срок.</w:t>
+        <w:t>4.3. Заказчик подтверждает, что материалы, цвета и фактуры выбраны им по физическим образцам или каталогу. Цвет и текстура материалов могут незначительно отличаться от изображений на экране, фотографий и образцов. Отклонение размеров и положения Изделия от согласованных в Спецификации и в проекте установки в пределах 5 мм, а также технологические допуски, установленные стандартом, не являются недостатком. Претензии по размерам и установке принимаются к рассмотрению, только если отклонение превышает 5 мм от согласованных размеров и положения либо Изделие не соответствует применимому стандарту.</w:t>
       </w:r>
     </w:p>
     <w:p>
@@ -865,21 +789,7 @@
           <w:b w:val="0"/>
           <w:i w:val="0"/>
         </w:rPr>
-        <w:t xml:space="preserve">5.4. Заказчик осматривает результат работ в день завершения монтажа. Если Заказчик без уважительных причин уклоняется от подписания акта, Исполнитель направляет ему письменное уведомление; при отсутствии мотивированных возражений в течение </w:t>
-      </w:r>
-      <w:r>
-        <w:rPr>
-          <w:b w:val="0"/>
-          <w:i w:val="0"/>
-        </w:rPr>
-        <w:t>[3]</w:t>
-      </w:r>
-      <w:r>
-        <w:rPr>
-          <w:b w:val="0"/>
-          <w:i w:val="0"/>
-        </w:rPr>
-        <w:t xml:space="preserve"> рабочих дней со дня уведомления работы считаются принятыми.</w:t>
+        <w:t>4.4. Заказчик обязан: обеспечить доступ на объект в согласованное время; подготовить помещение к монтажу (чистовая отделка стен, пола и потолка, выведенные коммуникации, электропитание, возможность подъёма и разгрузки); передать Исполнителю модели и габариты встраиваемой техники (холодильника, духового шкафа, микроволновой печи, варочной панели, вытяжки, мойки, стиральной и посудомоечной машин) до запуска Изделия в производство; сообщить о скрытых коммуникациях (трубах, проводке) в местах крепления; оплатить работы; принять результат.</w:t>
       </w:r>
     </w:p>
     <w:p>
@@ -891,7 +801,7 @@
           <w:b w:val="0"/>
           <w:i w:val="0"/>
         </w:rPr>
-        <w:t>5.5. Риск случайной гибели или повреждения Изделия до подписания акта приёмки несёт Исполнитель, после подписания — Заказчик.</w:t>
+        <w:t>4.5. Заказчик вправе: получать информацию о ходе выполнения работ; вносить изменения в Спецификацию (раздел 6); отказаться от договора (раздел 8).</w:t>
       </w:r>
     </w:p>
     <w:p>
@@ -905,7 +815,7 @@
           <w:b/>
           <w:i w:val="0"/>
         </w:rPr>
-        <w:t>6. Изменение Спецификации</w:t>
+        <w:t>5. Доставка, монтаж и приёмка</w:t>
       </w:r>
     </w:p>
     <w:p>
@@ -917,7 +827,7 @@
           <w:b w:val="0"/>
           <w:i w:val="0"/>
         </w:rPr>
-        <w:t>6.1. Изменения в Спецификацию вносятся только по согласию обеих Сторон в письменной форме. Допускается подтверждение изменений перепиской в Telegram с контактов, указанных в реквизитах настоящего договора.</w:t>
+        <w:t>5.1. Исполнитель доставляет Изделие по адресу объекта в согласованное время. Заказчик (или его представитель) осматривает Изделие при приёмке.</w:t>
       </w:r>
     </w:p>
     <w:p>
@@ -929,7 +839,21 @@
           <w:b w:val="0"/>
           <w:i w:val="0"/>
         </w:rPr>
-        <w:t>6.2. После запуска Изделия в производство и раскроя материалов изменения могут быть невозможны или оплачиваются Заказчиком дополнительно; при этом сроки изготовления переносятся.</w:t>
+        <w:t xml:space="preserve">5.2. Если доставка или монтаж не могут быть выполнены по вине Заказчика (объект не готов, нет доступа, техника не подходит по размерам и т. п.), повторный выезд оплачивается Заказчиком отдельно: </w:t>
+      </w:r>
+      <w:r>
+        <w:rPr>
+          <w:b w:val="0"/>
+          <w:i w:val="0"/>
+        </w:rPr>
+        <w:t>____________</w:t>
+      </w:r>
+      <w:r>
+        <w:rPr>
+          <w:b w:val="0"/>
+          <w:i w:val="0"/>
+        </w:rPr>
+        <w:t xml:space="preserve"> сум.</w:t>
       </w:r>
     </w:p>
     <w:p>
@@ -941,7 +865,7 @@
           <w:b w:val="0"/>
           <w:i w:val="0"/>
         </w:rPr>
-        <w:t>6.3. Если изменения влекут изменение цены, Стороны фиксируют новую цену в Спецификации до внесения изменений.</w:t>
+        <w:t>5.3. После завершения монтажа Стороны подписывают акт приёмки (Приложение № 2). Недостатки, выявленные при приёмке, фиксируются в акте и устраняются Исполнителем в согласованный срок.</w:t>
       </w:r>
     </w:p>
     <w:p>
@@ -953,7 +877,21 @@
           <w:b w:val="0"/>
           <w:i w:val="0"/>
         </w:rPr>
-        <w:t>6.4. Дополнительные работы. Если после подписания Спецификации Заказчик пожелает получить что-либо сверх согласованного (дополнительные или изменённые изделия, элементы, материалы, фурнитуру, подсветку, работы по монтажу и т. п.), такие работы выполняются только после их согласования и оплачиваются Заказчиком дополнительно, сверх цены, указанной в пункте 2.1.</w:t>
+        <w:t xml:space="preserve">5.4. Заказчик осматривает результат работ в день завершения монтажа. Если Заказчик без уважительных причин уклоняется от подписания акта, Исполнитель направляет ему письменное уведомление; при отсутствии мотивированных возражений в течение </w:t>
+      </w:r>
+      <w:r>
+        <w:rPr>
+          <w:b w:val="0"/>
+          <w:i w:val="0"/>
+        </w:rPr>
+        <w:t>[3]</w:t>
+      </w:r>
+      <w:r>
+        <w:rPr>
+          <w:b w:val="0"/>
+          <w:i w:val="0"/>
+        </w:rPr>
+        <w:t xml:space="preserve"> рабочих дней со дня уведомления работы считаются принятыми.</w:t>
       </w:r>
     </w:p>
     <w:p>
@@ -965,45 +903,7 @@
           <w:b w:val="0"/>
           <w:i w:val="0"/>
         </w:rPr>
-        <w:t>6.5. Стоимость дополнительных работ определяется Исполнителем расчётом по фактической стоимости материалов, фурнитуры, работ и доставки и сообщается Заказчику до начала их выполнения. Расчёт Исполнителя является окончательным и не подлежит торгу или пересмотру: Заказчик либо принимает расчёт, либо отказывается от дополнительных работ.</w:t>
-      </w:r>
-    </w:p>
-    <w:p>
-      <w:pPr>
-        <w:jc w:val="both"/>
-      </w:pPr>
-      <w:r>
-        <w:rPr>
-          <w:b w:val="0"/>
-          <w:i w:val="0"/>
-        </w:rPr>
-        <w:t>6.6. Если Заказчик отказывается от дополнительных работ, договор исполняется в объёме действующей Спецификации на прежних условиях. Если Заказчик принимает расчёт, это подтверждается письменно (в том числе сообщением в Telegram по пункту 6.1) либо подписанием дополнения к Спецификации, после чего стоимость и срок дополнительных работ становятся обязательными для Сторон.</w:t>
-      </w:r>
-    </w:p>
-    <w:p>
-      <w:pPr>
-        <w:jc w:val="both"/>
-      </w:pPr>
-      <w:r>
-        <w:rPr>
-          <w:b w:val="0"/>
-          <w:i w:val="0"/>
-        </w:rPr>
-        <w:t xml:space="preserve">6.7. Дополнительные работы оплачиваются в порядке, указанном в дополнении к Спецификации (по умолчанию — в размере </w:t>
-      </w:r>
-      <w:r>
-        <w:rPr>
-          <w:b w:val="0"/>
-          <w:i w:val="0"/>
-        </w:rPr>
-        <w:t>[100]</w:t>
-      </w:r>
-      <w:r>
-        <w:rPr>
-          <w:b w:val="0"/>
-          <w:i w:val="0"/>
-        </w:rPr>
-        <w:t xml:space="preserve"> % до начала их выполнения). Срок изготовления и монтажа продлевается на время, необходимое для выполнения дополнительных работ. Работы, выполненные по просьбе Заказчика без согласования их стоимости, оплачиваются по расчёту Исполнителя на основании пункта 6.5.</w:t>
+        <w:t>5.5. Риск случайной гибели или повреждения Изделия до подписания акта приёмки несёт Исполнитель, после подписания — Заказчик.</w:t>
       </w:r>
     </w:p>
     <w:p>
@@ -1017,7 +917,7 @@
           <w:b/>
           <w:i w:val="0"/>
         </w:rPr>
-        <w:t>7. Гарантия</w:t>
+        <w:t>6. Изменение Спецификации</w:t>
       </w:r>
     </w:p>
     <w:p>
@@ -1029,7 +929,7 @@
           <w:b w:val="0"/>
           <w:i w:val="0"/>
         </w:rPr>
-        <w:t>7.1. Гарантийный срок на Изделие и монтаж — 12 (двенадцать) месяцев со дня подписания акта приёмки. На фурнитуру, встраиваемую технику, мойки, смесители и иные комплектующие сторонних производителей действует гарантия производителя в пределах установленного им срока.</w:t>
+        <w:t>6.1. Изменения в Спецификацию вносятся только по согласию обеих Сторон в письменной форме. Допускается подтверждение изменений перепиской в Telegram с контактов, указанных в реквизитах настоящего договора.</w:t>
       </w:r>
     </w:p>
     <w:p>
@@ -1041,7 +941,7 @@
           <w:b w:val="0"/>
           <w:i w:val="0"/>
         </w:rPr>
-        <w:t>7.2. Гарантия распространяется на дефекты материалов, изготовления и монтажа, проявившиеся при условии правильной эксплуатации: расслоение и отклеивание кромки, перекосы и неровности фасадов, дефекты крепления и сборки, неисправности фурнитуры в пределах гарантии её производителя.</w:t>
+        <w:t>6.2. После запуска Изделия в производство и раскроя материалов изменения могут быть невозможны или оплачиваются Заказчиком дополнительно; при этом сроки изготовления переносятся.</w:t>
       </w:r>
     </w:p>
     <w:p>
@@ -1053,7 +953,7 @@
           <w:b w:val="0"/>
           <w:i w:val="0"/>
         </w:rPr>
-        <w:t>7.3. Гарантия не распространяется на: естественный износ; механические повреждения (удары, царапины, сколы); повреждения от влаги — протечек, постоянной сырости, пара, неправильной уборки, попадания воды на кромку и в стыки; воздействие высокой температуры (горячая посуда, открытый огонь, пар) на фасады, кромку и столешницу; перегрузку полок и ящиков; выгорание и изменение цвета под прямыми солнечными лучами; самостоятельный ремонт, разборку или перемещение Изделия; повреждения при подключении техники и сантехники третьими лицами; незначительные отличия цвета и текстуры материалов; отклонения в пределах 5 мм по пункту 4.3; недостатки, оговорённые в акте приёмки; обстоятельства непреодолимой силы.</w:t>
+        <w:t>6.3. Если изменения влекут изменение цены, Стороны фиксируют новую цену в Спецификации до внесения изменений.</w:t>
       </w:r>
     </w:p>
     <w:p>
@@ -1065,35 +965,7 @@
           <w:b w:val="0"/>
           <w:i w:val="0"/>
         </w:rPr>
-        <w:t xml:space="preserve">7.4. Заявку на устранение недостатка Заказчик направляет Исполнителю по телефону или в мессенджер с описанием и фотографиями. Исполнитель осматривает Изделие в течение </w:t>
-      </w:r>
-      <w:r>
-        <w:rPr>
-          <w:b w:val="0"/>
-          <w:i w:val="0"/>
-        </w:rPr>
-        <w:t>[5]</w:t>
-      </w:r>
-      <w:r>
-        <w:rPr>
-          <w:b w:val="0"/>
-          <w:i w:val="0"/>
-        </w:rPr>
-        <w:t xml:space="preserve"> рабочих дней и устраняет признанные гарантийными недостатки в течение </w:t>
-      </w:r>
-      <w:r>
-        <w:rPr>
-          <w:b w:val="0"/>
-          <w:i w:val="0"/>
-        </w:rPr>
-        <w:t>[14]</w:t>
-      </w:r>
-      <w:r>
-        <w:rPr>
-          <w:b w:val="0"/>
-          <w:i w:val="0"/>
-        </w:rPr>
-        <w:t xml:space="preserve"> рабочих дней, если для этого не требуется заказ материалов, который требует больше времени.</w:t>
+        <w:t>6.4. Дополнительные работы. Если после подписания Спецификации Заказчик пожелает получить что-либо сверх согласованного (дополнительные или изменённые изделия, элементы, материалы, фурнитуру, подсветку, работы по монтажу и т. п.), такие работы выполняются только после их согласования и оплачиваются Заказчиком дополнительно, сверх цены, указанной в пункте 2.1.</w:t>
       </w:r>
     </w:p>
     <w:p>
@@ -1105,7 +977,45 @@
           <w:b w:val="0"/>
           <w:i w:val="0"/>
         </w:rPr>
-        <w:t>7.5. Рекомендации по эксплуатации приведены в Приложении № 3.</w:t>
+        <w:t>6.5. Стоимость дополнительных работ определяется Исполнителем расчётом по фактической стоимости материалов, фурнитуры, работ и доставки и сообщается Заказчику до начала их выполнения. Расчёт Исполнителя является окончательным и не подлежит торгу или пересмотру: Заказчик либо принимает расчёт, либо отказывается от дополнительных работ.</w:t>
+      </w:r>
+    </w:p>
+    <w:p>
+      <w:pPr>
+        <w:jc w:val="both"/>
+      </w:pPr>
+      <w:r>
+        <w:rPr>
+          <w:b w:val="0"/>
+          <w:i w:val="0"/>
+        </w:rPr>
+        <w:t>6.6. Если Заказчик отказывается от дополнительных работ, договор исполняется в объёме действующей Спецификации на прежних условиях. Если Заказчик принимает расчёт, это подтверждается письменно (в том числе сообщением в Telegram по пункту 6.1) либо подписанием дополнения к Спецификации, после чего стоимость и срок дополнительных работ становятся обязательными для Сторон.</w:t>
+      </w:r>
+    </w:p>
+    <w:p>
+      <w:pPr>
+        <w:jc w:val="both"/>
+      </w:pPr>
+      <w:r>
+        <w:rPr>
+          <w:b w:val="0"/>
+          <w:i w:val="0"/>
+        </w:rPr>
+        <w:t xml:space="preserve">6.7. Дополнительные работы оплачиваются в порядке, указанном в дополнении к Спецификации (по умолчанию — в размере </w:t>
+      </w:r>
+      <w:r>
+        <w:rPr>
+          <w:b w:val="0"/>
+          <w:i w:val="0"/>
+        </w:rPr>
+        <w:t>[100]</w:t>
+      </w:r>
+      <w:r>
+        <w:rPr>
+          <w:b w:val="0"/>
+          <w:i w:val="0"/>
+        </w:rPr>
+        <w:t xml:space="preserve"> % до начала их выполнения). Срок изготовления и монтажа продлевается на время, необходимое для выполнения дополнительных работ. Работы, выполненные по просьбе Заказчика без согласования их стоимости, оплачиваются по расчёту Исполнителя на основании пункта 6.5.</w:t>
       </w:r>
     </w:p>
     <w:p>
@@ -1119,7 +1029,7 @@
           <w:b/>
           <w:i w:val="0"/>
         </w:rPr>
-        <w:t>8. Расторжение договора</w:t>
+        <w:t>7. Гарантия</w:t>
       </w:r>
     </w:p>
     <w:p>
@@ -1131,7 +1041,7 @@
           <w:b w:val="0"/>
           <w:i w:val="0"/>
         </w:rPr>
-        <w:t>8.1. Договор может быть расторгнут по соглашению Сторон.</w:t>
+        <w:t>7.1. Гарантийный срок на Изделие и монтаж — 12 (двенадцать) месяцев со дня подписания акта приёмки. На фурнитуру, встраиваемую технику, мойки, смесители и иные комплектующие сторонних производителей действует гарантия производителя в пределах установленного им срока.</w:t>
       </w:r>
     </w:p>
     <w:p>
@@ -1143,7 +1053,7 @@
           <w:b w:val="0"/>
           <w:i w:val="0"/>
         </w:rPr>
-        <w:t>8.2. Заказчик вправе отказаться от договора в любое время. В случае отказа по инициативе Заказчика предоплата (70 % стоимости по пункту 2.2) возврату не подлежит и остаётся у Исполнителя в счёт компенсации расходов на замер, проект, закупленные материалы и фурнитуру, изготовленные детали, резервирование производственных мощностей и иных убытков, поскольку Изделие изготавливается по индивидуальным размерам и не может быть продано другому лицу. Если фактически понесённые Исполнителем расходы и выполненная часть работ превышают сумму предоплаты, Заказчик оплачивает разницу.</w:t>
+        <w:t>7.2. Гарантия распространяется на дефекты материалов, изготовления и монтажа, проявившиеся при условии правильной эксплуатации: расслоение и отклеивание кромки, перекосы и неровности фасадов, дефекты крепления и сборки, неисправности фурнитуры в пределах гарантии её производителя.</w:t>
       </w:r>
     </w:p>
     <w:p>
@@ -1155,21 +1065,7 @@
           <w:b w:val="0"/>
           <w:i w:val="0"/>
         </w:rPr>
-        <w:t xml:space="preserve">8.3. Исполнитель вправе отказаться от договора при существенном нарушении его условий Заказчиком (неоплата, отсутствие доступа на объект более </w:t>
-      </w:r>
-      <w:r>
-        <w:rPr>
-          <w:b w:val="0"/>
-          <w:i w:val="0"/>
-        </w:rPr>
-        <w:t>____</w:t>
-      </w:r>
-      <w:r>
-        <w:rPr>
-          <w:b w:val="0"/>
-          <w:i w:val="0"/>
-        </w:rPr>
-        <w:t xml:space="preserve"> дней), письменно уведомив Заказчика. В этом случае предоплата остаётся у Исполнителя на условиях пункта 8.2.</w:t>
+        <w:t>7.3. Гарантия не распространяется на: естественный износ; механические повреждения (удары, царапины, сколы); повреждения от влаги — протечек, постоянной сырости, пара, неправильной уборки, попадания воды на кромку и в стыки; воздействие высокой температуры (горячая посуда, открытый огонь, пар) на фасады, кромку и столешницу; перегрузку полок и ящиков; выгорание и изменение цвета под прямыми солнечными лучами; самостоятельный ремонт, разборку или перемещение Изделия; повреждения при подключении техники и сантехники третьими лицами; незначительные отличия цвета и текстуры материалов; отклонения в пределах 5 мм по пункту 4.3; недостатки, оговорённые в акте приёмки; обстоятельства непреодолимой силы.</w:t>
       </w:r>
     </w:p>
     <w:p>
@@ -1181,35 +1077,47 @@
           <w:b w:val="0"/>
           <w:i w:val="0"/>
         </w:rPr>
-        <w:t xml:space="preserve">8.4. Если договор расторгнут по вине Исполнителя (нарушение срока более чем на </w:t>
+        <w:t xml:space="preserve">7.4. Заявку на устранение недостатка Заказчик направляет Исполнителю по телефону или в мессенджер с описанием и фотографиями. Исполнитель осматривает Изделие в течение </w:t>
       </w:r>
       <w:r>
         <w:rPr>
           <w:b w:val="0"/>
           <w:i w:val="0"/>
         </w:rPr>
-        <w:t>[30]</w:t>
+        <w:t>[5]</w:t>
       </w:r>
       <w:r>
         <w:rPr>
           <w:b w:val="0"/>
           <w:i w:val="0"/>
         </w:rPr>
-        <w:t xml:space="preserve"> дней, отказ от исполнения), предоплата возвращается Заказчику полностью в течение </w:t>
+        <w:t xml:space="preserve"> рабочих дней и устраняет признанные гарантийными недостатки в течение </w:t>
       </w:r>
       <w:r>
         <w:rPr>
           <w:b w:val="0"/>
           <w:i w:val="0"/>
         </w:rPr>
-        <w:t>[10]</w:t>
+        <w:t>[14]</w:t>
       </w:r>
       <w:r>
         <w:rPr>
           <w:b w:val="0"/>
           <w:i w:val="0"/>
         </w:rPr>
-        <w:t xml:space="preserve"> рабочих дней со дня расторжения договора.</w:t>
+        <w:t xml:space="preserve"> рабочих дней, если для этого не требуется заказ материалов, который требует больше времени.</w:t>
+      </w:r>
+    </w:p>
+    <w:p>
+      <w:pPr>
+        <w:jc w:val="both"/>
+      </w:pPr>
+      <w:r>
+        <w:rPr>
+          <w:b w:val="0"/>
+          <w:i w:val="0"/>
+        </w:rPr>
+        <w:t>7.5. Рекомендации по эксплуатации приведены в Приложении № 3.</w:t>
       </w:r>
     </w:p>
     <w:p>
@@ -1223,7 +1131,7 @@
           <w:b/>
           <w:i w:val="0"/>
         </w:rPr>
-        <w:t>9. Ответственность Сторон</w:t>
+        <w:t>8. Расторжение договора</w:t>
       </w:r>
     </w:p>
     <w:p>
@@ -1235,7 +1143,7 @@
           <w:b w:val="0"/>
           <w:i w:val="0"/>
         </w:rPr>
-        <w:t>9.1. За неисполнение или ненадлежащее исполнение обязательств Стороны несут ответственность в соответствии с законодательством Республики Узбекистан и настоящим договором.</w:t>
+        <w:t>8.1. Договор может быть расторгнут по соглашению Сторон.</w:t>
       </w:r>
     </w:p>
     <w:p>
@@ -1247,35 +1155,7 @@
           <w:b w:val="0"/>
           <w:i w:val="0"/>
         </w:rPr>
-        <w:t xml:space="preserve">9.2. При просрочке оплаты Заказчик уплачивает неустойку в размере </w:t>
-      </w:r>
-      <w:r>
-        <w:rPr>
-          <w:b w:val="0"/>
-          <w:i w:val="0"/>
-        </w:rPr>
-        <w:t>[0,1]</w:t>
-      </w:r>
-      <w:r>
-        <w:rPr>
-          <w:b w:val="0"/>
-          <w:i w:val="0"/>
-        </w:rPr>
-        <w:t xml:space="preserve"> % от неоплаченной суммы за каждый день просрочки, но не более </w:t>
-      </w:r>
-      <w:r>
-        <w:rPr>
-          <w:b w:val="0"/>
-          <w:i w:val="0"/>
-        </w:rPr>
-        <w:t>[10]</w:t>
-      </w:r>
-      <w:r>
-        <w:rPr>
-          <w:b w:val="0"/>
-          <w:i w:val="0"/>
-        </w:rPr>
-        <w:t xml:space="preserve"> % от неё.</w:t>
+        <w:t>8.2. Заказчик вправе отказаться от договора в любое время. В случае отказа по инициативе Заказчика предоплата (70 % стоимости по пункту 2.2) возврату не подлежит и остаётся у Исполнителя в счёт компенсации расходов на замер, проект, закупленные материалы и фурнитуру, изготовленные детали, резервирование производственных мощностей и иных убытков, поскольку Изделие изготавливается по индивидуальным размерам и не может быть продано другому лицу. Если фактически понесённые Исполнителем расходы и выполненная часть работ превышают сумму предоплаты, Заказчик оплачивает разницу.</w:t>
       </w:r>
     </w:p>
     <w:p>
@@ -1287,7 +1167,21 @@
           <w:b w:val="0"/>
           <w:i w:val="0"/>
         </w:rPr>
-        <w:t>9.3. Исполнитель не отвечает за: ущерб, вызванный неточными размерами и данными, предоставленными Заказчиком; повреждение скрытых коммуникаций, о которых Заказчик не сообщил; состояние стен, полов и потолков; задержки по вине Заказчика; подключение техники и сантехники третьими лицами.</w:t>
+        <w:t xml:space="preserve">8.3. Исполнитель вправе отказаться от договора при существенном нарушении его условий Заказчиком (неоплата, отсутствие доступа на объект более </w:t>
+      </w:r>
+      <w:r>
+        <w:rPr>
+          <w:b w:val="0"/>
+          <w:i w:val="0"/>
+        </w:rPr>
+        <w:t>____</w:t>
+      </w:r>
+      <w:r>
+        <w:rPr>
+          <w:b w:val="0"/>
+          <w:i w:val="0"/>
+        </w:rPr>
+        <w:t xml:space="preserve"> дней), письменно уведомив Заказчика. В этом случае предоплата остаётся у Исполнителя на условиях пункта 8.2.</w:t>
       </w:r>
     </w:p>
     <w:p>
@@ -1299,7 +1193,35 @@
           <w:b w:val="0"/>
           <w:i w:val="0"/>
         </w:rPr>
-        <w:t>9.4. В пределах, допускаемых законодательством, ответственность Исполнителя не может превышать стоимость Изделия.</w:t>
+        <w:t xml:space="preserve">8.4. Если договор расторгнут по вине Исполнителя (нарушение срока более чем на </w:t>
+      </w:r>
+      <w:r>
+        <w:rPr>
+          <w:b w:val="0"/>
+          <w:i w:val="0"/>
+        </w:rPr>
+        <w:t>[30]</w:t>
+      </w:r>
+      <w:r>
+        <w:rPr>
+          <w:b w:val="0"/>
+          <w:i w:val="0"/>
+        </w:rPr>
+        <w:t xml:space="preserve"> дней, отказ от исполнения), предоплата возвращается Заказчику полностью в течение </w:t>
+      </w:r>
+      <w:r>
+        <w:rPr>
+          <w:b w:val="0"/>
+          <w:i w:val="0"/>
+        </w:rPr>
+        <w:t>[10]</w:t>
+      </w:r>
+      <w:r>
+        <w:rPr>
+          <w:b w:val="0"/>
+          <w:i w:val="0"/>
+        </w:rPr>
+        <w:t xml:space="preserve"> рабочих дней со дня расторжения договора.</w:t>
       </w:r>
     </w:p>
     <w:p>
@@ -1313,7 +1235,7 @@
           <w:b/>
           <w:i w:val="0"/>
         </w:rPr>
-        <w:t>10. Обстоятельства непреодолимой силы</w:t>
+        <w:t>9. Ответственность Сторон</w:t>
       </w:r>
     </w:p>
     <w:p>
@@ -1325,7 +1247,7 @@
           <w:b w:val="0"/>
           <w:i w:val="0"/>
         </w:rPr>
-        <w:t>10.1. Стороны освобождаются от ответственности за неисполнение обязательств, вызванное обстоятельствами непреодолимой силы (стихийные бедствия, военные действия, акты органов власти, эпидемии, перебои в поставках материалов по причинам, которые Стороны не могли предвидеть и предотвратить). Срок исполнения продлевается на период их действия.</w:t>
+        <w:t>9.1. За неисполнение или ненадлежащее исполнение обязательств Стороны несут ответственность в соответствии с законодательством Республики Узбекистан и настоящим договором.</w:t>
       </w:r>
     </w:p>
     <w:p>
@@ -1337,21 +1259,59 @@
           <w:b w:val="0"/>
           <w:i w:val="0"/>
         </w:rPr>
-        <w:t xml:space="preserve">10.2. Если такие обстоятельства продолжаются более </w:t>
+        <w:t xml:space="preserve">9.2. При просрочке оплаты Заказчик уплачивает неустойку в размере </w:t>
       </w:r>
       <w:r>
         <w:rPr>
           <w:b w:val="0"/>
           <w:i w:val="0"/>
         </w:rPr>
-        <w:t>[30]</w:t>
+        <w:t>[0,1]</w:t>
       </w:r>
       <w:r>
         <w:rPr>
           <w:b w:val="0"/>
           <w:i w:val="0"/>
         </w:rPr>
-        <w:t xml:space="preserve"> дней, любая из Сторон вправе расторгнуть договор с взаиморасчётами: предоплата возвращается за вычетом фактически понесённых Исполнителем расходов.</w:t>
+        <w:t xml:space="preserve"> % от неоплаченной суммы за каждый день просрочки, но не более </w:t>
+      </w:r>
+      <w:r>
+        <w:rPr>
+          <w:b w:val="0"/>
+          <w:i w:val="0"/>
+        </w:rPr>
+        <w:t>[10]</w:t>
+      </w:r>
+      <w:r>
+        <w:rPr>
+          <w:b w:val="0"/>
+          <w:i w:val="0"/>
+        </w:rPr>
+        <w:t xml:space="preserve"> % от неё.</w:t>
+      </w:r>
+    </w:p>
+    <w:p>
+      <w:pPr>
+        <w:jc w:val="both"/>
+      </w:pPr>
+      <w:r>
+        <w:rPr>
+          <w:b w:val="0"/>
+          <w:i w:val="0"/>
+        </w:rPr>
+        <w:t>9.3. Исполнитель не отвечает за: ущерб, вызванный неточными размерами и данными, предоставленными Заказчиком; повреждение скрытых коммуникаций, о которых Заказчик не сообщил; состояние стен, полов и потолков; задержки по вине Заказчика; подключение техники и сантехники третьими лицами.</w:t>
+      </w:r>
+    </w:p>
+    <w:p>
+      <w:pPr>
+        <w:jc w:val="both"/>
+      </w:pPr>
+      <w:r>
+        <w:rPr>
+          <w:b w:val="0"/>
+          <w:i w:val="0"/>
+        </w:rPr>
+        <w:t>9.4. В пределах, допускаемых законодательством, ответственность Исполнителя не может превышать стоимость Изделия.</w:t>
       </w:r>
     </w:p>
     <w:p>
@@ -1365,7 +1325,7 @@
           <w:b/>
           <w:i w:val="0"/>
         </w:rPr>
-        <w:t>11. Разрешение споров</w:t>
+        <w:t>10. Обстоятельства непреодолимой силы</w:t>
       </w:r>
     </w:p>
     <w:p>
@@ -1377,21 +1337,7 @@
           <w:b w:val="0"/>
           <w:i w:val="0"/>
         </w:rPr>
-        <w:t xml:space="preserve">11.1. Споры решаются путём переговоров. Претензия направляется в письменной форме (в том числе в мессенджер с контактов, указанных в реквизитах); ответ даётся в течение </w:t>
-      </w:r>
-      <w:r>
-        <w:rPr>
-          <w:b w:val="0"/>
-          <w:i w:val="0"/>
-        </w:rPr>
-        <w:t>[10]</w:t>
-      </w:r>
-      <w:r>
-        <w:rPr>
-          <w:b w:val="0"/>
-          <w:i w:val="0"/>
-        </w:rPr>
-        <w:t xml:space="preserve"> календарных дней.</w:t>
+        <w:t>10.1. Стороны освобождаются от ответственности за неисполнение обязательств, вызванное обстоятельствами непреодолимой силы (стихийные бедствия, военные действия, акты органов власти, эпидемии, перебои в поставках материалов по причинам, которые Стороны не могли предвидеть и предотвратить). Срок исполнения продлевается на период их действия.</w:t>
       </w:r>
     </w:p>
     <w:p>
@@ -1403,7 +1349,21 @@
           <w:b w:val="0"/>
           <w:i w:val="0"/>
         </w:rPr>
-        <w:t>11.2. Если соглашение не достигнуто, спор рассматривается в суде в соответствии с законодательством Республики Узбекистан.</w:t>
+        <w:t xml:space="preserve">10.2. Если такие обстоятельства продолжаются более </w:t>
+      </w:r>
+      <w:r>
+        <w:rPr>
+          <w:b w:val="0"/>
+          <w:i w:val="0"/>
+        </w:rPr>
+        <w:t>[30]</w:t>
+      </w:r>
+      <w:r>
+        <w:rPr>
+          <w:b w:val="0"/>
+          <w:i w:val="0"/>
+        </w:rPr>
+        <w:t xml:space="preserve"> дней, любая из Сторон вправе расторгнуть договор с взаиморасчётами: предоплата возвращается за вычетом фактически понесённых Исполнителем расходов.</w:t>
       </w:r>
     </w:p>
     <w:p>
@@ -1417,7 +1377,7 @@
           <w:b/>
           <w:i w:val="0"/>
         </w:rPr>
-        <w:t>12. Персональные данные и фотографии</w:t>
+        <w:t>11. Разрешение споров</w:t>
       </w:r>
     </w:p>
     <w:p>
@@ -1429,7 +1389,21 @@
           <w:b w:val="0"/>
           <w:i w:val="0"/>
         </w:rPr>
-        <w:t>12.1. Заказчик даёт согласие на обработку своих персональных данных (ФИО, паспортные данные, адрес, телефон) в целях исполнения настоящего договора в соответствии с законодательством Республики Узбекистан о персональных данных. Согласие может быть отозвано Заказчиком в порядке, установленном законодательством.</w:t>
+        <w:t xml:space="preserve">11.1. Споры решаются путём переговоров. Претензия направляется в письменной форме (в том числе в мессенджер с контактов, указанных в реквизитах); ответ даётся в течение </w:t>
+      </w:r>
+      <w:r>
+        <w:rPr>
+          <w:b w:val="0"/>
+          <w:i w:val="0"/>
+        </w:rPr>
+        <w:t>[10]</w:t>
+      </w:r>
+      <w:r>
+        <w:rPr>
+          <w:b w:val="0"/>
+          <w:i w:val="0"/>
+        </w:rPr>
+        <w:t xml:space="preserve"> календарных дней.</w:t>
       </w:r>
     </w:p>
     <w:p>
@@ -1441,35 +1415,7 @@
           <w:b w:val="0"/>
           <w:i w:val="0"/>
         </w:rPr>
-        <w:t xml:space="preserve">12.2. Использование фотографий готового Изделия в портфолио и рекламе Исполнителя: Заказчик  </w:t>
-      </w:r>
-      <w:r>
-        <w:rPr>
-          <w:b w:val="0"/>
-          <w:i w:val="0"/>
-        </w:rPr>
-        <w:t>____</w:t>
-      </w:r>
-      <w:r>
-        <w:rPr>
-          <w:b w:val="0"/>
-          <w:i w:val="0"/>
-        </w:rPr>
-        <w:t xml:space="preserve"> согласен  </w:t>
-      </w:r>
-      <w:r>
-        <w:rPr>
-          <w:b w:val="0"/>
-          <w:i w:val="0"/>
-        </w:rPr>
-        <w:t>____</w:t>
-      </w:r>
-      <w:r>
-        <w:rPr>
-          <w:b w:val="0"/>
-          <w:i w:val="0"/>
-        </w:rPr>
-        <w:t xml:space="preserve"> не согласен.</w:t>
+        <w:t>11.2. Если соглашение не достигнуто, спор рассматривается в суде в соответствии с законодательством Республики Узбекистан.</w:t>
       </w:r>
     </w:p>
     <w:p>
@@ -1483,7 +1429,7 @@
           <w:b/>
           <w:i w:val="0"/>
         </w:rPr>
-        <w:t>13. Заключительные положения</w:t>
+        <w:t>12. Персональные данные и фотографии</w:t>
       </w:r>
     </w:p>
     <w:p>
@@ -1495,7 +1441,7 @@
           <w:b w:val="0"/>
           <w:i w:val="0"/>
         </w:rPr>
-        <w:t>13.1. Договор вступает в силу со дня подписания и действует до полного исполнения Сторонами обязательств.</w:t>
+        <w:t>12.1. Заказчик даёт согласие на обработку своих персональных данных (ФИО, паспортные данные, адрес, телефон) в целях исполнения настоящего договора в соответствии с законодательством Республики Узбекистан о персональных данных. Согласие может быть отозвано Заказчиком в порядке, установленном законодательством.</w:t>
       </w:r>
     </w:p>
     <w:p>
@@ -1507,7 +1453,49 @@
           <w:b w:val="0"/>
           <w:i w:val="0"/>
         </w:rPr>
-        <w:t>13.2. Договор составлен в двух экземплярах на русском языке, по одному для каждой Стороны, имеющих одинаковую юридическую силу. Изменения и дополнения действительны, если составлены в письменной форме и подписаны обеими Сторонами либо подтверждены в порядке пункта 6.1.</w:t>
+        <w:t xml:space="preserve">12.2. Использование фотографий готового Изделия в портфолио и рекламе Исполнителя: Заказчик  </w:t>
+      </w:r>
+      <w:r>
+        <w:rPr>
+          <w:b w:val="0"/>
+          <w:i w:val="0"/>
+        </w:rPr>
+        <w:t>____</w:t>
+      </w:r>
+      <w:r>
+        <w:rPr>
+          <w:b w:val="0"/>
+          <w:i w:val="0"/>
+        </w:rPr>
+        <w:t xml:space="preserve"> согласен  </w:t>
+      </w:r>
+      <w:r>
+        <w:rPr>
+          <w:b w:val="0"/>
+          <w:i w:val="0"/>
+        </w:rPr>
+        <w:t>____</w:t>
+      </w:r>
+      <w:r>
+        <w:rPr>
+          <w:b w:val="0"/>
+          <w:i w:val="0"/>
+        </w:rPr>
+        <w:t xml:space="preserve"> не согласен.</w:t>
+      </w:r>
+    </w:p>
+    <w:p>
+      <w:pPr>
+        <w:keepNext/>
+        <w:spacing w:before="200" w:after="80"/>
+        <w:jc w:val="center"/>
+      </w:pPr>
+      <w:r>
+        <w:rPr>
+          <w:b/>
+          <w:i w:val="0"/>
+        </w:rPr>
+        <w:t>13. Заключительные положения</w:t>
       </w:r>
     </w:p>
     <w:p>
@@ -1519,7 +1507,7 @@
           <w:b w:val="0"/>
           <w:i w:val="0"/>
         </w:rPr>
-        <w:t>13.3. Если какое-либо условие договора противоречит обязательным нормам законодательства Республики Узбекистан (в том числе о защите прав потребителей), применяются эти нормы; остальные условия договора сохраняют силу.</w:t>
+        <w:t>13.1. Договор вступает в силу со дня подписания и действует до полного исполнения Сторонами обязательств.</w:t>
       </w:r>
     </w:p>
     <w:p>
@@ -1531,7 +1519,31 @@
           <w:b w:val="0"/>
           <w:i w:val="0"/>
         </w:rPr>
-        <w:t>13.4. Приложения: № 1 — Спецификация; № 2 — Акт приёмки выполненных работ; № 3 — Рекомендации по эксплуатации.</w:t>
+        <w:t>13.2. Договор составлен в двух экземплярах на русском языке, по одному для каждой Стороны, имеющих одинаковую юридическую силу. Изменения и дополнения действительны, если составлены в письменной форме и подписаны обеими Сторонами либо подтверждены в порядке пункта 6.1.</w:t>
+      </w:r>
+    </w:p>
+    <w:p>
+      <w:pPr>
+        <w:jc w:val="both"/>
+      </w:pPr>
+      <w:r>
+        <w:rPr>
+          <w:b w:val="0"/>
+          <w:i w:val="0"/>
+        </w:rPr>
+        <w:t>13.3. Если какое-либо условие договора противоречит обязательным нормам законодательства Республики Узбекистан (в том числе о защите прав потребителей), применяются эти нормы; остальные условия договора сохраняют силу.</w:t>
+      </w:r>
+    </w:p>
+    <w:p>
+      <w:pPr>
+        <w:jc w:val="both"/>
+      </w:pPr>
+      <w:r>
+        <w:rPr>
+          <w:b w:val="0"/>
+          <w:i w:val="0"/>
+        </w:rPr>
+        <w:t>13.4. Приложения: № 1 — Спецификация; № 2 — Акт приёмки выполненных работ; № 3 — Рекомендации по эксплуатации; № 4 — Соглашение о рассрочке (если оплата в рассрочку).</w:t>
       </w:r>
     </w:p>
     <w:p>
@@ -4143,6 +4155,1189 @@
         <w:t>7. Поддерживайте в помещении нормальную влажность (40–60 %) и избегайте резких перепадов температуры.</w:t>
       </w:r>
     </w:p>
+    <w:p>
+      <w:r>
+        <w:br w:type="page"/>
+      </w:r>
+    </w:p>
+    <w:p>
+      <w:pPr>
+        <w:spacing w:before="80" w:after="40"/>
+        <w:jc w:val="center"/>
+      </w:pPr>
+      <w:r>
+        <w:rPr>
+          <w:b/>
+          <w:i w:val="0"/>
+          <w:sz w:val="28"/>
+        </w:rPr>
+        <w:t>Приложение № 4</w:t>
+      </w:r>
+    </w:p>
+    <w:p>
+      <w:pPr>
+        <w:spacing w:after="160"/>
+        <w:jc w:val="center"/>
+      </w:pPr>
+      <w:r>
+        <w:rPr>
+          <w:b/>
+          <w:i w:val="0"/>
+        </w:rPr>
+        <w:t xml:space="preserve">СОГЛАШЕНИЕ О РАССРОЧКЕ к договору № </w:t>
+      </w:r>
+      <w:r>
+        <w:rPr>
+          <w:b/>
+          <w:i w:val="0"/>
+        </w:rPr>
+        <w:t>____________</w:t>
+      </w:r>
+      <w:r>
+        <w:rPr>
+          <w:b/>
+          <w:i w:val="0"/>
+        </w:rPr>
+        <w:t xml:space="preserve"> от «</w:t>
+      </w:r>
+      <w:r>
+        <w:rPr>
+          <w:b/>
+          <w:i w:val="0"/>
+        </w:rPr>
+        <w:t>____</w:t>
+      </w:r>
+      <w:r>
+        <w:rPr>
+          <w:b/>
+          <w:i w:val="0"/>
+        </w:rPr>
+        <w:t xml:space="preserve">» </w:t>
+      </w:r>
+      <w:r>
+        <w:rPr>
+          <w:b/>
+          <w:i w:val="0"/>
+        </w:rPr>
+        <w:t>____________</w:t>
+      </w:r>
+      <w:r>
+        <w:rPr>
+          <w:b/>
+          <w:i w:val="0"/>
+        </w:rPr>
+        <w:t xml:space="preserve"> 20</w:t>
+      </w:r>
+      <w:r>
+        <w:rPr>
+          <w:b/>
+          <w:i w:val="0"/>
+        </w:rPr>
+        <w:t>____</w:t>
+      </w:r>
+      <w:r>
+        <w:rPr>
+          <w:b/>
+          <w:i w:val="0"/>
+        </w:rPr>
+        <w:t xml:space="preserve"> г.</w:t>
+      </w:r>
+    </w:p>
+    <w:p>
+      <w:pPr>
+        <w:spacing w:after="160"/>
+      </w:pPr>
+      <w:r>
+        <w:rPr>
+          <w:b w:val="0"/>
+          <w:i/>
+          <w:sz w:val="19"/>
+        </w:rPr>
+        <w:t>Оформляется, только если часть стоимости оплачивается в рассрочку. В калькуляторе на сайте график платежей рассчитывается автоматически.</w:t>
+      </w:r>
+    </w:p>
+    <w:p>
+      <w:pPr>
+        <w:jc w:val="both"/>
+      </w:pPr>
+      <w:r>
+        <w:rPr>
+          <w:b w:val="0"/>
+          <w:i w:val="0"/>
+        </w:rPr>
+        <w:t xml:space="preserve">1. Общая стоимость Изделия по договору составляет </w:t>
+      </w:r>
+      <w:r>
+        <w:rPr>
+          <w:b w:val="0"/>
+          <w:i w:val="0"/>
+        </w:rPr>
+        <w:t>____________</w:t>
+      </w:r>
+      <w:r>
+        <w:rPr>
+          <w:b w:val="0"/>
+          <w:i w:val="0"/>
+        </w:rPr>
+        <w:t xml:space="preserve"> </w:t>
+      </w:r>
+      <w:r>
+        <w:rPr>
+          <w:b w:val="0"/>
+          <w:i/>
+          <w:sz w:val="14"/>
+        </w:rPr>
+        <w:t xml:space="preserve"> (сумма прописью)</w:t>
+      </w:r>
+      <w:r>
+        <w:rPr>
+          <w:b w:val="0"/>
+          <w:i w:val="0"/>
+        </w:rPr>
+        <w:t xml:space="preserve"> сум.</w:t>
+      </w:r>
+    </w:p>
+    <w:p>
+      <w:pPr>
+        <w:jc w:val="both"/>
+      </w:pPr>
+      <w:r>
+        <w:rPr>
+          <w:b w:val="0"/>
+          <w:i w:val="0"/>
+        </w:rPr>
+        <w:t xml:space="preserve">2. Предоплата — </w:t>
+      </w:r>
+      <w:r>
+        <w:rPr>
+          <w:b w:val="0"/>
+          <w:i w:val="0"/>
+        </w:rPr>
+        <w:t>____</w:t>
+      </w:r>
+      <w:r>
+        <w:rPr>
+          <w:b w:val="0"/>
+          <w:i w:val="0"/>
+        </w:rPr>
+        <w:t xml:space="preserve"> % (</w:t>
+      </w:r>
+      <w:r>
+        <w:rPr>
+          <w:b w:val="0"/>
+          <w:i w:val="0"/>
+        </w:rPr>
+        <w:t>____________</w:t>
+      </w:r>
+      <w:r>
+        <w:rPr>
+          <w:b w:val="0"/>
+          <w:i w:val="0"/>
+        </w:rPr>
+        <w:t xml:space="preserve"> сум) — вносится в день подписания договора. Оставшаяся сумма — </w:t>
+      </w:r>
+      <w:r>
+        <w:rPr>
+          <w:b w:val="0"/>
+          <w:i w:val="0"/>
+        </w:rPr>
+        <w:t>____________</w:t>
+      </w:r>
+      <w:r>
+        <w:rPr>
+          <w:b w:val="0"/>
+          <w:i w:val="0"/>
+        </w:rPr>
+        <w:t xml:space="preserve"> сум — оплачивается в рассрочку на </w:t>
+      </w:r>
+      <w:r>
+        <w:rPr>
+          <w:b w:val="0"/>
+          <w:i w:val="0"/>
+        </w:rPr>
+        <w:t>____</w:t>
+      </w:r>
+      <w:r>
+        <w:rPr>
+          <w:b w:val="0"/>
+          <w:i w:val="0"/>
+        </w:rPr>
+        <w:t xml:space="preserve"> мес. равными платежами по графику ниже, без процентов. Заказчик вправе погасить рассрочку досрочно полностью или частично.</w:t>
+      </w:r>
+    </w:p>
+    <w:tbl>
+      <w:tblPr>
+        <w:tblStyle w:val="TableGrid"/>
+        <w:tblW w:type="auto" w:w="0"/>
+        <w:jc w:val="center"/>
+        <w:tblLayout w:type="fixed"/>
+        <w:tblLook w:firstColumn="1" w:firstRow="1" w:lastColumn="0" w:lastRow="0" w:noHBand="0" w:noVBand="1" w:val="04A0"/>
+      </w:tblPr>
+      <w:tblGrid>
+        <w:gridCol w:w="2409"/>
+        <w:gridCol w:w="2409"/>
+        <w:gridCol w:w="2409"/>
+        <w:gridCol w:w="2409"/>
+      </w:tblGrid>
+      <w:tr>
+        <w:tc>
+          <w:tcPr>
+            <w:tcW w:type="dxa" w:w="1361"/>
+          </w:tcPr>
+          <w:p>
+            <w:pPr>
+              <w:spacing w:after="40" w:before="40"/>
+            </w:pPr>
+            <w:r/>
+            <w:r>
+              <w:rPr>
+                <w:b/>
+                <w:i w:val="0"/>
+                <w:sz w:val="20"/>
+              </w:rPr>
+              <w:t>№ платежа</w:t>
+            </w:r>
+          </w:p>
+        </w:tc>
+        <w:tc>
+          <w:tcPr>
+            <w:tcW w:type="dxa" w:w="2608"/>
+          </w:tcPr>
+          <w:p>
+            <w:pPr>
+              <w:spacing w:after="40" w:before="40"/>
+            </w:pPr>
+            <w:r/>
+            <w:r>
+              <w:rPr>
+                <w:b/>
+                <w:i w:val="0"/>
+                <w:sz w:val="20"/>
+              </w:rPr>
+              <w:t>Оплатить не позднее</w:t>
+            </w:r>
+          </w:p>
+        </w:tc>
+        <w:tc>
+          <w:tcPr>
+            <w:tcW w:type="dxa" w:w="2835"/>
+          </w:tcPr>
+          <w:p>
+            <w:pPr>
+              <w:spacing w:after="40" w:before="40"/>
+            </w:pPr>
+            <w:r/>
+            <w:r>
+              <w:rPr>
+                <w:b/>
+                <w:i w:val="0"/>
+                <w:sz w:val="20"/>
+              </w:rPr>
+              <w:t>Сумма, сум</w:t>
+            </w:r>
+          </w:p>
+        </w:tc>
+        <w:tc>
+          <w:tcPr>
+            <w:tcW w:type="dxa" w:w="2835"/>
+          </w:tcPr>
+          <w:p>
+            <w:pPr>
+              <w:spacing w:after="40" w:before="40"/>
+            </w:pPr>
+            <w:r/>
+            <w:r>
+              <w:rPr>
+                <w:b/>
+                <w:i w:val="0"/>
+                <w:sz w:val="20"/>
+              </w:rPr>
+              <w:t>Остаток после платежа, сум</w:t>
+            </w:r>
+          </w:p>
+        </w:tc>
+      </w:tr>
+      <w:tr>
+        <w:tc>
+          <w:tcPr>
+            <w:tcW w:type="dxa" w:w="1361"/>
+          </w:tcPr>
+          <w:p>
+            <w:pPr>
+              <w:spacing w:after="40" w:before="40"/>
+            </w:pPr>
+            <w:r/>
+            <w:r>
+              <w:rPr>
+                <w:b w:val="0"/>
+                <w:i w:val="0"/>
+                <w:sz w:val="20"/>
+              </w:rPr>
+              <w:t>1</w:t>
+            </w:r>
+          </w:p>
+        </w:tc>
+        <w:tc>
+          <w:tcPr>
+            <w:tcW w:type="dxa" w:w="2608"/>
+          </w:tcPr>
+          <w:p>
+            <w:pPr>
+              <w:spacing w:after="40" w:before="40"/>
+            </w:pPr>
+            <w:r/>
+          </w:p>
+        </w:tc>
+        <w:tc>
+          <w:tcPr>
+            <w:tcW w:type="dxa" w:w="2835"/>
+          </w:tcPr>
+          <w:p>
+            <w:pPr>
+              <w:spacing w:after="40" w:before="40"/>
+            </w:pPr>
+            <w:r/>
+          </w:p>
+        </w:tc>
+        <w:tc>
+          <w:tcPr>
+            <w:tcW w:type="dxa" w:w="2835"/>
+          </w:tcPr>
+          <w:p>
+            <w:pPr>
+              <w:spacing w:after="40" w:before="40"/>
+            </w:pPr>
+            <w:r/>
+          </w:p>
+        </w:tc>
+      </w:tr>
+      <w:tr>
+        <w:tc>
+          <w:tcPr>
+            <w:tcW w:type="dxa" w:w="1361"/>
+          </w:tcPr>
+          <w:p>
+            <w:pPr>
+              <w:spacing w:after="40" w:before="40"/>
+            </w:pPr>
+            <w:r/>
+            <w:r>
+              <w:rPr>
+                <w:b w:val="0"/>
+                <w:i w:val="0"/>
+                <w:sz w:val="20"/>
+              </w:rPr>
+              <w:t>2</w:t>
+            </w:r>
+          </w:p>
+        </w:tc>
+        <w:tc>
+          <w:tcPr>
+            <w:tcW w:type="dxa" w:w="2608"/>
+          </w:tcPr>
+          <w:p>
+            <w:pPr>
+              <w:spacing w:after="40" w:before="40"/>
+            </w:pPr>
+            <w:r/>
+          </w:p>
+        </w:tc>
+        <w:tc>
+          <w:tcPr>
+            <w:tcW w:type="dxa" w:w="2835"/>
+          </w:tcPr>
+          <w:p>
+            <w:pPr>
+              <w:spacing w:after="40" w:before="40"/>
+            </w:pPr>
+            <w:r/>
+          </w:p>
+        </w:tc>
+        <w:tc>
+          <w:tcPr>
+            <w:tcW w:type="dxa" w:w="2835"/>
+          </w:tcPr>
+          <w:p>
+            <w:pPr>
+              <w:spacing w:after="40" w:before="40"/>
+            </w:pPr>
+            <w:r/>
+          </w:p>
+        </w:tc>
+      </w:tr>
+      <w:tr>
+        <w:tc>
+          <w:tcPr>
+            <w:tcW w:type="dxa" w:w="1361"/>
+          </w:tcPr>
+          <w:p>
+            <w:pPr>
+              <w:spacing w:after="40" w:before="40"/>
+            </w:pPr>
+            <w:r/>
+            <w:r>
+              <w:rPr>
+                <w:b w:val="0"/>
+                <w:i w:val="0"/>
+                <w:sz w:val="20"/>
+              </w:rPr>
+              <w:t>3</w:t>
+            </w:r>
+          </w:p>
+        </w:tc>
+        <w:tc>
+          <w:tcPr>
+            <w:tcW w:type="dxa" w:w="2608"/>
+          </w:tcPr>
+          <w:p>
+            <w:pPr>
+              <w:spacing w:after="40" w:before="40"/>
+            </w:pPr>
+            <w:r/>
+          </w:p>
+        </w:tc>
+        <w:tc>
+          <w:tcPr>
+            <w:tcW w:type="dxa" w:w="2835"/>
+          </w:tcPr>
+          <w:p>
+            <w:pPr>
+              <w:spacing w:after="40" w:before="40"/>
+            </w:pPr>
+            <w:r/>
+          </w:p>
+        </w:tc>
+        <w:tc>
+          <w:tcPr>
+            <w:tcW w:type="dxa" w:w="2835"/>
+          </w:tcPr>
+          <w:p>
+            <w:pPr>
+              <w:spacing w:after="40" w:before="40"/>
+            </w:pPr>
+            <w:r/>
+          </w:p>
+        </w:tc>
+      </w:tr>
+      <w:tr>
+        <w:tc>
+          <w:tcPr>
+            <w:tcW w:type="dxa" w:w="1361"/>
+          </w:tcPr>
+          <w:p>
+            <w:pPr>
+              <w:spacing w:after="40" w:before="40"/>
+            </w:pPr>
+            <w:r/>
+            <w:r>
+              <w:rPr>
+                <w:b w:val="0"/>
+                <w:i w:val="0"/>
+                <w:sz w:val="20"/>
+              </w:rPr>
+              <w:t>4</w:t>
+            </w:r>
+          </w:p>
+        </w:tc>
+        <w:tc>
+          <w:tcPr>
+            <w:tcW w:type="dxa" w:w="2608"/>
+          </w:tcPr>
+          <w:p>
+            <w:pPr>
+              <w:spacing w:after="40" w:before="40"/>
+            </w:pPr>
+            <w:r/>
+          </w:p>
+        </w:tc>
+        <w:tc>
+          <w:tcPr>
+            <w:tcW w:type="dxa" w:w="2835"/>
+          </w:tcPr>
+          <w:p>
+            <w:pPr>
+              <w:spacing w:after="40" w:before="40"/>
+            </w:pPr>
+            <w:r/>
+          </w:p>
+        </w:tc>
+        <w:tc>
+          <w:tcPr>
+            <w:tcW w:type="dxa" w:w="2835"/>
+          </w:tcPr>
+          <w:p>
+            <w:pPr>
+              <w:spacing w:after="40" w:before="40"/>
+            </w:pPr>
+            <w:r/>
+          </w:p>
+        </w:tc>
+      </w:tr>
+      <w:tr>
+        <w:tc>
+          <w:tcPr>
+            <w:tcW w:type="dxa" w:w="1361"/>
+          </w:tcPr>
+          <w:p>
+            <w:pPr>
+              <w:spacing w:after="40" w:before="40"/>
+            </w:pPr>
+            <w:r/>
+            <w:r>
+              <w:rPr>
+                <w:b w:val="0"/>
+                <w:i w:val="0"/>
+                <w:sz w:val="20"/>
+              </w:rPr>
+              <w:t>5</w:t>
+            </w:r>
+          </w:p>
+        </w:tc>
+        <w:tc>
+          <w:tcPr>
+            <w:tcW w:type="dxa" w:w="2608"/>
+          </w:tcPr>
+          <w:p>
+            <w:pPr>
+              <w:spacing w:after="40" w:before="40"/>
+            </w:pPr>
+            <w:r/>
+          </w:p>
+        </w:tc>
+        <w:tc>
+          <w:tcPr>
+            <w:tcW w:type="dxa" w:w="2835"/>
+          </w:tcPr>
+          <w:p>
+            <w:pPr>
+              <w:spacing w:after="40" w:before="40"/>
+            </w:pPr>
+            <w:r/>
+          </w:p>
+        </w:tc>
+        <w:tc>
+          <w:tcPr>
+            <w:tcW w:type="dxa" w:w="2835"/>
+          </w:tcPr>
+          <w:p>
+            <w:pPr>
+              <w:spacing w:after="40" w:before="40"/>
+            </w:pPr>
+            <w:r/>
+          </w:p>
+        </w:tc>
+      </w:tr>
+      <w:tr>
+        <w:tc>
+          <w:tcPr>
+            <w:tcW w:type="dxa" w:w="1361"/>
+          </w:tcPr>
+          <w:p>
+            <w:pPr>
+              <w:spacing w:after="40" w:before="40"/>
+            </w:pPr>
+            <w:r/>
+            <w:r>
+              <w:rPr>
+                <w:b w:val="0"/>
+                <w:i w:val="0"/>
+                <w:sz w:val="20"/>
+              </w:rPr>
+              <w:t>6</w:t>
+            </w:r>
+          </w:p>
+        </w:tc>
+        <w:tc>
+          <w:tcPr>
+            <w:tcW w:type="dxa" w:w="2608"/>
+          </w:tcPr>
+          <w:p>
+            <w:pPr>
+              <w:spacing w:after="40" w:before="40"/>
+            </w:pPr>
+            <w:r/>
+          </w:p>
+        </w:tc>
+        <w:tc>
+          <w:tcPr>
+            <w:tcW w:type="dxa" w:w="2835"/>
+          </w:tcPr>
+          <w:p>
+            <w:pPr>
+              <w:spacing w:after="40" w:before="40"/>
+            </w:pPr>
+            <w:r/>
+          </w:p>
+        </w:tc>
+        <w:tc>
+          <w:tcPr>
+            <w:tcW w:type="dxa" w:w="2835"/>
+          </w:tcPr>
+          <w:p>
+            <w:pPr>
+              <w:spacing w:after="40" w:before="40"/>
+            </w:pPr>
+            <w:r/>
+          </w:p>
+        </w:tc>
+      </w:tr>
+    </w:tbl>
+    <w:p>
+      <w:pPr>
+        <w:spacing w:after="40"/>
+      </w:pPr>
+    </w:p>
+    <w:p>
+      <w:pPr>
+        <w:jc w:val="both"/>
+      </w:pPr>
+      <w:r>
+        <w:rPr>
+          <w:b w:val="0"/>
+          <w:i w:val="0"/>
+        </w:rPr>
+        <w:t xml:space="preserve">3. Каждый платёж подтверждается чеком, банковским переводом с назначением «оплата по договору № </w:t>
+      </w:r>
+      <w:r>
+        <w:rPr>
+          <w:b w:val="0"/>
+          <w:i w:val="0"/>
+        </w:rPr>
+        <w:t>________</w:t>
+      </w:r>
+      <w:r>
+        <w:rPr>
+          <w:b w:val="0"/>
+          <w:i w:val="0"/>
+        </w:rPr>
+        <w:t>» или распиской Исполнителя с указанием даты и суммы.</w:t>
+      </w:r>
+    </w:p>
+    <w:p>
+      <w:pPr>
+        <w:jc w:val="both"/>
+      </w:pPr>
+      <w:r>
+        <w:rPr>
+          <w:b w:val="0"/>
+          <w:i w:val="0"/>
+        </w:rPr>
+        <w:t>4. До полной оплаты стоимости Изделие остаётся собственностью Исполнителя; право собственности переходит к Заказчику в день внесения последнего платежа. Риск случайной гибели и повреждения Изделия несёт Заказчик с момента подписания акта приёмки (Приложение № 2). До полной оплаты Заказчик не вправе продавать, дарить, сдавать в залог или иным образом распоряжаться Изделием.</w:t>
+      </w:r>
+    </w:p>
+    <w:p>
+      <w:pPr>
+        <w:jc w:val="both"/>
+      </w:pPr>
+      <w:r>
+        <w:rPr>
+          <w:b w:val="0"/>
+          <w:i w:val="0"/>
+        </w:rPr>
+        <w:t xml:space="preserve">5. При просрочке очередного платежа Заказчик уплачивает пеню в размере </w:t>
+      </w:r>
+      <w:r>
+        <w:rPr>
+          <w:b w:val="0"/>
+          <w:i w:val="0"/>
+        </w:rPr>
+        <w:t>[0,1]</w:t>
+      </w:r>
+      <w:r>
+        <w:rPr>
+          <w:b w:val="0"/>
+          <w:i w:val="0"/>
+        </w:rPr>
+        <w:t xml:space="preserve"> % от просроченной суммы за каждый день просрочки, но не более </w:t>
+      </w:r>
+      <w:r>
+        <w:rPr>
+          <w:b w:val="0"/>
+          <w:i w:val="0"/>
+        </w:rPr>
+        <w:t>[10]</w:t>
+      </w:r>
+      <w:r>
+        <w:rPr>
+          <w:b w:val="0"/>
+          <w:i w:val="0"/>
+        </w:rPr>
+        <w:t xml:space="preserve"> % от неё.</w:t>
+      </w:r>
+    </w:p>
+    <w:p>
+      <w:pPr>
+        <w:jc w:val="both"/>
+      </w:pPr>
+      <w:r>
+        <w:rPr>
+          <w:b w:val="0"/>
+          <w:i w:val="0"/>
+        </w:rPr>
+        <w:t xml:space="preserve">6. Если Заказчик просрочил платёж более чем на </w:t>
+      </w:r>
+      <w:r>
+        <w:rPr>
+          <w:b w:val="0"/>
+          <w:i w:val="0"/>
+        </w:rPr>
+        <w:t>[30]</w:t>
+      </w:r>
+      <w:r>
+        <w:rPr>
+          <w:b w:val="0"/>
+          <w:i w:val="0"/>
+        </w:rPr>
+        <w:t xml:space="preserve"> дней или пропустил два платежа подряд, Исполнитель вправе потребовать досрочной оплаты всей оставшейся суммы, письменно уведомив Заказчика. Заказчик обязан оплатить её в течение </w:t>
+      </w:r>
+      <w:r>
+        <w:rPr>
+          <w:b w:val="0"/>
+          <w:i w:val="0"/>
+        </w:rPr>
+        <w:t>[10]</w:t>
+      </w:r>
+      <w:r>
+        <w:rPr>
+          <w:b w:val="0"/>
+          <w:i w:val="0"/>
+        </w:rPr>
+        <w:t xml:space="preserve"> дней со дня получения уведомления. При неоплате Исполнитель вправе потребовать возврата Изделия в соответствии с законодательством Республики Узбекистан; полученные платежи в этом случае засчитываются в счёт стоимости работ, демонтажа, износа Изделия и убытков Исполнителя.</w:t>
+      </w:r>
+    </w:p>
+    <w:p>
+      <w:pPr>
+        <w:jc w:val="both"/>
+      </w:pPr>
+      <w:r>
+        <w:rPr>
+          <w:b w:val="0"/>
+          <w:i w:val="0"/>
+        </w:rPr>
+        <w:t xml:space="preserve">7. Заказчик обязан в течение </w:t>
+      </w:r>
+      <w:r>
+        <w:rPr>
+          <w:b w:val="0"/>
+          <w:i w:val="0"/>
+        </w:rPr>
+        <w:t>[3]</w:t>
+      </w:r>
+      <w:r>
+        <w:rPr>
+          <w:b w:val="0"/>
+          <w:i w:val="0"/>
+        </w:rPr>
+        <w:t xml:space="preserve"> дней сообщить Исполнителю об изменении номера телефона, адреса проживания или места работы. Сообщения по телефону, в Telegram и письма по адресу, указанному в договоре, считаются надлежащим уведомлением.</w:t>
+      </w:r>
+    </w:p>
+    <w:p>
+      <w:pPr>
+        <w:jc w:val="both"/>
+      </w:pPr>
+      <w:r>
+        <w:rPr>
+          <w:b w:val="0"/>
+          <w:i w:val="0"/>
+        </w:rPr>
+        <w:t xml:space="preserve">8. Поручитель (при наличии): </w:t>
+      </w:r>
+      <w:r>
+        <w:rPr>
+          <w:b w:val="0"/>
+          <w:i w:val="0"/>
+        </w:rPr>
+        <w:t>________________</w:t>
+      </w:r>
+      <w:r>
+        <w:rPr>
+          <w:b w:val="0"/>
+          <w:i/>
+          <w:sz w:val="14"/>
+        </w:rPr>
+        <w:t xml:space="preserve"> (ФИО Поручителя)</w:t>
+      </w:r>
+      <w:r>
+        <w:rPr>
+          <w:b w:val="0"/>
+          <w:i w:val="0"/>
+        </w:rPr>
+        <w:t xml:space="preserve">, паспорт </w:t>
+      </w:r>
+      <w:r>
+        <w:rPr>
+          <w:b w:val="0"/>
+          <w:i w:val="0"/>
+        </w:rPr>
+        <w:t>________________</w:t>
+      </w:r>
+      <w:r>
+        <w:rPr>
+          <w:b w:val="0"/>
+          <w:i/>
+          <w:sz w:val="14"/>
+        </w:rPr>
+        <w:t xml:space="preserve"> (серия и номер)</w:t>
+      </w:r>
+      <w:r>
+        <w:rPr>
+          <w:b w:val="0"/>
+          <w:i w:val="0"/>
+        </w:rPr>
+        <w:t xml:space="preserve">, выдан </w:t>
+      </w:r>
+      <w:r>
+        <w:rPr>
+          <w:b w:val="0"/>
+          <w:i w:val="0"/>
+        </w:rPr>
+        <w:t>________________</w:t>
+      </w:r>
+      <w:r>
+        <w:rPr>
+          <w:b w:val="0"/>
+          <w:i/>
+          <w:sz w:val="14"/>
+        </w:rPr>
+        <w:t xml:space="preserve"> (кем и когда)</w:t>
+      </w:r>
+      <w:r>
+        <w:rPr>
+          <w:b w:val="0"/>
+          <w:i w:val="0"/>
+        </w:rPr>
+        <w:t xml:space="preserve">, адрес: </w:t>
+      </w:r>
+      <w:r>
+        <w:rPr>
+          <w:b w:val="0"/>
+          <w:i w:val="0"/>
+        </w:rPr>
+        <w:t>________________</w:t>
+      </w:r>
+      <w:r>
+        <w:rPr>
+          <w:b w:val="0"/>
+          <w:i/>
+          <w:sz w:val="14"/>
+        </w:rPr>
+        <w:t xml:space="preserve"> (адрес)</w:t>
+      </w:r>
+      <w:r>
+        <w:rPr>
+          <w:b w:val="0"/>
+          <w:i w:val="0"/>
+        </w:rPr>
+        <w:t xml:space="preserve">, телефон: </w:t>
+      </w:r>
+      <w:r>
+        <w:rPr>
+          <w:b w:val="0"/>
+          <w:i w:val="0"/>
+        </w:rPr>
+        <w:t>____________</w:t>
+      </w:r>
+      <w:r>
+        <w:rPr>
+          <w:b w:val="0"/>
+          <w:i w:val="0"/>
+        </w:rPr>
+        <w:t>. Поручитель отвечает перед Исполнителем солидарно с Заказчиком за оплату всей суммы рассрочки, пени и расходов на взыскание долга.</w:t>
+      </w:r>
+    </w:p>
+    <w:p>
+      <w:pPr>
+        <w:jc w:val="both"/>
+      </w:pPr>
+      <w:r>
+        <w:rPr>
+          <w:b w:val="0"/>
+          <w:i w:val="0"/>
+        </w:rPr>
+        <w:t>9. Заказчик подтверждает, что ознакомлен с графиком платежей, согласен с ним и что сумма рассрочки посильна для него. Копия паспорта (ID-карты) Заказчика и Поручителя прилагается.</w:t>
+      </w:r>
+    </w:p>
+    <w:tbl>
+      <w:tblPr>
+        <w:tblStyle w:val="TableGrid"/>
+        <w:tblW w:type="auto" w:w="0"/>
+        <w:jc w:val="center"/>
+        <w:tblLayout w:type="fixed"/>
+        <w:tblLook w:firstColumn="1" w:firstRow="1" w:lastColumn="0" w:lastRow="0" w:noHBand="0" w:noVBand="1" w:val="04A0"/>
+      </w:tblPr>
+      <w:tblGrid>
+        <w:gridCol w:w="3213"/>
+        <w:gridCol w:w="3213"/>
+        <w:gridCol w:w="3213"/>
+      </w:tblGrid>
+      <w:tr>
+        <w:tc>
+          <w:tcPr>
+            <w:tcW w:type="dxa" w:w="3231"/>
+          </w:tcPr>
+          <w:p>
+            <w:pPr>
+              <w:spacing w:after="40" w:before="40"/>
+            </w:pPr>
+            <w:r/>
+            <w:r>
+              <w:rPr>
+                <w:b/>
+                <w:i w:val="0"/>
+                <w:sz w:val="20"/>
+              </w:rPr>
+              <w:t>Исполнитель</w:t>
+            </w:r>
+          </w:p>
+        </w:tc>
+        <w:tc>
+          <w:tcPr>
+            <w:tcW w:type="dxa" w:w="3231"/>
+          </w:tcPr>
+          <w:p>
+            <w:pPr>
+              <w:spacing w:after="40" w:before="40"/>
+            </w:pPr>
+            <w:r/>
+            <w:r>
+              <w:rPr>
+                <w:b/>
+                <w:i w:val="0"/>
+                <w:sz w:val="20"/>
+              </w:rPr>
+              <w:t>Заказчик</w:t>
+            </w:r>
+          </w:p>
+        </w:tc>
+        <w:tc>
+          <w:tcPr>
+            <w:tcW w:type="dxa" w:w="3175"/>
+          </w:tcPr>
+          <w:p>
+            <w:pPr>
+              <w:spacing w:after="40" w:before="40"/>
+            </w:pPr>
+            <w:r/>
+            <w:r>
+              <w:rPr>
+                <w:b/>
+                <w:i w:val="0"/>
+                <w:sz w:val="20"/>
+              </w:rPr>
+              <w:t>Поручитель (при наличии)</w:t>
+            </w:r>
+          </w:p>
+        </w:tc>
+      </w:tr>
+      <w:tr>
+        <w:tc>
+          <w:tcPr>
+            <w:tcW w:type="dxa" w:w="3231"/>
+          </w:tcPr>
+          <w:p>
+            <w:pPr>
+              <w:spacing w:after="40" w:before="40"/>
+            </w:pPr>
+            <w:r/>
+            <w:r>
+              <w:rPr>
+                <w:b w:val="0"/>
+                <w:i w:val="0"/>
+                <w:sz w:val="20"/>
+              </w:rPr>
+              <w:t xml:space="preserve">Подпись: </w:t>
+            </w:r>
+            <w:r>
+              <w:rPr>
+                <w:b w:val="0"/>
+                <w:i w:val="0"/>
+                <w:sz w:val="20"/>
+              </w:rPr>
+              <w:t>___________</w:t>
+            </w:r>
+            <w:r>
+              <w:rPr>
+                <w:b w:val="0"/>
+                <w:i/>
+                <w:sz w:val="14"/>
+              </w:rPr>
+              <w:t xml:space="preserve"> (подпись)</w:t>
+            </w:r>
+            <w:r>
+              <w:rPr>
+                <w:b w:val="0"/>
+                <w:i w:val="0"/>
+                <w:sz w:val="20"/>
+              </w:rPr>
+              <w:t xml:space="preserve"> / </w:t>
+            </w:r>
+            <w:r>
+              <w:rPr>
+                <w:b w:val="0"/>
+                <w:i w:val="0"/>
+                <w:sz w:val="20"/>
+              </w:rPr>
+              <w:t>________________</w:t>
+            </w:r>
+            <w:r>
+              <w:rPr>
+                <w:b w:val="0"/>
+                <w:i/>
+                <w:sz w:val="14"/>
+              </w:rPr>
+              <w:t xml:space="preserve"> (ФИО Исполнителя)</w:t>
+            </w:r>
+            <w:r>
+              <w:rPr>
+                <w:b w:val="0"/>
+                <w:i w:val="0"/>
+                <w:sz w:val="20"/>
+              </w:rPr>
+              <w:t xml:space="preserve"> /</w:t>
+            </w:r>
+          </w:p>
+        </w:tc>
+        <w:tc>
+          <w:tcPr>
+            <w:tcW w:type="dxa" w:w="3231"/>
+          </w:tcPr>
+          <w:p>
+            <w:pPr>
+              <w:spacing w:after="40" w:before="40"/>
+            </w:pPr>
+            <w:r/>
+            <w:r>
+              <w:rPr>
+                <w:b w:val="0"/>
+                <w:i w:val="0"/>
+                <w:sz w:val="20"/>
+              </w:rPr>
+              <w:t xml:space="preserve">Подпись: </w:t>
+            </w:r>
+            <w:r>
+              <w:rPr>
+                <w:b w:val="0"/>
+                <w:i w:val="0"/>
+                <w:sz w:val="20"/>
+              </w:rPr>
+              <w:t>___________</w:t>
+            </w:r>
+            <w:r>
+              <w:rPr>
+                <w:b w:val="0"/>
+                <w:i/>
+                <w:sz w:val="14"/>
+              </w:rPr>
+              <w:t xml:space="preserve"> (подпись)</w:t>
+            </w:r>
+            <w:r>
+              <w:rPr>
+                <w:b w:val="0"/>
+                <w:i w:val="0"/>
+                <w:sz w:val="20"/>
+              </w:rPr>
+              <w:t xml:space="preserve"> / </w:t>
+            </w:r>
+            <w:r>
+              <w:rPr>
+                <w:b w:val="0"/>
+                <w:i w:val="0"/>
+                <w:sz w:val="20"/>
+              </w:rPr>
+              <w:t>________________</w:t>
+            </w:r>
+            <w:r>
+              <w:rPr>
+                <w:b w:val="0"/>
+                <w:i/>
+                <w:sz w:val="14"/>
+              </w:rPr>
+              <w:t xml:space="preserve"> (ФИО Заказчика)</w:t>
+            </w:r>
+            <w:r>
+              <w:rPr>
+                <w:b w:val="0"/>
+                <w:i w:val="0"/>
+                <w:sz w:val="20"/>
+              </w:rPr>
+              <w:t xml:space="preserve"> /</w:t>
+            </w:r>
+          </w:p>
+        </w:tc>
+        <w:tc>
+          <w:tcPr>
+            <w:tcW w:type="dxa" w:w="3175"/>
+          </w:tcPr>
+          <w:p>
+            <w:pPr>
+              <w:spacing w:after="40" w:before="40"/>
+            </w:pPr>
+            <w:r/>
+            <w:r>
+              <w:rPr>
+                <w:b w:val="0"/>
+                <w:i w:val="0"/>
+                <w:sz w:val="20"/>
+              </w:rPr>
+              <w:t xml:space="preserve">Подпись: </w:t>
+            </w:r>
+            <w:r>
+              <w:rPr>
+                <w:b w:val="0"/>
+                <w:i w:val="0"/>
+                <w:sz w:val="20"/>
+              </w:rPr>
+              <w:t>___________</w:t>
+            </w:r>
+            <w:r>
+              <w:rPr>
+                <w:b w:val="0"/>
+                <w:i/>
+                <w:sz w:val="14"/>
+              </w:rPr>
+              <w:t xml:space="preserve"> (подпись)</w:t>
+            </w:r>
+            <w:r>
+              <w:rPr>
+                <w:b w:val="0"/>
+                <w:i w:val="0"/>
+                <w:sz w:val="20"/>
+              </w:rPr>
+              <w:t xml:space="preserve"> / </w:t>
+            </w:r>
+            <w:r>
+              <w:rPr>
+                <w:b w:val="0"/>
+                <w:i w:val="0"/>
+                <w:sz w:val="20"/>
+              </w:rPr>
+              <w:t>________________</w:t>
+            </w:r>
+            <w:r>
+              <w:rPr>
+                <w:b w:val="0"/>
+                <w:i/>
+                <w:sz w:val="14"/>
+              </w:rPr>
+              <w:t xml:space="preserve"> (ФИО Поручителя)</w:t>
+            </w:r>
+            <w:r>
+              <w:rPr>
+                <w:b w:val="0"/>
+                <w:i w:val="0"/>
+                <w:sz w:val="20"/>
+              </w:rPr>
+              <w:t xml:space="preserve"> /</w:t>
+            </w:r>
+          </w:p>
+        </w:tc>
+      </w:tr>
+    </w:tbl>
+    <w:p>
+      <w:pPr>
+        <w:spacing w:after="40"/>
+      </w:pPr>
+    </w:p>
     <w:sectPr>
       <w:footerReference w:type="default" r:id="rId9"/>
       <w:pgSz w:w="11906" w:h="16838"/>

</xml_diff>

<commit_message>
Contract: remove all client penalties (clause 9.2 and installment late fee)
Co-Authored-By: Claude Opus 5.5 <noreply@anthropic.com>
Claude-Session: https://claude.ai/code/session_01WtuytnVMHWD8pV9nnEoMmS
</commit_message>
<xml_diff>
--- a/static/docs/dogovor-mebel.docx
+++ b/static/docs/dogovor-mebel.docx
@@ -1259,35 +1259,7 @@
           <w:b w:val="0"/>
           <w:i w:val="0"/>
         </w:rPr>
-        <w:t xml:space="preserve">9.2. При просрочке оплаты Заказчик уплачивает неустойку в размере </w:t>
-      </w:r>
-      <w:r>
-        <w:rPr>
-          <w:b w:val="0"/>
-          <w:i w:val="0"/>
-        </w:rPr>
-        <w:t>[0,1]</w:t>
-      </w:r>
-      <w:r>
-        <w:rPr>
-          <w:b w:val="0"/>
-          <w:i w:val="0"/>
-        </w:rPr>
-        <w:t xml:space="preserve"> % от неоплаченной суммы за каждый день просрочки, но не более </w:t>
-      </w:r>
-      <w:r>
-        <w:rPr>
-          <w:b w:val="0"/>
-          <w:i w:val="0"/>
-        </w:rPr>
-        <w:t>[10]</w:t>
-      </w:r>
-      <w:r>
-        <w:rPr>
-          <w:b w:val="0"/>
-          <w:i w:val="0"/>
-        </w:rPr>
-        <w:t xml:space="preserve"> % от неё.</w:t>
+        <w:t>9.2. Исполнитель не отвечает за: ущерб, вызванный неточными размерами и данными, предоставленными Заказчиком; повреждение скрытых коммуникаций, о которых Заказчик не сообщил; состояние стен, полов и потолков; задержки по вине Заказчика; подключение техники и сантехники третьими лицами.</w:t>
       </w:r>
     </w:p>
     <w:p>
@@ -1299,19 +1271,7 @@
           <w:b w:val="0"/>
           <w:i w:val="0"/>
         </w:rPr>
-        <w:t>9.3. Исполнитель не отвечает за: ущерб, вызванный неточными размерами и данными, предоставленными Заказчиком; повреждение скрытых коммуникаций, о которых Заказчик не сообщил; состояние стен, полов и потолков; задержки по вине Заказчика; подключение техники и сантехники третьими лицами.</w:t>
-      </w:r>
-    </w:p>
-    <w:p>
-      <w:pPr>
-        <w:jc w:val="both"/>
-      </w:pPr>
-      <w:r>
-        <w:rPr>
-          <w:b w:val="0"/>
-          <w:i w:val="0"/>
-        </w:rPr>
-        <w:t>9.4. В пределах, допускаемых законодательством, ответственность Исполнителя не может превышать стоимость Изделия.</w:t>
+        <w:t>9.3. В пределах, допускаемых законодательством, ответственность Исполнителя не может превышать стоимость Изделия.</w:t>
       </w:r>
     </w:p>
     <w:p>
@@ -4834,21 +4794,21 @@
           <w:b w:val="0"/>
           <w:i w:val="0"/>
         </w:rPr>
-        <w:t xml:space="preserve">5. При просрочке очередного платежа Заказчик уплачивает пеню в размере </w:t>
+        <w:t xml:space="preserve">5. Если Заказчик просрочил платёж более чем на </w:t>
       </w:r>
       <w:r>
         <w:rPr>
           <w:b w:val="0"/>
           <w:i w:val="0"/>
         </w:rPr>
-        <w:t>[0,1]</w:t>
+        <w:t>[30]</w:t>
       </w:r>
       <w:r>
         <w:rPr>
           <w:b w:val="0"/>
           <w:i w:val="0"/>
         </w:rPr>
-        <w:t xml:space="preserve"> % от просроченной суммы за каждый день просрочки, но не более </w:t>
+        <w:t xml:space="preserve"> дней или пропустил два платежа подряд, Исполнитель вправе потребовать досрочной оплаты всей оставшейся суммы, письменно уведомив Заказчика. Заказчик обязан оплатить её в течение </w:t>
       </w:r>
       <w:r>
         <w:rPr>
@@ -4862,7 +4822,7 @@
           <w:b w:val="0"/>
           <w:i w:val="0"/>
         </w:rPr>
-        <w:t xml:space="preserve"> % от неё.</w:t>
+        <w:t xml:space="preserve"> дней со дня получения уведомления. При неоплате Исполнитель вправе потребовать возврата Изделия в соответствии с законодательством Республики Узбекистан; полученные платежи в этом случае засчитываются в счёт стоимости работ, демонтажа, износа Изделия и убытков Исполнителя.</w:t>
       </w:r>
     </w:p>
     <w:p>
@@ -4874,35 +4834,21 @@
           <w:b w:val="0"/>
           <w:i w:val="0"/>
         </w:rPr>
-        <w:t xml:space="preserve">6. Если Заказчик просрочил платёж более чем на </w:t>
+        <w:t xml:space="preserve">6. Заказчик обязан в течение </w:t>
       </w:r>
       <w:r>
         <w:rPr>
           <w:b w:val="0"/>
           <w:i w:val="0"/>
         </w:rPr>
-        <w:t>[30]</w:t>
+        <w:t>[3]</w:t>
       </w:r>
       <w:r>
         <w:rPr>
           <w:b w:val="0"/>
           <w:i w:val="0"/>
         </w:rPr>
-        <w:t xml:space="preserve"> дней или пропустил два платежа подряд, Исполнитель вправе потребовать досрочной оплаты всей оставшейся суммы, письменно уведомив Заказчика. Заказчик обязан оплатить её в течение </w:t>
-      </w:r>
-      <w:r>
-        <w:rPr>
-          <w:b w:val="0"/>
-          <w:i w:val="0"/>
-        </w:rPr>
-        <w:t>[10]</w:t>
-      </w:r>
-      <w:r>
-        <w:rPr>
-          <w:b w:val="0"/>
-          <w:i w:val="0"/>
-        </w:rPr>
-        <w:t xml:space="preserve"> дней со дня получения уведомления. При неоплате Исполнитель вправе потребовать возврата Изделия в соответствии с законодательством Республики Узбекистан; полученные платежи в этом случае засчитываются в счёт стоимости работ, демонтажа, износа Изделия и убытков Исполнителя.</w:t>
+        <w:t xml:space="preserve"> дней сообщить Исполнителю об изменении номера телефона, адреса проживания или места работы. Сообщения по телефону, в Telegram и письма по адресу, указанному в договоре, считаются надлежащим уведомлением.</w:t>
       </w:r>
     </w:p>
     <w:p>
@@ -4914,21 +4860,109 @@
           <w:b w:val="0"/>
           <w:i w:val="0"/>
         </w:rPr>
-        <w:t xml:space="preserve">7. Заказчик обязан в течение </w:t>
+        <w:t xml:space="preserve">7. Поручитель (при наличии): </w:t>
       </w:r>
       <w:r>
         <w:rPr>
           <w:b w:val="0"/>
           <w:i w:val="0"/>
         </w:rPr>
-        <w:t>[3]</w:t>
+        <w:t>________________</w:t>
+      </w:r>
+      <w:r>
+        <w:rPr>
+          <w:b w:val="0"/>
+          <w:i/>
+          <w:sz w:val="14"/>
+        </w:rPr>
+        <w:t xml:space="preserve"> (ФИО Поручителя)</w:t>
       </w:r>
       <w:r>
         <w:rPr>
           <w:b w:val="0"/>
           <w:i w:val="0"/>
         </w:rPr>
-        <w:t xml:space="preserve"> дней сообщить Исполнителю об изменении номера телефона, адреса проживания или места работы. Сообщения по телефону, в Telegram и письма по адресу, указанному в договоре, считаются надлежащим уведомлением.</w:t>
+        <w:t xml:space="preserve">, паспорт </w:t>
+      </w:r>
+      <w:r>
+        <w:rPr>
+          <w:b w:val="0"/>
+          <w:i w:val="0"/>
+        </w:rPr>
+        <w:t>________________</w:t>
+      </w:r>
+      <w:r>
+        <w:rPr>
+          <w:b w:val="0"/>
+          <w:i/>
+          <w:sz w:val="14"/>
+        </w:rPr>
+        <w:t xml:space="preserve"> (серия и номер)</w:t>
+      </w:r>
+      <w:r>
+        <w:rPr>
+          <w:b w:val="0"/>
+          <w:i w:val="0"/>
+        </w:rPr>
+        <w:t xml:space="preserve">, выдан </w:t>
+      </w:r>
+      <w:r>
+        <w:rPr>
+          <w:b w:val="0"/>
+          <w:i w:val="0"/>
+        </w:rPr>
+        <w:t>________________</w:t>
+      </w:r>
+      <w:r>
+        <w:rPr>
+          <w:b w:val="0"/>
+          <w:i/>
+          <w:sz w:val="14"/>
+        </w:rPr>
+        <w:t xml:space="preserve"> (кем и когда)</w:t>
+      </w:r>
+      <w:r>
+        <w:rPr>
+          <w:b w:val="0"/>
+          <w:i w:val="0"/>
+        </w:rPr>
+        <w:t xml:space="preserve">, адрес: </w:t>
+      </w:r>
+      <w:r>
+        <w:rPr>
+          <w:b w:val="0"/>
+          <w:i w:val="0"/>
+        </w:rPr>
+        <w:t>________________</w:t>
+      </w:r>
+      <w:r>
+        <w:rPr>
+          <w:b w:val="0"/>
+          <w:i/>
+          <w:sz w:val="14"/>
+        </w:rPr>
+        <w:t xml:space="preserve"> (адрес)</w:t>
+      </w:r>
+      <w:r>
+        <w:rPr>
+          <w:b w:val="0"/>
+          <w:i w:val="0"/>
+        </w:rPr>
+        <w:t xml:space="preserve">, телефон: </w:t>
+      </w:r>
+      <w:r>
+        <w:rPr>
+          <w:b w:val="0"/>
+          <w:i w:val="0"/>
+        </w:rPr>
+        <w:t>____________</w:t>
+      </w:r>
+      <w:r>
+        <w:rPr>
+          <w:b w:val="0"/>
+          <w:i w:val="0"/>
+        </w:rPr>
+        <w:t>. Поручитель отвечает перед Исполнителем солидарно с Заказчиком за оплату всей суммы рассрочки и расходов на взыскание долга.</w:t>
       </w:r>
     </w:p>
     <w:p>
@@ -4940,121 +4974,7 @@
           <w:b w:val="0"/>
           <w:i w:val="0"/>
         </w:rPr>
-        <w:t xml:space="preserve">8. Поручитель (при наличии): </w:t>
-      </w:r>
-      <w:r>
-        <w:rPr>
-          <w:b w:val="0"/>
-          <w:i w:val="0"/>
-        </w:rPr>
-        <w:t>________________</w:t>
-      </w:r>
-      <w:r>
-        <w:rPr>
-          <w:b w:val="0"/>
-          <w:i/>
-          <w:sz w:val="14"/>
-        </w:rPr>
-        <w:t xml:space="preserve"> (ФИО Поручителя)</w:t>
-      </w:r>
-      <w:r>
-        <w:rPr>
-          <w:b w:val="0"/>
-          <w:i w:val="0"/>
-        </w:rPr>
-        <w:t xml:space="preserve">, паспорт </w:t>
-      </w:r>
-      <w:r>
-        <w:rPr>
-          <w:b w:val="0"/>
-          <w:i w:val="0"/>
-        </w:rPr>
-        <w:t>________________</w:t>
-      </w:r>
-      <w:r>
-        <w:rPr>
-          <w:b w:val="0"/>
-          <w:i/>
-          <w:sz w:val="14"/>
-        </w:rPr>
-        <w:t xml:space="preserve"> (серия и номер)</w:t>
-      </w:r>
-      <w:r>
-        <w:rPr>
-          <w:b w:val="0"/>
-          <w:i w:val="0"/>
-        </w:rPr>
-        <w:t xml:space="preserve">, выдан </w:t>
-      </w:r>
-      <w:r>
-        <w:rPr>
-          <w:b w:val="0"/>
-          <w:i w:val="0"/>
-        </w:rPr>
-        <w:t>________________</w:t>
-      </w:r>
-      <w:r>
-        <w:rPr>
-          <w:b w:val="0"/>
-          <w:i/>
-          <w:sz w:val="14"/>
-        </w:rPr>
-        <w:t xml:space="preserve"> (кем и когда)</w:t>
-      </w:r>
-      <w:r>
-        <w:rPr>
-          <w:b w:val="0"/>
-          <w:i w:val="0"/>
-        </w:rPr>
-        <w:t xml:space="preserve">, адрес: </w:t>
-      </w:r>
-      <w:r>
-        <w:rPr>
-          <w:b w:val="0"/>
-          <w:i w:val="0"/>
-        </w:rPr>
-        <w:t>________________</w:t>
-      </w:r>
-      <w:r>
-        <w:rPr>
-          <w:b w:val="0"/>
-          <w:i/>
-          <w:sz w:val="14"/>
-        </w:rPr>
-        <w:t xml:space="preserve"> (адрес)</w:t>
-      </w:r>
-      <w:r>
-        <w:rPr>
-          <w:b w:val="0"/>
-          <w:i w:val="0"/>
-        </w:rPr>
-        <w:t xml:space="preserve">, телефон: </w:t>
-      </w:r>
-      <w:r>
-        <w:rPr>
-          <w:b w:val="0"/>
-          <w:i w:val="0"/>
-        </w:rPr>
-        <w:t>____________</w:t>
-      </w:r>
-      <w:r>
-        <w:rPr>
-          <w:b w:val="0"/>
-          <w:i w:val="0"/>
-        </w:rPr>
-        <w:t>. Поручитель отвечает перед Исполнителем солидарно с Заказчиком за оплату всей суммы рассрочки, пени и расходов на взыскание долга.</w:t>
-      </w:r>
-    </w:p>
-    <w:p>
-      <w:pPr>
-        <w:jc w:val="both"/>
-      </w:pPr>
-      <w:r>
-        <w:rPr>
-          <w:b w:val="0"/>
-          <w:i w:val="0"/>
-        </w:rPr>
-        <w:t>9. Заказчик подтверждает, что ознакомлен с графиком платежей, согласен с ним и что сумма рассрочки посильна для него. Копия паспорта (ID-карты) Заказчика и Поручителя прилагается.</w:t>
+        <w:t>8. Заказчик подтверждает, что ознакомлен с графиком платежей, согласен с ним и что сумма рассрочки посильна для него. Копия паспорта (ID-карты) Заказчика и Поручителя прилагается.</w:t>
       </w:r>
     </w:p>
     <w:tbl>

</xml_diff>

<commit_message>
Contract 2.7: furniture belongs to the maker until the last payment (ownership passes on full payment, customer bears risk after acceptance)
Co-Authored-By: Claude Opus 5.5 <noreply@anthropic.com>
Claude-Session: https://claude.ai/code/session_01WtuytnVMHWD8pV9nnEoMmS
</commit_message>
<xml_diff>
--- a/static/docs/dogovor-mebel.docx
+++ b/static/docs/dogovor-mebel.docx
@@ -596,6 +596,18 @@
           <w:i w:val="0"/>
         </w:rPr>
         <w:t>2.6. По соглашению Сторон часть стоимости может быть оплачена в рассрочку. В этом случае размер предоплаты, график платежей и условия рассрочки определяются Соглашением о рассрочке (Приложение № 4), которое имеет приоритет над пунктом 2.2 в части порядка оплаты.</w:t>
+      </w:r>
+    </w:p>
+    <w:p>
+      <w:pPr>
+        <w:jc w:val="both"/>
+      </w:pPr>
+      <w:r>
+        <w:rPr>
+          <w:b w:val="0"/>
+          <w:i w:val="0"/>
+        </w:rPr>
+        <w:t>2.7. Изделие (кухня, мебель) принадлежит Исполнителю до момента выплаты Заказчиком последней суммы по договору, в том числе после доставки, установки и подписания акта приёмки. Право собственности на Изделие переходит к Заказчику в день полной оплаты его стоимости. До полной оплаты Заказчик вправе пользоваться Изделием, но не вправе продавать, дарить, сдавать в залог или иным образом распоряжаться им. Риск случайной гибели и повреждения Изделия несёт Заказчик с момента подписания акта приёмки (Приложение № 2).</w:t>
       </w:r>
     </w:p>
     <w:p>
@@ -4782,7 +4794,7 @@
           <w:b w:val="0"/>
           <w:i w:val="0"/>
         </w:rPr>
-        <w:t>4. До полной оплаты стоимости Изделие остаётся собственностью Исполнителя; право собственности переходит к Заказчику в день внесения последнего платежа. Риск случайной гибели и повреждения Изделия несёт Заказчик с момента подписания акта приёмки (Приложение № 2). До полной оплаты Заказчик не вправе продавать, дарить, сдавать в залог или иным образом распоряжаться Изделием.</w:t>
+        <w:t>4. В соответствии с пунктом 2.7 договора Изделие принадлежит Исполнителю до момента выплаты последнего платежа; право собственности переходит к Заказчику в день внесения последнего платежа. Риск случайной гибели и повреждения Изделия несёт Заказчик с момента подписания акта приёмки (Приложение № 2). До полной оплаты Заказчик не вправе продавать, дарить, сдавать в залог или иным образом распоряжаться Изделием.</w:t>
       </w:r>
     </w:p>
     <w:p>

</xml_diff>